<commit_message>
Add Go/Vue application with REST API for the Cassandra tables
Add app/: a Go service with an embedded Vue web UI and a REST API that
creates, reads, updates and deletes rows of every table, discovered from
the keyspace. Lookup tables (user_by_email, project_by_user,
review_by_frame) are kept in sync by the API. Runs in its own Docker image
and is added to the compose files; it can use the compose Cassandra or a
remote one through environment variables.

Fix docker-compose.prod.yml: Cassandra authentication was not actually
enabled (the JVM properties were ignored). Enable it by setting
authenticator and authorizer in cassandra.yaml at startup.

Add doc/MLW_REST_API.docx, generated by doc/generator (shared helpers
moved to lib.js), and document the application in the README.

Co-Authored-By: Claude Sonnet 5.5 <noreply@anthropic.com>
</commit_message>
<xml_diff>
--- a/doc/MLW_Cassandra_Schema.docx
+++ b/doc/MLW_Cassandra_Schema.docx
@@ -102,7 +102,7 @@
             </w:rPr>
             <w:fldChar w:fldCharType="separate"/>
           </w:r>
-          <w:hyperlink w:anchor="__RefHeading___Toc2798_2939652808">
+          <w:hyperlink w:anchor="__RefHeading___Toc2798_1794113731">
             <w:r>
               <w:rPr>
                 <w:rStyle w:val="IndexLink"/>
@@ -122,7 +122,7 @@
             </w:tabs>
             <w:rPr/>
           </w:pPr>
-          <w:hyperlink w:anchor="__RefHeading___Toc2800_2939652808">
+          <w:hyperlink w:anchor="__RefHeading___Toc2800_1794113731">
             <w:r>
               <w:rPr>
                 <w:rStyle w:val="IndexLink"/>
@@ -142,7 +142,7 @@
             </w:tabs>
             <w:rPr/>
           </w:pPr>
-          <w:hyperlink w:anchor="__RefHeading___Toc2802_2939652808">
+          <w:hyperlink w:anchor="__RefHeading___Toc2802_1794113731">
             <w:r>
               <w:rPr>
                 <w:rStyle w:val="IndexLink"/>
@@ -162,7 +162,7 @@
             </w:tabs>
             <w:rPr/>
           </w:pPr>
-          <w:hyperlink w:anchor="__RefHeading___Toc2804_2939652808">
+          <w:hyperlink w:anchor="__RefHeading___Toc2804_1794113731">
             <w:r>
               <w:rPr>
                 <w:rStyle w:val="IndexLink"/>
@@ -182,7 +182,7 @@
             </w:tabs>
             <w:rPr/>
           </w:pPr>
-          <w:hyperlink w:anchor="__RefHeading___Toc2806_2939652808">
+          <w:hyperlink w:anchor="__RefHeading___Toc2806_1794113731">
             <w:r>
               <w:rPr>
                 <w:rStyle w:val="IndexLink"/>
@@ -202,7 +202,7 @@
             </w:tabs>
             <w:rPr/>
           </w:pPr>
-          <w:hyperlink w:anchor="__RefHeading___Toc2808_2939652808">
+          <w:hyperlink w:anchor="__RefHeading___Toc2808_1794113731">
             <w:r>
               <w:rPr>
                 <w:rStyle w:val="IndexLink"/>
@@ -222,7 +222,7 @@
             </w:tabs>
             <w:rPr/>
           </w:pPr>
-          <w:hyperlink w:anchor="__RefHeading___Toc2810_2939652808">
+          <w:hyperlink w:anchor="__RefHeading___Toc2810_1794113731">
             <w:r>
               <w:rPr>
                 <w:rStyle w:val="IndexLink"/>
@@ -242,7 +242,7 @@
             </w:tabs>
             <w:rPr/>
           </w:pPr>
-          <w:hyperlink w:anchor="__RefHeading___Toc2812_2939652808">
+          <w:hyperlink w:anchor="__RefHeading___Toc2812_1794113731">
             <w:r>
               <w:rPr>
                 <w:rStyle w:val="IndexLink"/>
@@ -262,7 +262,7 @@
             </w:tabs>
             <w:rPr/>
           </w:pPr>
-          <w:hyperlink w:anchor="__RefHeading___Toc2814_2939652808">
+          <w:hyperlink w:anchor="__RefHeading___Toc2814_1794113731">
             <w:r>
               <w:rPr>
                 <w:rStyle w:val="IndexLink"/>
@@ -282,7 +282,7 @@
             </w:tabs>
             <w:rPr/>
           </w:pPr>
-          <w:hyperlink w:anchor="__RefHeading___Toc2816_2939652808">
+          <w:hyperlink w:anchor="__RefHeading___Toc2816_1794113731">
             <w:r>
               <w:rPr>
                 <w:rStyle w:val="IndexLink"/>
@@ -302,7 +302,7 @@
             </w:tabs>
             <w:rPr/>
           </w:pPr>
-          <w:hyperlink w:anchor="__RefHeading___Toc2818_2939652808">
+          <w:hyperlink w:anchor="__RefHeading___Toc2818_1794113731">
             <w:r>
               <w:rPr>
                 <w:rStyle w:val="IndexLink"/>
@@ -322,7 +322,7 @@
             </w:tabs>
             <w:rPr/>
           </w:pPr>
-          <w:hyperlink w:anchor="__RefHeading___Toc2820_2939652808">
+          <w:hyperlink w:anchor="__RefHeading___Toc2820_1794113731">
             <w:r>
               <w:rPr>
                 <w:rStyle w:val="IndexLink"/>
@@ -342,7 +342,7 @@
             </w:tabs>
             <w:rPr/>
           </w:pPr>
-          <w:hyperlink w:anchor="__RefHeading___Toc2822_2939652808">
+          <w:hyperlink w:anchor="__RefHeading___Toc2822_1794113731">
             <w:r>
               <w:rPr>
                 <w:rStyle w:val="IndexLink"/>
@@ -362,7 +362,7 @@
             </w:tabs>
             <w:rPr/>
           </w:pPr>
-          <w:hyperlink w:anchor="__RefHeading___Toc2824_2939652808">
+          <w:hyperlink w:anchor="__RefHeading___Toc2824_1794113731">
             <w:r>
               <w:rPr>
                 <w:rStyle w:val="IndexLink"/>
@@ -382,7 +382,7 @@
             </w:tabs>
             <w:rPr/>
           </w:pPr>
-          <w:hyperlink w:anchor="__RefHeading___Toc2826_2939652808">
+          <w:hyperlink w:anchor="__RefHeading___Toc2826_1794113731">
             <w:r>
               <w:rPr>
                 <w:rStyle w:val="IndexLink"/>
@@ -402,7 +402,7 @@
             </w:tabs>
             <w:rPr/>
           </w:pPr>
-          <w:hyperlink w:anchor="__RefHeading___Toc2828_2939652808">
+          <w:hyperlink w:anchor="__RefHeading___Toc2828_1794113731">
             <w:r>
               <w:rPr>
                 <w:rStyle w:val="IndexLink"/>
@@ -422,7 +422,7 @@
             </w:tabs>
             <w:rPr/>
           </w:pPr>
-          <w:hyperlink w:anchor="__RefHeading___Toc2830_2939652808">
+          <w:hyperlink w:anchor="__RefHeading___Toc2830_1794113731">
             <w:r>
               <w:rPr>
                 <w:rStyle w:val="IndexLink"/>
@@ -442,7 +442,7 @@
             </w:tabs>
             <w:rPr/>
           </w:pPr>
-          <w:hyperlink w:anchor="__RefHeading___Toc2832_2939652808">
+          <w:hyperlink w:anchor="__RefHeading___Toc2832_1794113731">
             <w:r>
               <w:rPr>
                 <w:rStyle w:val="IndexLink"/>
@@ -462,7 +462,7 @@
             </w:tabs>
             <w:rPr/>
           </w:pPr>
-          <w:hyperlink w:anchor="__RefHeading___Toc2834_2939652808">
+          <w:hyperlink w:anchor="__RefHeading___Toc2834_1794113731">
             <w:r>
               <w:rPr>
                 <w:rStyle w:val="IndexLink"/>
@@ -482,7 +482,7 @@
             </w:tabs>
             <w:rPr/>
           </w:pPr>
-          <w:hyperlink w:anchor="__RefHeading___Toc2836_2939652808">
+          <w:hyperlink w:anchor="__RefHeading___Toc2836_1794113731">
             <w:r>
               <w:rPr>
                 <w:rStyle w:val="IndexLink"/>
@@ -502,7 +502,7 @@
             </w:tabs>
             <w:rPr/>
           </w:pPr>
-          <w:hyperlink w:anchor="__RefHeading___Toc2838_2939652808">
+          <w:hyperlink w:anchor="__RefHeading___Toc2838_1794113731">
             <w:r>
               <w:rPr>
                 <w:rStyle w:val="IndexLink"/>
@@ -522,7 +522,7 @@
             </w:tabs>
             <w:rPr/>
           </w:pPr>
-          <w:hyperlink w:anchor="__RefHeading___Toc2840_2939652808">
+          <w:hyperlink w:anchor="__RefHeading___Toc2840_1794113731">
             <w:r>
               <w:rPr>
                 <w:rStyle w:val="IndexLink"/>
@@ -542,7 +542,7 @@
             </w:tabs>
             <w:rPr/>
           </w:pPr>
-          <w:hyperlink w:anchor="__RefHeading___Toc2842_2939652808">
+          <w:hyperlink w:anchor="__RefHeading___Toc2842_1794113731">
             <w:r>
               <w:rPr>
                 <w:rStyle w:val="IndexLink"/>
@@ -562,7 +562,7 @@
             </w:tabs>
             <w:rPr/>
           </w:pPr>
-          <w:hyperlink w:anchor="__RefHeading___Toc2844_2939652808">
+          <w:hyperlink w:anchor="__RefHeading___Toc2844_1794113731">
             <w:r>
               <w:rPr>
                 <w:rStyle w:val="IndexLink"/>
@@ -582,7 +582,7 @@
             </w:tabs>
             <w:rPr/>
           </w:pPr>
-          <w:hyperlink w:anchor="__RefHeading___Toc2846_2939652808">
+          <w:hyperlink w:anchor="__RefHeading___Toc2846_1794113731">
             <w:r>
               <w:rPr>
                 <w:rStyle w:val="IndexLink"/>
@@ -602,7 +602,7 @@
             </w:tabs>
             <w:rPr/>
           </w:pPr>
-          <w:hyperlink w:anchor="__RefHeading___Toc2848_2939652808">
+          <w:hyperlink w:anchor="__RefHeading___Toc2848_1794113731">
             <w:r>
               <w:rPr>
                 <w:rStyle w:val="IndexLink"/>
@@ -622,7 +622,7 @@
             </w:tabs>
             <w:rPr/>
           </w:pPr>
-          <w:hyperlink w:anchor="__RefHeading___Toc2850_2939652808">
+          <w:hyperlink w:anchor="__RefHeading___Toc2850_1794113731">
             <w:r>
               <w:rPr>
                 <w:rStyle w:val="IndexLink"/>
@@ -642,7 +642,7 @@
             </w:tabs>
             <w:rPr/>
           </w:pPr>
-          <w:hyperlink w:anchor="__RefHeading___Toc2852_2939652808">
+          <w:hyperlink w:anchor="__RefHeading___Toc2852_1794113731">
             <w:r>
               <w:rPr>
                 <w:rStyle w:val="IndexLink"/>
@@ -662,7 +662,7 @@
             </w:tabs>
             <w:rPr/>
           </w:pPr>
-          <w:hyperlink w:anchor="__RefHeading___Toc2854_2939652808">
+          <w:hyperlink w:anchor="__RefHeading___Toc2854_1794113731">
             <w:r>
               <w:rPr>
                 <w:rStyle w:val="IndexLink"/>
@@ -682,7 +682,7 @@
             </w:tabs>
             <w:rPr/>
           </w:pPr>
-          <w:hyperlink w:anchor="__RefHeading___Toc2856_2939652808">
+          <w:hyperlink w:anchor="__RefHeading___Toc2856_1794113731">
             <w:r>
               <w:rPr>
                 <w:rStyle w:val="IndexLink"/>
@@ -702,7 +702,7 @@
             </w:tabs>
             <w:rPr/>
           </w:pPr>
-          <w:hyperlink w:anchor="__RefHeading___Toc2858_2939652808">
+          <w:hyperlink w:anchor="__RefHeading___Toc2858_1794113731">
             <w:r>
               <w:rPr>
                 <w:rStyle w:val="IndexLink"/>
@@ -722,7 +722,7 @@
             </w:tabs>
             <w:rPr/>
           </w:pPr>
-          <w:hyperlink w:anchor="__RefHeading___Toc2860_2939652808">
+          <w:hyperlink w:anchor="__RefHeading___Toc2860_1794113731">
             <w:r>
               <w:rPr>
                 <w:rStyle w:val="IndexLink"/>
@@ -742,7 +742,7 @@
             </w:tabs>
             <w:rPr/>
           </w:pPr>
-          <w:hyperlink w:anchor="__RefHeading___Toc2862_2939652808">
+          <w:hyperlink w:anchor="__RefHeading___Toc2862_1794113731">
             <w:r>
               <w:rPr>
                 <w:rStyle w:val="IndexLink"/>
@@ -762,7 +762,7 @@
             </w:tabs>
             <w:rPr/>
           </w:pPr>
-          <w:hyperlink w:anchor="__RefHeading___Toc2864_2939652808">
+          <w:hyperlink w:anchor="__RefHeading___Toc2864_1794113731">
             <w:r>
               <w:rPr>
                 <w:rStyle w:val="IndexLink"/>
@@ -782,7 +782,7 @@
             </w:tabs>
             <w:rPr/>
           </w:pPr>
-          <w:hyperlink w:anchor="__RefHeading___Toc2866_2939652808">
+          <w:hyperlink w:anchor="__RefHeading___Toc2866_1794113731">
             <w:r>
               <w:rPr>
                 <w:rStyle w:val="IndexLink"/>
@@ -802,7 +802,7 @@
             </w:tabs>
             <w:rPr/>
           </w:pPr>
-          <w:hyperlink w:anchor="__RefHeading___Toc2868_2939652808">
+          <w:hyperlink w:anchor="__RefHeading___Toc2868_1794113731">
             <w:r>
               <w:rPr>
                 <w:rStyle w:val="IndexLink"/>
@@ -822,7 +822,7 @@
             </w:tabs>
             <w:rPr/>
           </w:pPr>
-          <w:hyperlink w:anchor="__RefHeading___Toc2870_2939652808">
+          <w:hyperlink w:anchor="__RefHeading___Toc2870_1794113731">
             <w:r>
               <w:rPr>
                 <w:rStyle w:val="IndexLink"/>
@@ -842,7 +842,7 @@
             </w:tabs>
             <w:rPr/>
           </w:pPr>
-          <w:hyperlink w:anchor="__RefHeading___Toc2872_2939652808">
+          <w:hyperlink w:anchor="__RefHeading___Toc2872_1794113731">
             <w:r>
               <w:rPr>
                 <w:rStyle w:val="IndexLink"/>
@@ -862,7 +862,7 @@
             </w:tabs>
             <w:rPr/>
           </w:pPr>
-          <w:hyperlink w:anchor="__RefHeading___Toc2874_2939652808">
+          <w:hyperlink w:anchor="__RefHeading___Toc2874_1794113731">
             <w:r>
               <w:rPr>
                 <w:rStyle w:val="IndexLink"/>
@@ -882,7 +882,7 @@
             </w:tabs>
             <w:rPr/>
           </w:pPr>
-          <w:hyperlink w:anchor="__RefHeading___Toc2876_2939652808">
+          <w:hyperlink w:anchor="__RefHeading___Toc2876_1794113731">
             <w:r>
               <w:rPr>
                 <w:rStyle w:val="IndexLink"/>
@@ -902,7 +902,7 @@
             </w:tabs>
             <w:rPr/>
           </w:pPr>
-          <w:hyperlink w:anchor="__RefHeading___Toc2878_2939652808">
+          <w:hyperlink w:anchor="__RefHeading___Toc2878_1794113731">
             <w:r>
               <w:rPr>
                 <w:rStyle w:val="IndexLink"/>
@@ -922,7 +922,7 @@
             </w:tabs>
             <w:rPr/>
           </w:pPr>
-          <w:hyperlink w:anchor="__RefHeading___Toc2880_2939652808">
+          <w:hyperlink w:anchor="__RefHeading___Toc2880_1794113731">
             <w:r>
               <w:rPr>
                 <w:rStyle w:val="IndexLink"/>
@@ -942,7 +942,7 @@
             </w:tabs>
             <w:rPr/>
           </w:pPr>
-          <w:hyperlink w:anchor="__RefHeading___Toc2882_2939652808">
+          <w:hyperlink w:anchor="__RefHeading___Toc2882_1794113731">
             <w:r>
               <w:rPr>
                 <w:rStyle w:val="IndexLink"/>
@@ -962,7 +962,7 @@
             </w:tabs>
             <w:rPr/>
           </w:pPr>
-          <w:hyperlink w:anchor="__RefHeading___Toc2884_2939652808">
+          <w:hyperlink w:anchor="__RefHeading___Toc2884_1794113731">
             <w:r>
               <w:rPr>
                 <w:rStyle w:val="IndexLink"/>
@@ -1012,7 +1012,7 @@
         <w:spacing w:before="0" w:after="160"/>
         <w:rPr/>
       </w:pPr>
-      <w:bookmarkStart w:id="0" w:name="__RefHeading___Toc2798_2939652808"/>
+      <w:bookmarkStart w:id="0" w:name="__RefHeading___Toc2798_1794113731"/>
       <w:bookmarkEnd w:id="0"/>
       <w:r>
         <w:rPr/>
@@ -1024,7 +1024,7 @@
         <w:pStyle w:val="Heading2"/>
         <w:rPr/>
       </w:pPr>
-      <w:bookmarkStart w:id="1" w:name="__RefHeading___Toc2800_2939652808"/>
+      <w:bookmarkStart w:id="1" w:name="__RefHeading___Toc2800_1794113731"/>
       <w:bookmarkEnd w:id="1"/>
       <w:r>
         <w:rPr/>
@@ -1234,7 +1234,7 @@
         <w:pStyle w:val="Heading2"/>
         <w:rPr/>
       </w:pPr>
-      <w:bookmarkStart w:id="2" w:name="__RefHeading___Toc2802_2939652808"/>
+      <w:bookmarkStart w:id="2" w:name="__RefHeading___Toc2802_1794113731"/>
       <w:bookmarkEnd w:id="2"/>
       <w:r>
         <w:rPr/>
@@ -2960,7 +2960,7 @@
         <w:spacing w:before="0" w:after="160"/>
         <w:rPr/>
       </w:pPr>
-      <w:bookmarkStart w:id="3" w:name="__RefHeading___Toc2804_2939652808"/>
+      <w:bookmarkStart w:id="3" w:name="__RefHeading___Toc2804_1794113731"/>
       <w:bookmarkEnd w:id="3"/>
       <w:r>
         <w:rPr/>
@@ -3043,7 +3043,7 @@
         <w:pStyle w:val="Heading2"/>
         <w:rPr/>
       </w:pPr>
-      <w:bookmarkStart w:id="4" w:name="__RefHeading___Toc2806_2939652808"/>
+      <w:bookmarkStart w:id="4" w:name="__RefHeading___Toc2806_1794113731"/>
       <w:bookmarkEnd w:id="4"/>
       <w:r>
         <w:rPr/>
@@ -3116,7 +3116,7 @@
         <w:pStyle w:val="Heading2"/>
         <w:rPr/>
       </w:pPr>
-      <w:bookmarkStart w:id="5" w:name="__RefHeading___Toc2808_2939652808"/>
+      <w:bookmarkStart w:id="5" w:name="__RefHeading___Toc2808_1794113731"/>
       <w:bookmarkEnd w:id="5"/>
       <w:r>
         <w:rPr/>
@@ -3189,7 +3189,7 @@
         <w:pStyle w:val="Heading2"/>
         <w:rPr/>
       </w:pPr>
-      <w:bookmarkStart w:id="6" w:name="__RefHeading___Toc2810_2939652808"/>
+      <w:bookmarkStart w:id="6" w:name="__RefHeading___Toc2810_1794113731"/>
       <w:bookmarkEnd w:id="6"/>
       <w:r>
         <w:rPr/>
@@ -3262,7 +3262,7 @@
         <w:pStyle w:val="Heading2"/>
         <w:rPr/>
       </w:pPr>
-      <w:bookmarkStart w:id="7" w:name="__RefHeading___Toc2812_2939652808"/>
+      <w:bookmarkStart w:id="7" w:name="__RefHeading___Toc2812_1794113731"/>
       <w:bookmarkEnd w:id="7"/>
       <w:r>
         <w:rPr/>
@@ -3335,7 +3335,7 @@
         <w:pStyle w:val="Heading2"/>
         <w:rPr/>
       </w:pPr>
-      <w:bookmarkStart w:id="8" w:name="__RefHeading___Toc2814_2939652808"/>
+      <w:bookmarkStart w:id="8" w:name="__RefHeading___Toc2814_1794113731"/>
       <w:bookmarkEnd w:id="8"/>
       <w:r>
         <w:rPr/>
@@ -3408,7 +3408,7 @@
         <w:pStyle w:val="Heading2"/>
         <w:rPr/>
       </w:pPr>
-      <w:bookmarkStart w:id="9" w:name="__RefHeading___Toc2816_2939652808"/>
+      <w:bookmarkStart w:id="9" w:name="__RefHeading___Toc2816_1794113731"/>
       <w:bookmarkEnd w:id="9"/>
       <w:r>
         <w:rPr/>
@@ -3494,7 +3494,7 @@
         <w:spacing w:before="0" w:after="160"/>
         <w:rPr/>
       </w:pPr>
-      <w:bookmarkStart w:id="10" w:name="__RefHeading___Toc2818_2939652808"/>
+      <w:bookmarkStart w:id="10" w:name="__RefHeading___Toc2818_1794113731"/>
       <w:bookmarkEnd w:id="10"/>
       <w:r>
         <w:rPr/>
@@ -3517,7 +3517,7 @@
         <w:pStyle w:val="Heading2"/>
         <w:rPr/>
       </w:pPr>
-      <w:bookmarkStart w:id="11" w:name="__RefHeading___Toc2820_2939652808"/>
+      <w:bookmarkStart w:id="11" w:name="__RefHeading___Toc2820_1794113731"/>
       <w:bookmarkEnd w:id="11"/>
       <w:r>
         <w:rPr/>
@@ -3541,7 +3541,7 @@
         <w:keepNext w:val="true"/>
         <w:rPr/>
       </w:pPr>
-      <w:bookmarkStart w:id="12" w:name="__RefHeading___Toc2822_2939652808"/>
+      <w:bookmarkStart w:id="12" w:name="__RefHeading___Toc2822_1794113731"/>
       <w:bookmarkEnd w:id="12"/>
       <w:r>
         <w:rPr/>
@@ -4183,7 +4183,7 @@
         <w:keepNext w:val="true"/>
         <w:rPr/>
       </w:pPr>
-      <w:bookmarkStart w:id="13" w:name="__RefHeading___Toc2824_2939652808"/>
+      <w:bookmarkStart w:id="13" w:name="__RefHeading___Toc2824_1794113731"/>
       <w:bookmarkEnd w:id="13"/>
       <w:r>
         <w:rPr/>
@@ -4832,7 +4832,7 @@
         <w:keepNext w:val="true"/>
         <w:rPr/>
       </w:pPr>
-      <w:bookmarkStart w:id="14" w:name="__RefHeading___Toc2826_2939652808"/>
+      <w:bookmarkStart w:id="14" w:name="__RefHeading___Toc2826_1794113731"/>
       <w:bookmarkEnd w:id="14"/>
       <w:r>
         <w:rPr/>
@@ -5597,7 +5597,7 @@
         <w:keepNext w:val="true"/>
         <w:rPr/>
       </w:pPr>
-      <w:bookmarkStart w:id="15" w:name="__RefHeading___Toc2828_2939652808"/>
+      <w:bookmarkStart w:id="15" w:name="__RefHeading___Toc2828_1794113731"/>
       <w:bookmarkEnd w:id="15"/>
       <w:r>
         <w:rPr/>
@@ -6689,7 +6689,7 @@
         <w:keepNext w:val="true"/>
         <w:rPr/>
       </w:pPr>
-      <w:bookmarkStart w:id="16" w:name="__RefHeading___Toc2830_2939652808"/>
+      <w:bookmarkStart w:id="16" w:name="__RefHeading___Toc2830_1794113731"/>
       <w:bookmarkEnd w:id="16"/>
       <w:r>
         <w:rPr/>
@@ -8013,7 +8013,7 @@
         <w:keepNext w:val="true"/>
         <w:rPr/>
       </w:pPr>
-      <w:bookmarkStart w:id="17" w:name="__RefHeading___Toc2832_2939652808"/>
+      <w:bookmarkStart w:id="17" w:name="__RefHeading___Toc2832_1794113731"/>
       <w:bookmarkEnd w:id="17"/>
       <w:r>
         <w:rPr/>
@@ -9439,7 +9439,7 @@
         <w:keepNext w:val="true"/>
         <w:rPr/>
       </w:pPr>
-      <w:bookmarkStart w:id="18" w:name="__RefHeading___Toc2834_2939652808"/>
+      <w:bookmarkStart w:id="18" w:name="__RefHeading___Toc2834_1794113731"/>
       <w:bookmarkEnd w:id="18"/>
       <w:r>
         <w:rPr/>
@@ -10421,7 +10421,7 @@
         <w:pStyle w:val="Heading2"/>
         <w:rPr/>
       </w:pPr>
-      <w:bookmarkStart w:id="19" w:name="__RefHeading___Toc2836_2939652808"/>
+      <w:bookmarkStart w:id="19" w:name="__RefHeading___Toc2836_1794113731"/>
       <w:bookmarkEnd w:id="19"/>
       <w:r>
         <w:rPr/>
@@ -10445,7 +10445,7 @@
         <w:keepNext w:val="true"/>
         <w:rPr/>
       </w:pPr>
-      <w:bookmarkStart w:id="20" w:name="__RefHeading___Toc2838_2939652808"/>
+      <w:bookmarkStart w:id="20" w:name="__RefHeading___Toc2838_1794113731"/>
       <w:bookmarkEnd w:id="20"/>
       <w:r>
         <w:rPr/>
@@ -11298,7 +11298,7 @@
         <w:keepNext w:val="true"/>
         <w:rPr/>
       </w:pPr>
-      <w:bookmarkStart w:id="21" w:name="__RefHeading___Toc2840_2939652808"/>
+      <w:bookmarkStart w:id="21" w:name="__RefHeading___Toc2840_1794113731"/>
       <w:bookmarkEnd w:id="21"/>
       <w:r>
         <w:rPr/>
@@ -12151,7 +12151,7 @@
         <w:keepNext w:val="true"/>
         <w:rPr/>
       </w:pPr>
-      <w:bookmarkStart w:id="22" w:name="__RefHeading___Toc2842_2939652808"/>
+      <w:bookmarkStart w:id="22" w:name="__RefHeading___Toc2842_1794113731"/>
       <w:bookmarkEnd w:id="22"/>
       <w:r>
         <w:rPr/>
@@ -12799,7 +12799,7 @@
         <w:keepNext w:val="true"/>
         <w:rPr/>
       </w:pPr>
-      <w:bookmarkStart w:id="23" w:name="__RefHeading___Toc2844_2939652808"/>
+      <w:bookmarkStart w:id="23" w:name="__RefHeading___Toc2844_1794113731"/>
       <w:bookmarkEnd w:id="23"/>
       <w:r>
         <w:rPr/>
@@ -14007,7 +14007,7 @@
         <w:keepNext w:val="true"/>
         <w:rPr/>
       </w:pPr>
-      <w:bookmarkStart w:id="24" w:name="__RefHeading___Toc2846_2939652808"/>
+      <w:bookmarkStart w:id="24" w:name="__RefHeading___Toc2846_1794113731"/>
       <w:bookmarkEnd w:id="24"/>
       <w:r>
         <w:rPr/>
@@ -14997,7 +14997,7 @@
         <w:keepNext w:val="true"/>
         <w:rPr/>
       </w:pPr>
-      <w:bookmarkStart w:id="25" w:name="__RefHeading___Toc2848_2939652808"/>
+      <w:bookmarkStart w:id="25" w:name="__RefHeading___Toc2848_1794113731"/>
       <w:bookmarkEnd w:id="25"/>
       <w:r>
         <w:rPr/>
@@ -15877,7 +15877,7 @@
         <w:pStyle w:val="Heading2"/>
         <w:rPr/>
       </w:pPr>
-      <w:bookmarkStart w:id="26" w:name="__RefHeading___Toc2850_2939652808"/>
+      <w:bookmarkStart w:id="26" w:name="__RefHeading___Toc2850_1794113731"/>
       <w:bookmarkEnd w:id="26"/>
       <w:r>
         <w:rPr/>
@@ -15901,7 +15901,7 @@
         <w:keepNext w:val="true"/>
         <w:rPr/>
       </w:pPr>
-      <w:bookmarkStart w:id="27" w:name="__RefHeading___Toc2852_2939652808"/>
+      <w:bookmarkStart w:id="27" w:name="__RefHeading___Toc2852_1794113731"/>
       <w:bookmarkEnd w:id="27"/>
       <w:r>
         <w:rPr/>
@@ -17218,7 +17218,7 @@
         <w:keepNext w:val="true"/>
         <w:rPr/>
       </w:pPr>
-      <w:bookmarkStart w:id="28" w:name="__RefHeading___Toc2854_2939652808"/>
+      <w:bookmarkStart w:id="28" w:name="__RefHeading___Toc2854_1794113731"/>
       <w:bookmarkEnd w:id="28"/>
       <w:r>
         <w:rPr/>
@@ -18426,7 +18426,7 @@
         <w:keepNext w:val="true"/>
         <w:rPr/>
       </w:pPr>
-      <w:bookmarkStart w:id="29" w:name="__RefHeading___Toc2856_2939652808"/>
+      <w:bookmarkStart w:id="29" w:name="__RefHeading___Toc2856_1794113731"/>
       <w:bookmarkEnd w:id="29"/>
       <w:r>
         <w:rPr/>
@@ -20179,7 +20179,7 @@
         <w:keepNext w:val="true"/>
         <w:rPr/>
       </w:pPr>
-      <w:bookmarkStart w:id="30" w:name="__RefHeading___Toc2858_2939652808"/>
+      <w:bookmarkStart w:id="30" w:name="__RefHeading___Toc2858_1794113731"/>
       <w:bookmarkEnd w:id="30"/>
       <w:r>
         <w:rPr/>
@@ -21384,7 +21384,7 @@
         <w:pStyle w:val="Heading2"/>
         <w:rPr/>
       </w:pPr>
-      <w:bookmarkStart w:id="31" w:name="__RefHeading___Toc2860_2939652808"/>
+      <w:bookmarkStart w:id="31" w:name="__RefHeading___Toc2860_1794113731"/>
       <w:bookmarkEnd w:id="31"/>
       <w:r>
         <w:rPr/>
@@ -21408,7 +21408,7 @@
         <w:keepNext w:val="true"/>
         <w:rPr/>
       </w:pPr>
-      <w:bookmarkStart w:id="32" w:name="__RefHeading___Toc2862_2939652808"/>
+      <w:bookmarkStart w:id="32" w:name="__RefHeading___Toc2862_1794113731"/>
       <w:bookmarkEnd w:id="32"/>
       <w:r>
         <w:rPr/>
@@ -22370,7 +22370,7 @@
         <w:keepNext w:val="true"/>
         <w:rPr/>
       </w:pPr>
-      <w:bookmarkStart w:id="33" w:name="__RefHeading___Toc2864_2939652808"/>
+      <w:bookmarkStart w:id="33" w:name="__RefHeading___Toc2864_1794113731"/>
       <w:bookmarkEnd w:id="33"/>
       <w:r>
         <w:rPr/>
@@ -22787,7 +22787,7 @@
         <w:keepNext w:val="true"/>
         <w:rPr/>
       </w:pPr>
-      <w:bookmarkStart w:id="34" w:name="__RefHeading___Toc2866_2939652808"/>
+      <w:bookmarkStart w:id="34" w:name="__RefHeading___Toc2866_1794113731"/>
       <w:bookmarkEnd w:id="34"/>
       <w:r>
         <w:rPr/>
@@ -23640,7 +23640,7 @@
         <w:keepNext w:val="true"/>
         <w:rPr/>
       </w:pPr>
-      <w:bookmarkStart w:id="35" w:name="__RefHeading___Toc2868_2939652808"/>
+      <w:bookmarkStart w:id="35" w:name="__RefHeading___Toc2868_1794113731"/>
       <w:bookmarkEnd w:id="35"/>
       <w:r>
         <w:rPr/>
@@ -24282,7 +24282,7 @@
         <w:keepNext w:val="true"/>
         <w:rPr/>
       </w:pPr>
-      <w:bookmarkStart w:id="36" w:name="__RefHeading___Toc2870_2939652808"/>
+      <w:bookmarkStart w:id="36" w:name="__RefHeading___Toc2870_1794113731"/>
       <w:bookmarkEnd w:id="36"/>
       <w:r>
         <w:rPr/>
@@ -24923,7 +24923,7 @@
         <w:pStyle w:val="Heading2"/>
         <w:rPr/>
       </w:pPr>
-      <w:bookmarkStart w:id="37" w:name="__RefHeading___Toc2872_2939652808"/>
+      <w:bookmarkStart w:id="37" w:name="__RefHeading___Toc2872_1794113731"/>
       <w:bookmarkEnd w:id="37"/>
       <w:r>
         <w:rPr/>
@@ -24947,7 +24947,7 @@
         <w:keepNext w:val="true"/>
         <w:rPr/>
       </w:pPr>
-      <w:bookmarkStart w:id="38" w:name="__RefHeading___Toc2874_2939652808"/>
+      <w:bookmarkStart w:id="38" w:name="__RefHeading___Toc2874_1794113731"/>
       <w:bookmarkEnd w:id="38"/>
       <w:r>
         <w:rPr/>
@@ -26243,7 +26243,7 @@
         <w:keepNext w:val="true"/>
         <w:rPr/>
       </w:pPr>
-      <w:bookmarkStart w:id="39" w:name="__RefHeading___Toc2876_2939652808"/>
+      <w:bookmarkStart w:id="39" w:name="__RefHeading___Toc2876_1794113731"/>
       <w:bookmarkEnd w:id="39"/>
       <w:r>
         <w:rPr/>
@@ -26776,7 +26776,7 @@
         <w:keepNext w:val="true"/>
         <w:rPr/>
       </w:pPr>
-      <w:bookmarkStart w:id="40" w:name="__RefHeading___Toc2878_2939652808"/>
+      <w:bookmarkStart w:id="40" w:name="__RefHeading___Toc2878_1794113731"/>
       <w:bookmarkEnd w:id="40"/>
       <w:r>
         <w:rPr/>
@@ -27881,7 +27881,7 @@
         <w:pStyle w:val="Heading2"/>
         <w:rPr/>
       </w:pPr>
-      <w:bookmarkStart w:id="41" w:name="__RefHeading___Toc2880_2939652808"/>
+      <w:bookmarkStart w:id="41" w:name="__RefHeading___Toc2880_1794113731"/>
       <w:bookmarkEnd w:id="41"/>
       <w:r>
         <w:rPr/>
@@ -27905,7 +27905,7 @@
         <w:keepNext w:val="true"/>
         <w:rPr/>
       </w:pPr>
-      <w:bookmarkStart w:id="42" w:name="__RefHeading___Toc2882_2939652808"/>
+      <w:bookmarkStart w:id="42" w:name="__RefHeading___Toc2882_1794113731"/>
       <w:bookmarkEnd w:id="42"/>
       <w:r>
         <w:rPr/>
@@ -28438,7 +28438,7 @@
         <w:keepNext w:val="true"/>
         <w:rPr/>
       </w:pPr>
-      <w:bookmarkStart w:id="43" w:name="__RefHeading___Toc2884_2939652808"/>
+      <w:bookmarkStart w:id="43" w:name="__RefHeading___Toc2884_1794113731"/>
       <w:bookmarkEnd w:id="43"/>
       <w:r>
         <w:rPr/>

</xml_diff>

<commit_message>
Add HTTPS and TLS support, and an OpenAPI specification
App: serve HTTPS from TLS_CERT_FILE/TLS_KEY_FILE with live certificate
reload; connect to Cassandra with TLS, a CA file, a server name and an
optional client certificate.

Compose: docker-compose.tls.yml overlay, scripts/gen-certs.sh for
development certificates, and docker/cassandra/configure.sh which sets
authentication and client TLS in cassandra.yaml (used by prod and tls).

Docs: doc/openapi.yaml (OpenAPI 3.0, generated from cql/*.cql), shared
generator modules, and README, REST API document and .env.example updates.

Co-Authored-By: Claude Sonnet 5.5 <noreply@anthropic.com>
</commit_message>
<xml_diff>
--- a/doc/MLW_Cassandra_Schema.docx
+++ b/doc/MLW_Cassandra_Schema.docx
@@ -102,7 +102,7 @@
             </w:rPr>
             <w:fldChar w:fldCharType="separate"/>
           </w:r>
-          <w:hyperlink w:anchor="__RefHeading___Toc2798_1794113731">
+          <w:hyperlink w:anchor="__RefHeading___Toc2798_1828919045">
             <w:r>
               <w:rPr>
                 <w:rStyle w:val="IndexLink"/>
@@ -122,7 +122,7 @@
             </w:tabs>
             <w:rPr/>
           </w:pPr>
-          <w:hyperlink w:anchor="__RefHeading___Toc2800_1794113731">
+          <w:hyperlink w:anchor="__RefHeading___Toc2800_1828919045">
             <w:r>
               <w:rPr>
                 <w:rStyle w:val="IndexLink"/>
@@ -142,7 +142,7 @@
             </w:tabs>
             <w:rPr/>
           </w:pPr>
-          <w:hyperlink w:anchor="__RefHeading___Toc2802_1794113731">
+          <w:hyperlink w:anchor="__RefHeading___Toc2802_1828919045">
             <w:r>
               <w:rPr>
                 <w:rStyle w:val="IndexLink"/>
@@ -162,7 +162,7 @@
             </w:tabs>
             <w:rPr/>
           </w:pPr>
-          <w:hyperlink w:anchor="__RefHeading___Toc2804_1794113731">
+          <w:hyperlink w:anchor="__RefHeading___Toc2804_1828919045">
             <w:r>
               <w:rPr>
                 <w:rStyle w:val="IndexLink"/>
@@ -182,7 +182,7 @@
             </w:tabs>
             <w:rPr/>
           </w:pPr>
-          <w:hyperlink w:anchor="__RefHeading___Toc2806_1794113731">
+          <w:hyperlink w:anchor="__RefHeading___Toc2806_1828919045">
             <w:r>
               <w:rPr>
                 <w:rStyle w:val="IndexLink"/>
@@ -202,7 +202,7 @@
             </w:tabs>
             <w:rPr/>
           </w:pPr>
-          <w:hyperlink w:anchor="__RefHeading___Toc2808_1794113731">
+          <w:hyperlink w:anchor="__RefHeading___Toc2808_1828919045">
             <w:r>
               <w:rPr>
                 <w:rStyle w:val="IndexLink"/>
@@ -222,7 +222,7 @@
             </w:tabs>
             <w:rPr/>
           </w:pPr>
-          <w:hyperlink w:anchor="__RefHeading___Toc2810_1794113731">
+          <w:hyperlink w:anchor="__RefHeading___Toc2810_1828919045">
             <w:r>
               <w:rPr>
                 <w:rStyle w:val="IndexLink"/>
@@ -242,7 +242,7 @@
             </w:tabs>
             <w:rPr/>
           </w:pPr>
-          <w:hyperlink w:anchor="__RefHeading___Toc2812_1794113731">
+          <w:hyperlink w:anchor="__RefHeading___Toc2812_1828919045">
             <w:r>
               <w:rPr>
                 <w:rStyle w:val="IndexLink"/>
@@ -262,7 +262,7 @@
             </w:tabs>
             <w:rPr/>
           </w:pPr>
-          <w:hyperlink w:anchor="__RefHeading___Toc2814_1794113731">
+          <w:hyperlink w:anchor="__RefHeading___Toc2814_1828919045">
             <w:r>
               <w:rPr>
                 <w:rStyle w:val="IndexLink"/>
@@ -282,7 +282,7 @@
             </w:tabs>
             <w:rPr/>
           </w:pPr>
-          <w:hyperlink w:anchor="__RefHeading___Toc2816_1794113731">
+          <w:hyperlink w:anchor="__RefHeading___Toc2816_1828919045">
             <w:r>
               <w:rPr>
                 <w:rStyle w:val="IndexLink"/>
@@ -302,7 +302,7 @@
             </w:tabs>
             <w:rPr/>
           </w:pPr>
-          <w:hyperlink w:anchor="__RefHeading___Toc2818_1794113731">
+          <w:hyperlink w:anchor="__RefHeading___Toc2818_1828919045">
             <w:r>
               <w:rPr>
                 <w:rStyle w:val="IndexLink"/>
@@ -322,7 +322,7 @@
             </w:tabs>
             <w:rPr/>
           </w:pPr>
-          <w:hyperlink w:anchor="__RefHeading___Toc2820_1794113731">
+          <w:hyperlink w:anchor="__RefHeading___Toc2820_1828919045">
             <w:r>
               <w:rPr>
                 <w:rStyle w:val="IndexLink"/>
@@ -342,7 +342,7 @@
             </w:tabs>
             <w:rPr/>
           </w:pPr>
-          <w:hyperlink w:anchor="__RefHeading___Toc2822_1794113731">
+          <w:hyperlink w:anchor="__RefHeading___Toc2822_1828919045">
             <w:r>
               <w:rPr>
                 <w:rStyle w:val="IndexLink"/>
@@ -362,7 +362,7 @@
             </w:tabs>
             <w:rPr/>
           </w:pPr>
-          <w:hyperlink w:anchor="__RefHeading___Toc2824_1794113731">
+          <w:hyperlink w:anchor="__RefHeading___Toc2824_1828919045">
             <w:r>
               <w:rPr>
                 <w:rStyle w:val="IndexLink"/>
@@ -382,7 +382,7 @@
             </w:tabs>
             <w:rPr/>
           </w:pPr>
-          <w:hyperlink w:anchor="__RefHeading___Toc2826_1794113731">
+          <w:hyperlink w:anchor="__RefHeading___Toc2826_1828919045">
             <w:r>
               <w:rPr>
                 <w:rStyle w:val="IndexLink"/>
@@ -402,7 +402,7 @@
             </w:tabs>
             <w:rPr/>
           </w:pPr>
-          <w:hyperlink w:anchor="__RefHeading___Toc2828_1794113731">
+          <w:hyperlink w:anchor="__RefHeading___Toc2828_1828919045">
             <w:r>
               <w:rPr>
                 <w:rStyle w:val="IndexLink"/>
@@ -422,7 +422,7 @@
             </w:tabs>
             <w:rPr/>
           </w:pPr>
-          <w:hyperlink w:anchor="__RefHeading___Toc2830_1794113731">
+          <w:hyperlink w:anchor="__RefHeading___Toc2830_1828919045">
             <w:r>
               <w:rPr>
                 <w:rStyle w:val="IndexLink"/>
@@ -442,7 +442,7 @@
             </w:tabs>
             <w:rPr/>
           </w:pPr>
-          <w:hyperlink w:anchor="__RefHeading___Toc2832_1794113731">
+          <w:hyperlink w:anchor="__RefHeading___Toc2832_1828919045">
             <w:r>
               <w:rPr>
                 <w:rStyle w:val="IndexLink"/>
@@ -462,7 +462,7 @@
             </w:tabs>
             <w:rPr/>
           </w:pPr>
-          <w:hyperlink w:anchor="__RefHeading___Toc2834_1794113731">
+          <w:hyperlink w:anchor="__RefHeading___Toc2834_1828919045">
             <w:r>
               <w:rPr>
                 <w:rStyle w:val="IndexLink"/>
@@ -482,7 +482,7 @@
             </w:tabs>
             <w:rPr/>
           </w:pPr>
-          <w:hyperlink w:anchor="__RefHeading___Toc2836_1794113731">
+          <w:hyperlink w:anchor="__RefHeading___Toc2836_1828919045">
             <w:r>
               <w:rPr>
                 <w:rStyle w:val="IndexLink"/>
@@ -502,7 +502,7 @@
             </w:tabs>
             <w:rPr/>
           </w:pPr>
-          <w:hyperlink w:anchor="__RefHeading___Toc2838_1794113731">
+          <w:hyperlink w:anchor="__RefHeading___Toc2838_1828919045">
             <w:r>
               <w:rPr>
                 <w:rStyle w:val="IndexLink"/>
@@ -522,7 +522,7 @@
             </w:tabs>
             <w:rPr/>
           </w:pPr>
-          <w:hyperlink w:anchor="__RefHeading___Toc2840_1794113731">
+          <w:hyperlink w:anchor="__RefHeading___Toc2840_1828919045">
             <w:r>
               <w:rPr>
                 <w:rStyle w:val="IndexLink"/>
@@ -542,7 +542,7 @@
             </w:tabs>
             <w:rPr/>
           </w:pPr>
-          <w:hyperlink w:anchor="__RefHeading___Toc2842_1794113731">
+          <w:hyperlink w:anchor="__RefHeading___Toc2842_1828919045">
             <w:r>
               <w:rPr>
                 <w:rStyle w:val="IndexLink"/>
@@ -562,7 +562,7 @@
             </w:tabs>
             <w:rPr/>
           </w:pPr>
-          <w:hyperlink w:anchor="__RefHeading___Toc2844_1794113731">
+          <w:hyperlink w:anchor="__RefHeading___Toc2844_1828919045">
             <w:r>
               <w:rPr>
                 <w:rStyle w:val="IndexLink"/>
@@ -582,7 +582,7 @@
             </w:tabs>
             <w:rPr/>
           </w:pPr>
-          <w:hyperlink w:anchor="__RefHeading___Toc2846_1794113731">
+          <w:hyperlink w:anchor="__RefHeading___Toc2846_1828919045">
             <w:r>
               <w:rPr>
                 <w:rStyle w:val="IndexLink"/>
@@ -602,7 +602,7 @@
             </w:tabs>
             <w:rPr/>
           </w:pPr>
-          <w:hyperlink w:anchor="__RefHeading___Toc2848_1794113731">
+          <w:hyperlink w:anchor="__RefHeading___Toc2848_1828919045">
             <w:r>
               <w:rPr>
                 <w:rStyle w:val="IndexLink"/>
@@ -622,7 +622,7 @@
             </w:tabs>
             <w:rPr/>
           </w:pPr>
-          <w:hyperlink w:anchor="__RefHeading___Toc2850_1794113731">
+          <w:hyperlink w:anchor="__RefHeading___Toc2850_1828919045">
             <w:r>
               <w:rPr>
                 <w:rStyle w:val="IndexLink"/>
@@ -642,7 +642,7 @@
             </w:tabs>
             <w:rPr/>
           </w:pPr>
-          <w:hyperlink w:anchor="__RefHeading___Toc2852_1794113731">
+          <w:hyperlink w:anchor="__RefHeading___Toc2852_1828919045">
             <w:r>
               <w:rPr>
                 <w:rStyle w:val="IndexLink"/>
@@ -662,7 +662,7 @@
             </w:tabs>
             <w:rPr/>
           </w:pPr>
-          <w:hyperlink w:anchor="__RefHeading___Toc2854_1794113731">
+          <w:hyperlink w:anchor="__RefHeading___Toc2854_1828919045">
             <w:r>
               <w:rPr>
                 <w:rStyle w:val="IndexLink"/>
@@ -682,7 +682,7 @@
             </w:tabs>
             <w:rPr/>
           </w:pPr>
-          <w:hyperlink w:anchor="__RefHeading___Toc2856_1794113731">
+          <w:hyperlink w:anchor="__RefHeading___Toc2856_1828919045">
             <w:r>
               <w:rPr>
                 <w:rStyle w:val="IndexLink"/>
@@ -702,7 +702,7 @@
             </w:tabs>
             <w:rPr/>
           </w:pPr>
-          <w:hyperlink w:anchor="__RefHeading___Toc2858_1794113731">
+          <w:hyperlink w:anchor="__RefHeading___Toc2858_1828919045">
             <w:r>
               <w:rPr>
                 <w:rStyle w:val="IndexLink"/>
@@ -722,7 +722,7 @@
             </w:tabs>
             <w:rPr/>
           </w:pPr>
-          <w:hyperlink w:anchor="__RefHeading___Toc2860_1794113731">
+          <w:hyperlink w:anchor="__RefHeading___Toc2860_1828919045">
             <w:r>
               <w:rPr>
                 <w:rStyle w:val="IndexLink"/>
@@ -742,7 +742,7 @@
             </w:tabs>
             <w:rPr/>
           </w:pPr>
-          <w:hyperlink w:anchor="__RefHeading___Toc2862_1794113731">
+          <w:hyperlink w:anchor="__RefHeading___Toc2862_1828919045">
             <w:r>
               <w:rPr>
                 <w:rStyle w:val="IndexLink"/>
@@ -762,7 +762,7 @@
             </w:tabs>
             <w:rPr/>
           </w:pPr>
-          <w:hyperlink w:anchor="__RefHeading___Toc2864_1794113731">
+          <w:hyperlink w:anchor="__RefHeading___Toc2864_1828919045">
             <w:r>
               <w:rPr>
                 <w:rStyle w:val="IndexLink"/>
@@ -782,7 +782,7 @@
             </w:tabs>
             <w:rPr/>
           </w:pPr>
-          <w:hyperlink w:anchor="__RefHeading___Toc2866_1794113731">
+          <w:hyperlink w:anchor="__RefHeading___Toc2866_1828919045">
             <w:r>
               <w:rPr>
                 <w:rStyle w:val="IndexLink"/>
@@ -802,7 +802,7 @@
             </w:tabs>
             <w:rPr/>
           </w:pPr>
-          <w:hyperlink w:anchor="__RefHeading___Toc2868_1794113731">
+          <w:hyperlink w:anchor="__RefHeading___Toc2868_1828919045">
             <w:r>
               <w:rPr>
                 <w:rStyle w:val="IndexLink"/>
@@ -822,7 +822,7 @@
             </w:tabs>
             <w:rPr/>
           </w:pPr>
-          <w:hyperlink w:anchor="__RefHeading___Toc2870_1794113731">
+          <w:hyperlink w:anchor="__RefHeading___Toc2870_1828919045">
             <w:r>
               <w:rPr>
                 <w:rStyle w:val="IndexLink"/>
@@ -842,7 +842,7 @@
             </w:tabs>
             <w:rPr/>
           </w:pPr>
-          <w:hyperlink w:anchor="__RefHeading___Toc2872_1794113731">
+          <w:hyperlink w:anchor="__RefHeading___Toc2872_1828919045">
             <w:r>
               <w:rPr>
                 <w:rStyle w:val="IndexLink"/>
@@ -862,7 +862,7 @@
             </w:tabs>
             <w:rPr/>
           </w:pPr>
-          <w:hyperlink w:anchor="__RefHeading___Toc2874_1794113731">
+          <w:hyperlink w:anchor="__RefHeading___Toc2874_1828919045">
             <w:r>
               <w:rPr>
                 <w:rStyle w:val="IndexLink"/>
@@ -882,7 +882,7 @@
             </w:tabs>
             <w:rPr/>
           </w:pPr>
-          <w:hyperlink w:anchor="__RefHeading___Toc2876_1794113731">
+          <w:hyperlink w:anchor="__RefHeading___Toc2876_1828919045">
             <w:r>
               <w:rPr>
                 <w:rStyle w:val="IndexLink"/>
@@ -902,7 +902,7 @@
             </w:tabs>
             <w:rPr/>
           </w:pPr>
-          <w:hyperlink w:anchor="__RefHeading___Toc2878_1794113731">
+          <w:hyperlink w:anchor="__RefHeading___Toc2878_1828919045">
             <w:r>
               <w:rPr>
                 <w:rStyle w:val="IndexLink"/>
@@ -922,7 +922,7 @@
             </w:tabs>
             <w:rPr/>
           </w:pPr>
-          <w:hyperlink w:anchor="__RefHeading___Toc2880_1794113731">
+          <w:hyperlink w:anchor="__RefHeading___Toc2880_1828919045">
             <w:r>
               <w:rPr>
                 <w:rStyle w:val="IndexLink"/>
@@ -942,7 +942,7 @@
             </w:tabs>
             <w:rPr/>
           </w:pPr>
-          <w:hyperlink w:anchor="__RefHeading___Toc2882_1794113731">
+          <w:hyperlink w:anchor="__RefHeading___Toc2882_1828919045">
             <w:r>
               <w:rPr>
                 <w:rStyle w:val="IndexLink"/>
@@ -962,7 +962,7 @@
             </w:tabs>
             <w:rPr/>
           </w:pPr>
-          <w:hyperlink w:anchor="__RefHeading___Toc2884_1794113731">
+          <w:hyperlink w:anchor="__RefHeading___Toc2884_1828919045">
             <w:r>
               <w:rPr>
                 <w:rStyle w:val="IndexLink"/>
@@ -1012,7 +1012,7 @@
         <w:spacing w:before="0" w:after="160"/>
         <w:rPr/>
       </w:pPr>
-      <w:bookmarkStart w:id="0" w:name="__RefHeading___Toc2798_1794113731"/>
+      <w:bookmarkStart w:id="0" w:name="__RefHeading___Toc2798_1828919045"/>
       <w:bookmarkEnd w:id="0"/>
       <w:r>
         <w:rPr/>
@@ -1024,7 +1024,7 @@
         <w:pStyle w:val="Heading2"/>
         <w:rPr/>
       </w:pPr>
-      <w:bookmarkStart w:id="1" w:name="__RefHeading___Toc2800_1794113731"/>
+      <w:bookmarkStart w:id="1" w:name="__RefHeading___Toc2800_1828919045"/>
       <w:bookmarkEnd w:id="1"/>
       <w:r>
         <w:rPr/>
@@ -1234,7 +1234,7 @@
         <w:pStyle w:val="Heading2"/>
         <w:rPr/>
       </w:pPr>
-      <w:bookmarkStart w:id="2" w:name="__RefHeading___Toc2802_1794113731"/>
+      <w:bookmarkStart w:id="2" w:name="__RefHeading___Toc2802_1828919045"/>
       <w:bookmarkEnd w:id="2"/>
       <w:r>
         <w:rPr/>
@@ -2960,7 +2960,7 @@
         <w:spacing w:before="0" w:after="160"/>
         <w:rPr/>
       </w:pPr>
-      <w:bookmarkStart w:id="3" w:name="__RefHeading___Toc2804_1794113731"/>
+      <w:bookmarkStart w:id="3" w:name="__RefHeading___Toc2804_1828919045"/>
       <w:bookmarkEnd w:id="3"/>
       <w:r>
         <w:rPr/>
@@ -3043,7 +3043,7 @@
         <w:pStyle w:val="Heading2"/>
         <w:rPr/>
       </w:pPr>
-      <w:bookmarkStart w:id="4" w:name="__RefHeading___Toc2806_1794113731"/>
+      <w:bookmarkStart w:id="4" w:name="__RefHeading___Toc2806_1828919045"/>
       <w:bookmarkEnd w:id="4"/>
       <w:r>
         <w:rPr/>
@@ -3116,7 +3116,7 @@
         <w:pStyle w:val="Heading2"/>
         <w:rPr/>
       </w:pPr>
-      <w:bookmarkStart w:id="5" w:name="__RefHeading___Toc2808_1794113731"/>
+      <w:bookmarkStart w:id="5" w:name="__RefHeading___Toc2808_1828919045"/>
       <w:bookmarkEnd w:id="5"/>
       <w:r>
         <w:rPr/>
@@ -3189,7 +3189,7 @@
         <w:pStyle w:val="Heading2"/>
         <w:rPr/>
       </w:pPr>
-      <w:bookmarkStart w:id="6" w:name="__RefHeading___Toc2810_1794113731"/>
+      <w:bookmarkStart w:id="6" w:name="__RefHeading___Toc2810_1828919045"/>
       <w:bookmarkEnd w:id="6"/>
       <w:r>
         <w:rPr/>
@@ -3262,7 +3262,7 @@
         <w:pStyle w:val="Heading2"/>
         <w:rPr/>
       </w:pPr>
-      <w:bookmarkStart w:id="7" w:name="__RefHeading___Toc2812_1794113731"/>
+      <w:bookmarkStart w:id="7" w:name="__RefHeading___Toc2812_1828919045"/>
       <w:bookmarkEnd w:id="7"/>
       <w:r>
         <w:rPr/>
@@ -3335,7 +3335,7 @@
         <w:pStyle w:val="Heading2"/>
         <w:rPr/>
       </w:pPr>
-      <w:bookmarkStart w:id="8" w:name="__RefHeading___Toc2814_1794113731"/>
+      <w:bookmarkStart w:id="8" w:name="__RefHeading___Toc2814_1828919045"/>
       <w:bookmarkEnd w:id="8"/>
       <w:r>
         <w:rPr/>
@@ -3408,7 +3408,7 @@
         <w:pStyle w:val="Heading2"/>
         <w:rPr/>
       </w:pPr>
-      <w:bookmarkStart w:id="9" w:name="__RefHeading___Toc2816_1794113731"/>
+      <w:bookmarkStart w:id="9" w:name="__RefHeading___Toc2816_1828919045"/>
       <w:bookmarkEnd w:id="9"/>
       <w:r>
         <w:rPr/>
@@ -3494,7 +3494,7 @@
         <w:spacing w:before="0" w:after="160"/>
         <w:rPr/>
       </w:pPr>
-      <w:bookmarkStart w:id="10" w:name="__RefHeading___Toc2818_1794113731"/>
+      <w:bookmarkStart w:id="10" w:name="__RefHeading___Toc2818_1828919045"/>
       <w:bookmarkEnd w:id="10"/>
       <w:r>
         <w:rPr/>
@@ -3517,7 +3517,7 @@
         <w:pStyle w:val="Heading2"/>
         <w:rPr/>
       </w:pPr>
-      <w:bookmarkStart w:id="11" w:name="__RefHeading___Toc2820_1794113731"/>
+      <w:bookmarkStart w:id="11" w:name="__RefHeading___Toc2820_1828919045"/>
       <w:bookmarkEnd w:id="11"/>
       <w:r>
         <w:rPr/>
@@ -3541,7 +3541,7 @@
         <w:keepNext w:val="true"/>
         <w:rPr/>
       </w:pPr>
-      <w:bookmarkStart w:id="12" w:name="__RefHeading___Toc2822_1794113731"/>
+      <w:bookmarkStart w:id="12" w:name="__RefHeading___Toc2822_1828919045"/>
       <w:bookmarkEnd w:id="12"/>
       <w:r>
         <w:rPr/>
@@ -4183,7 +4183,7 @@
         <w:keepNext w:val="true"/>
         <w:rPr/>
       </w:pPr>
-      <w:bookmarkStart w:id="13" w:name="__RefHeading___Toc2824_1794113731"/>
+      <w:bookmarkStart w:id="13" w:name="__RefHeading___Toc2824_1828919045"/>
       <w:bookmarkEnd w:id="13"/>
       <w:r>
         <w:rPr/>
@@ -4832,7 +4832,7 @@
         <w:keepNext w:val="true"/>
         <w:rPr/>
       </w:pPr>
-      <w:bookmarkStart w:id="14" w:name="__RefHeading___Toc2826_1794113731"/>
+      <w:bookmarkStart w:id="14" w:name="__RefHeading___Toc2826_1828919045"/>
       <w:bookmarkEnd w:id="14"/>
       <w:r>
         <w:rPr/>
@@ -5597,7 +5597,7 @@
         <w:keepNext w:val="true"/>
         <w:rPr/>
       </w:pPr>
-      <w:bookmarkStart w:id="15" w:name="__RefHeading___Toc2828_1794113731"/>
+      <w:bookmarkStart w:id="15" w:name="__RefHeading___Toc2828_1828919045"/>
       <w:bookmarkEnd w:id="15"/>
       <w:r>
         <w:rPr/>
@@ -6689,7 +6689,7 @@
         <w:keepNext w:val="true"/>
         <w:rPr/>
       </w:pPr>
-      <w:bookmarkStart w:id="16" w:name="__RefHeading___Toc2830_1794113731"/>
+      <w:bookmarkStart w:id="16" w:name="__RefHeading___Toc2830_1828919045"/>
       <w:bookmarkEnd w:id="16"/>
       <w:r>
         <w:rPr/>
@@ -8013,7 +8013,7 @@
         <w:keepNext w:val="true"/>
         <w:rPr/>
       </w:pPr>
-      <w:bookmarkStart w:id="17" w:name="__RefHeading___Toc2832_1794113731"/>
+      <w:bookmarkStart w:id="17" w:name="__RefHeading___Toc2832_1828919045"/>
       <w:bookmarkEnd w:id="17"/>
       <w:r>
         <w:rPr/>
@@ -9439,7 +9439,7 @@
         <w:keepNext w:val="true"/>
         <w:rPr/>
       </w:pPr>
-      <w:bookmarkStart w:id="18" w:name="__RefHeading___Toc2834_1794113731"/>
+      <w:bookmarkStart w:id="18" w:name="__RefHeading___Toc2834_1828919045"/>
       <w:bookmarkEnd w:id="18"/>
       <w:r>
         <w:rPr/>
@@ -10421,7 +10421,7 @@
         <w:pStyle w:val="Heading2"/>
         <w:rPr/>
       </w:pPr>
-      <w:bookmarkStart w:id="19" w:name="__RefHeading___Toc2836_1794113731"/>
+      <w:bookmarkStart w:id="19" w:name="__RefHeading___Toc2836_1828919045"/>
       <w:bookmarkEnd w:id="19"/>
       <w:r>
         <w:rPr/>
@@ -10445,7 +10445,7 @@
         <w:keepNext w:val="true"/>
         <w:rPr/>
       </w:pPr>
-      <w:bookmarkStart w:id="20" w:name="__RefHeading___Toc2838_1794113731"/>
+      <w:bookmarkStart w:id="20" w:name="__RefHeading___Toc2838_1828919045"/>
       <w:bookmarkEnd w:id="20"/>
       <w:r>
         <w:rPr/>
@@ -11298,7 +11298,7 @@
         <w:keepNext w:val="true"/>
         <w:rPr/>
       </w:pPr>
-      <w:bookmarkStart w:id="21" w:name="__RefHeading___Toc2840_1794113731"/>
+      <w:bookmarkStart w:id="21" w:name="__RefHeading___Toc2840_1828919045"/>
       <w:bookmarkEnd w:id="21"/>
       <w:r>
         <w:rPr/>
@@ -12151,7 +12151,7 @@
         <w:keepNext w:val="true"/>
         <w:rPr/>
       </w:pPr>
-      <w:bookmarkStart w:id="22" w:name="__RefHeading___Toc2842_1794113731"/>
+      <w:bookmarkStart w:id="22" w:name="__RefHeading___Toc2842_1828919045"/>
       <w:bookmarkEnd w:id="22"/>
       <w:r>
         <w:rPr/>
@@ -12799,7 +12799,7 @@
         <w:keepNext w:val="true"/>
         <w:rPr/>
       </w:pPr>
-      <w:bookmarkStart w:id="23" w:name="__RefHeading___Toc2844_1794113731"/>
+      <w:bookmarkStart w:id="23" w:name="__RefHeading___Toc2844_1828919045"/>
       <w:bookmarkEnd w:id="23"/>
       <w:r>
         <w:rPr/>
@@ -14007,7 +14007,7 @@
         <w:keepNext w:val="true"/>
         <w:rPr/>
       </w:pPr>
-      <w:bookmarkStart w:id="24" w:name="__RefHeading___Toc2846_1794113731"/>
+      <w:bookmarkStart w:id="24" w:name="__RefHeading___Toc2846_1828919045"/>
       <w:bookmarkEnd w:id="24"/>
       <w:r>
         <w:rPr/>
@@ -14997,7 +14997,7 @@
         <w:keepNext w:val="true"/>
         <w:rPr/>
       </w:pPr>
-      <w:bookmarkStart w:id="25" w:name="__RefHeading___Toc2848_1794113731"/>
+      <w:bookmarkStart w:id="25" w:name="__RefHeading___Toc2848_1828919045"/>
       <w:bookmarkEnd w:id="25"/>
       <w:r>
         <w:rPr/>
@@ -15877,7 +15877,7 @@
         <w:pStyle w:val="Heading2"/>
         <w:rPr/>
       </w:pPr>
-      <w:bookmarkStart w:id="26" w:name="__RefHeading___Toc2850_1794113731"/>
+      <w:bookmarkStart w:id="26" w:name="__RefHeading___Toc2850_1828919045"/>
       <w:bookmarkEnd w:id="26"/>
       <w:r>
         <w:rPr/>
@@ -15901,7 +15901,7 @@
         <w:keepNext w:val="true"/>
         <w:rPr/>
       </w:pPr>
-      <w:bookmarkStart w:id="27" w:name="__RefHeading___Toc2852_1794113731"/>
+      <w:bookmarkStart w:id="27" w:name="__RefHeading___Toc2852_1828919045"/>
       <w:bookmarkEnd w:id="27"/>
       <w:r>
         <w:rPr/>
@@ -17218,7 +17218,7 @@
         <w:keepNext w:val="true"/>
         <w:rPr/>
       </w:pPr>
-      <w:bookmarkStart w:id="28" w:name="__RefHeading___Toc2854_1794113731"/>
+      <w:bookmarkStart w:id="28" w:name="__RefHeading___Toc2854_1828919045"/>
       <w:bookmarkEnd w:id="28"/>
       <w:r>
         <w:rPr/>
@@ -18426,7 +18426,7 @@
         <w:keepNext w:val="true"/>
         <w:rPr/>
       </w:pPr>
-      <w:bookmarkStart w:id="29" w:name="__RefHeading___Toc2856_1794113731"/>
+      <w:bookmarkStart w:id="29" w:name="__RefHeading___Toc2856_1828919045"/>
       <w:bookmarkEnd w:id="29"/>
       <w:r>
         <w:rPr/>
@@ -20179,7 +20179,7 @@
         <w:keepNext w:val="true"/>
         <w:rPr/>
       </w:pPr>
-      <w:bookmarkStart w:id="30" w:name="__RefHeading___Toc2858_1794113731"/>
+      <w:bookmarkStart w:id="30" w:name="__RefHeading___Toc2858_1828919045"/>
       <w:bookmarkEnd w:id="30"/>
       <w:r>
         <w:rPr/>
@@ -21384,7 +21384,7 @@
         <w:pStyle w:val="Heading2"/>
         <w:rPr/>
       </w:pPr>
-      <w:bookmarkStart w:id="31" w:name="__RefHeading___Toc2860_1794113731"/>
+      <w:bookmarkStart w:id="31" w:name="__RefHeading___Toc2860_1828919045"/>
       <w:bookmarkEnd w:id="31"/>
       <w:r>
         <w:rPr/>
@@ -21408,7 +21408,7 @@
         <w:keepNext w:val="true"/>
         <w:rPr/>
       </w:pPr>
-      <w:bookmarkStart w:id="32" w:name="__RefHeading___Toc2862_1794113731"/>
+      <w:bookmarkStart w:id="32" w:name="__RefHeading___Toc2862_1828919045"/>
       <w:bookmarkEnd w:id="32"/>
       <w:r>
         <w:rPr/>
@@ -22370,7 +22370,7 @@
         <w:keepNext w:val="true"/>
         <w:rPr/>
       </w:pPr>
-      <w:bookmarkStart w:id="33" w:name="__RefHeading___Toc2864_1794113731"/>
+      <w:bookmarkStart w:id="33" w:name="__RefHeading___Toc2864_1828919045"/>
       <w:bookmarkEnd w:id="33"/>
       <w:r>
         <w:rPr/>
@@ -22787,7 +22787,7 @@
         <w:keepNext w:val="true"/>
         <w:rPr/>
       </w:pPr>
-      <w:bookmarkStart w:id="34" w:name="__RefHeading___Toc2866_1794113731"/>
+      <w:bookmarkStart w:id="34" w:name="__RefHeading___Toc2866_1828919045"/>
       <w:bookmarkEnd w:id="34"/>
       <w:r>
         <w:rPr/>
@@ -23640,7 +23640,7 @@
         <w:keepNext w:val="true"/>
         <w:rPr/>
       </w:pPr>
-      <w:bookmarkStart w:id="35" w:name="__RefHeading___Toc2868_1794113731"/>
+      <w:bookmarkStart w:id="35" w:name="__RefHeading___Toc2868_1828919045"/>
       <w:bookmarkEnd w:id="35"/>
       <w:r>
         <w:rPr/>
@@ -24282,7 +24282,7 @@
         <w:keepNext w:val="true"/>
         <w:rPr/>
       </w:pPr>
-      <w:bookmarkStart w:id="36" w:name="__RefHeading___Toc2870_1794113731"/>
+      <w:bookmarkStart w:id="36" w:name="__RefHeading___Toc2870_1828919045"/>
       <w:bookmarkEnd w:id="36"/>
       <w:r>
         <w:rPr/>
@@ -24923,7 +24923,7 @@
         <w:pStyle w:val="Heading2"/>
         <w:rPr/>
       </w:pPr>
-      <w:bookmarkStart w:id="37" w:name="__RefHeading___Toc2872_1794113731"/>
+      <w:bookmarkStart w:id="37" w:name="__RefHeading___Toc2872_1828919045"/>
       <w:bookmarkEnd w:id="37"/>
       <w:r>
         <w:rPr/>
@@ -24947,7 +24947,7 @@
         <w:keepNext w:val="true"/>
         <w:rPr/>
       </w:pPr>
-      <w:bookmarkStart w:id="38" w:name="__RefHeading___Toc2874_1794113731"/>
+      <w:bookmarkStart w:id="38" w:name="__RefHeading___Toc2874_1828919045"/>
       <w:bookmarkEnd w:id="38"/>
       <w:r>
         <w:rPr/>
@@ -26243,7 +26243,7 @@
         <w:keepNext w:val="true"/>
         <w:rPr/>
       </w:pPr>
-      <w:bookmarkStart w:id="39" w:name="__RefHeading___Toc2876_1794113731"/>
+      <w:bookmarkStart w:id="39" w:name="__RefHeading___Toc2876_1828919045"/>
       <w:bookmarkEnd w:id="39"/>
       <w:r>
         <w:rPr/>
@@ -26776,7 +26776,7 @@
         <w:keepNext w:val="true"/>
         <w:rPr/>
       </w:pPr>
-      <w:bookmarkStart w:id="40" w:name="__RefHeading___Toc2878_1794113731"/>
+      <w:bookmarkStart w:id="40" w:name="__RefHeading___Toc2878_1828919045"/>
       <w:bookmarkEnd w:id="40"/>
       <w:r>
         <w:rPr/>
@@ -27881,7 +27881,7 @@
         <w:pStyle w:val="Heading2"/>
         <w:rPr/>
       </w:pPr>
-      <w:bookmarkStart w:id="41" w:name="__RefHeading___Toc2880_1794113731"/>
+      <w:bookmarkStart w:id="41" w:name="__RefHeading___Toc2880_1828919045"/>
       <w:bookmarkEnd w:id="41"/>
       <w:r>
         <w:rPr/>
@@ -27905,7 +27905,7 @@
         <w:keepNext w:val="true"/>
         <w:rPr/>
       </w:pPr>
-      <w:bookmarkStart w:id="42" w:name="__RefHeading___Toc2882_1794113731"/>
+      <w:bookmarkStart w:id="42" w:name="__RefHeading___Toc2882_1828919045"/>
       <w:bookmarkEnd w:id="42"/>
       <w:r>
         <w:rPr/>
@@ -28438,7 +28438,7 @@
         <w:keepNext w:val="true"/>
         <w:rPr/>
       </w:pPr>
-      <w:bookmarkStart w:id="43" w:name="__RefHeading___Toc2884_1794113731"/>
+      <w:bookmarkStart w:id="43" w:name="__RefHeading___Toc2884_1828919045"/>
       <w:bookmarkEnd w:id="43"/>
       <w:r>
         <w:rPr/>

</xml_diff>

<commit_message>
Add a Swagger UI page to the web UI
Serve the OpenAPI specification at /api/v1/openapi.yaml (embedded in the
binary, with its server set to /api/v1) and add an API documentation page
that shows it with Swagger UI. The page is loaded on demand and Try it out
sends requests to this server with the API token entered in the UI.

The specification now describes its own endpoint. Update the README and
the REST API document.

Co-Authored-By: Claude Sonnet 5.5 <noreply@anthropic.com>
</commit_message>
<xml_diff>
--- a/doc/MLW_Cassandra_Schema.docx
+++ b/doc/MLW_Cassandra_Schema.docx
@@ -39,7 +39,7 @@
         <w:rPr>
           <w:color w:val="666666"/>
         </w:rPr>
-        <w:t>Keyspace mlw  ·  27 tables  ·  Generated 2026-10-05</w:t>
+        <w:t>Keyspace mlw  ·  27 tables  ·  Generated 2026-10-06</w:t>
       </w:r>
     </w:p>
     <w:p>
@@ -102,7 +102,7 @@
             </w:rPr>
             <w:fldChar w:fldCharType="separate"/>
           </w:r>
-          <w:hyperlink w:anchor="__RefHeading___Toc2798_1828919045">
+          <w:hyperlink w:anchor="__RefHeading___Toc2798_1002645125">
             <w:r>
               <w:rPr>
                 <w:rStyle w:val="IndexLink"/>
@@ -122,7 +122,7 @@
             </w:tabs>
             <w:rPr/>
           </w:pPr>
-          <w:hyperlink w:anchor="__RefHeading___Toc2800_1828919045">
+          <w:hyperlink w:anchor="__RefHeading___Toc2800_1002645125">
             <w:r>
               <w:rPr>
                 <w:rStyle w:val="IndexLink"/>
@@ -142,7 +142,7 @@
             </w:tabs>
             <w:rPr/>
           </w:pPr>
-          <w:hyperlink w:anchor="__RefHeading___Toc2802_1828919045">
+          <w:hyperlink w:anchor="__RefHeading___Toc2802_1002645125">
             <w:r>
               <w:rPr>
                 <w:rStyle w:val="IndexLink"/>
@@ -162,7 +162,7 @@
             </w:tabs>
             <w:rPr/>
           </w:pPr>
-          <w:hyperlink w:anchor="__RefHeading___Toc2804_1828919045">
+          <w:hyperlink w:anchor="__RefHeading___Toc2804_1002645125">
             <w:r>
               <w:rPr>
                 <w:rStyle w:val="IndexLink"/>
@@ -182,7 +182,7 @@
             </w:tabs>
             <w:rPr/>
           </w:pPr>
-          <w:hyperlink w:anchor="__RefHeading___Toc2806_1828919045">
+          <w:hyperlink w:anchor="__RefHeading___Toc2806_1002645125">
             <w:r>
               <w:rPr>
                 <w:rStyle w:val="IndexLink"/>
@@ -202,7 +202,7 @@
             </w:tabs>
             <w:rPr/>
           </w:pPr>
-          <w:hyperlink w:anchor="__RefHeading___Toc2808_1828919045">
+          <w:hyperlink w:anchor="__RefHeading___Toc2808_1002645125">
             <w:r>
               <w:rPr>
                 <w:rStyle w:val="IndexLink"/>
@@ -222,7 +222,7 @@
             </w:tabs>
             <w:rPr/>
           </w:pPr>
-          <w:hyperlink w:anchor="__RefHeading___Toc2810_1828919045">
+          <w:hyperlink w:anchor="__RefHeading___Toc2810_1002645125">
             <w:r>
               <w:rPr>
                 <w:rStyle w:val="IndexLink"/>
@@ -242,7 +242,7 @@
             </w:tabs>
             <w:rPr/>
           </w:pPr>
-          <w:hyperlink w:anchor="__RefHeading___Toc2812_1828919045">
+          <w:hyperlink w:anchor="__RefHeading___Toc2812_1002645125">
             <w:r>
               <w:rPr>
                 <w:rStyle w:val="IndexLink"/>
@@ -262,7 +262,7 @@
             </w:tabs>
             <w:rPr/>
           </w:pPr>
-          <w:hyperlink w:anchor="__RefHeading___Toc2814_1828919045">
+          <w:hyperlink w:anchor="__RefHeading___Toc2814_1002645125">
             <w:r>
               <w:rPr>
                 <w:rStyle w:val="IndexLink"/>
@@ -282,7 +282,7 @@
             </w:tabs>
             <w:rPr/>
           </w:pPr>
-          <w:hyperlink w:anchor="__RefHeading___Toc2816_1828919045">
+          <w:hyperlink w:anchor="__RefHeading___Toc2816_1002645125">
             <w:r>
               <w:rPr>
                 <w:rStyle w:val="IndexLink"/>
@@ -302,7 +302,7 @@
             </w:tabs>
             <w:rPr/>
           </w:pPr>
-          <w:hyperlink w:anchor="__RefHeading___Toc2818_1828919045">
+          <w:hyperlink w:anchor="__RefHeading___Toc2818_1002645125">
             <w:r>
               <w:rPr>
                 <w:rStyle w:val="IndexLink"/>
@@ -322,7 +322,7 @@
             </w:tabs>
             <w:rPr/>
           </w:pPr>
-          <w:hyperlink w:anchor="__RefHeading___Toc2820_1828919045">
+          <w:hyperlink w:anchor="__RefHeading___Toc2820_1002645125">
             <w:r>
               <w:rPr>
                 <w:rStyle w:val="IndexLink"/>
@@ -342,7 +342,7 @@
             </w:tabs>
             <w:rPr/>
           </w:pPr>
-          <w:hyperlink w:anchor="__RefHeading___Toc2822_1828919045">
+          <w:hyperlink w:anchor="__RefHeading___Toc2822_1002645125">
             <w:r>
               <w:rPr>
                 <w:rStyle w:val="IndexLink"/>
@@ -362,7 +362,7 @@
             </w:tabs>
             <w:rPr/>
           </w:pPr>
-          <w:hyperlink w:anchor="__RefHeading___Toc2824_1828919045">
+          <w:hyperlink w:anchor="__RefHeading___Toc2824_1002645125">
             <w:r>
               <w:rPr>
                 <w:rStyle w:val="IndexLink"/>
@@ -382,7 +382,7 @@
             </w:tabs>
             <w:rPr/>
           </w:pPr>
-          <w:hyperlink w:anchor="__RefHeading___Toc2826_1828919045">
+          <w:hyperlink w:anchor="__RefHeading___Toc2826_1002645125">
             <w:r>
               <w:rPr>
                 <w:rStyle w:val="IndexLink"/>
@@ -402,7 +402,7 @@
             </w:tabs>
             <w:rPr/>
           </w:pPr>
-          <w:hyperlink w:anchor="__RefHeading___Toc2828_1828919045">
+          <w:hyperlink w:anchor="__RefHeading___Toc2828_1002645125">
             <w:r>
               <w:rPr>
                 <w:rStyle w:val="IndexLink"/>
@@ -422,7 +422,7 @@
             </w:tabs>
             <w:rPr/>
           </w:pPr>
-          <w:hyperlink w:anchor="__RefHeading___Toc2830_1828919045">
+          <w:hyperlink w:anchor="__RefHeading___Toc2830_1002645125">
             <w:r>
               <w:rPr>
                 <w:rStyle w:val="IndexLink"/>
@@ -442,7 +442,7 @@
             </w:tabs>
             <w:rPr/>
           </w:pPr>
-          <w:hyperlink w:anchor="__RefHeading___Toc2832_1828919045">
+          <w:hyperlink w:anchor="__RefHeading___Toc2832_1002645125">
             <w:r>
               <w:rPr>
                 <w:rStyle w:val="IndexLink"/>
@@ -462,7 +462,7 @@
             </w:tabs>
             <w:rPr/>
           </w:pPr>
-          <w:hyperlink w:anchor="__RefHeading___Toc2834_1828919045">
+          <w:hyperlink w:anchor="__RefHeading___Toc2834_1002645125">
             <w:r>
               <w:rPr>
                 <w:rStyle w:val="IndexLink"/>
@@ -482,7 +482,7 @@
             </w:tabs>
             <w:rPr/>
           </w:pPr>
-          <w:hyperlink w:anchor="__RefHeading___Toc2836_1828919045">
+          <w:hyperlink w:anchor="__RefHeading___Toc2836_1002645125">
             <w:r>
               <w:rPr>
                 <w:rStyle w:val="IndexLink"/>
@@ -502,7 +502,7 @@
             </w:tabs>
             <w:rPr/>
           </w:pPr>
-          <w:hyperlink w:anchor="__RefHeading___Toc2838_1828919045">
+          <w:hyperlink w:anchor="__RefHeading___Toc2838_1002645125">
             <w:r>
               <w:rPr>
                 <w:rStyle w:val="IndexLink"/>
@@ -522,7 +522,7 @@
             </w:tabs>
             <w:rPr/>
           </w:pPr>
-          <w:hyperlink w:anchor="__RefHeading___Toc2840_1828919045">
+          <w:hyperlink w:anchor="__RefHeading___Toc2840_1002645125">
             <w:r>
               <w:rPr>
                 <w:rStyle w:val="IndexLink"/>
@@ -542,7 +542,7 @@
             </w:tabs>
             <w:rPr/>
           </w:pPr>
-          <w:hyperlink w:anchor="__RefHeading___Toc2842_1828919045">
+          <w:hyperlink w:anchor="__RefHeading___Toc2842_1002645125">
             <w:r>
               <w:rPr>
                 <w:rStyle w:val="IndexLink"/>
@@ -562,7 +562,7 @@
             </w:tabs>
             <w:rPr/>
           </w:pPr>
-          <w:hyperlink w:anchor="__RefHeading___Toc2844_1828919045">
+          <w:hyperlink w:anchor="__RefHeading___Toc2844_1002645125">
             <w:r>
               <w:rPr>
                 <w:rStyle w:val="IndexLink"/>
@@ -582,7 +582,7 @@
             </w:tabs>
             <w:rPr/>
           </w:pPr>
-          <w:hyperlink w:anchor="__RefHeading___Toc2846_1828919045">
+          <w:hyperlink w:anchor="__RefHeading___Toc2846_1002645125">
             <w:r>
               <w:rPr>
                 <w:rStyle w:val="IndexLink"/>
@@ -602,7 +602,7 @@
             </w:tabs>
             <w:rPr/>
           </w:pPr>
-          <w:hyperlink w:anchor="__RefHeading___Toc2848_1828919045">
+          <w:hyperlink w:anchor="__RefHeading___Toc2848_1002645125">
             <w:r>
               <w:rPr>
                 <w:rStyle w:val="IndexLink"/>
@@ -622,7 +622,7 @@
             </w:tabs>
             <w:rPr/>
           </w:pPr>
-          <w:hyperlink w:anchor="__RefHeading___Toc2850_1828919045">
+          <w:hyperlink w:anchor="__RefHeading___Toc2850_1002645125">
             <w:r>
               <w:rPr>
                 <w:rStyle w:val="IndexLink"/>
@@ -642,7 +642,7 @@
             </w:tabs>
             <w:rPr/>
           </w:pPr>
-          <w:hyperlink w:anchor="__RefHeading___Toc2852_1828919045">
+          <w:hyperlink w:anchor="__RefHeading___Toc2852_1002645125">
             <w:r>
               <w:rPr>
                 <w:rStyle w:val="IndexLink"/>
@@ -662,7 +662,7 @@
             </w:tabs>
             <w:rPr/>
           </w:pPr>
-          <w:hyperlink w:anchor="__RefHeading___Toc2854_1828919045">
+          <w:hyperlink w:anchor="__RefHeading___Toc2854_1002645125">
             <w:r>
               <w:rPr>
                 <w:rStyle w:val="IndexLink"/>
@@ -682,7 +682,7 @@
             </w:tabs>
             <w:rPr/>
           </w:pPr>
-          <w:hyperlink w:anchor="__RefHeading___Toc2856_1828919045">
+          <w:hyperlink w:anchor="__RefHeading___Toc2856_1002645125">
             <w:r>
               <w:rPr>
                 <w:rStyle w:val="IndexLink"/>
@@ -702,7 +702,7 @@
             </w:tabs>
             <w:rPr/>
           </w:pPr>
-          <w:hyperlink w:anchor="__RefHeading___Toc2858_1828919045">
+          <w:hyperlink w:anchor="__RefHeading___Toc2858_1002645125">
             <w:r>
               <w:rPr>
                 <w:rStyle w:val="IndexLink"/>
@@ -722,7 +722,7 @@
             </w:tabs>
             <w:rPr/>
           </w:pPr>
-          <w:hyperlink w:anchor="__RefHeading___Toc2860_1828919045">
+          <w:hyperlink w:anchor="__RefHeading___Toc2860_1002645125">
             <w:r>
               <w:rPr>
                 <w:rStyle w:val="IndexLink"/>
@@ -742,7 +742,7 @@
             </w:tabs>
             <w:rPr/>
           </w:pPr>
-          <w:hyperlink w:anchor="__RefHeading___Toc2862_1828919045">
+          <w:hyperlink w:anchor="__RefHeading___Toc2862_1002645125">
             <w:r>
               <w:rPr>
                 <w:rStyle w:val="IndexLink"/>
@@ -762,7 +762,7 @@
             </w:tabs>
             <w:rPr/>
           </w:pPr>
-          <w:hyperlink w:anchor="__RefHeading___Toc2864_1828919045">
+          <w:hyperlink w:anchor="__RefHeading___Toc2864_1002645125">
             <w:r>
               <w:rPr>
                 <w:rStyle w:val="IndexLink"/>
@@ -782,7 +782,7 @@
             </w:tabs>
             <w:rPr/>
           </w:pPr>
-          <w:hyperlink w:anchor="__RefHeading___Toc2866_1828919045">
+          <w:hyperlink w:anchor="__RefHeading___Toc2866_1002645125">
             <w:r>
               <w:rPr>
                 <w:rStyle w:val="IndexLink"/>
@@ -802,7 +802,7 @@
             </w:tabs>
             <w:rPr/>
           </w:pPr>
-          <w:hyperlink w:anchor="__RefHeading___Toc2868_1828919045">
+          <w:hyperlink w:anchor="__RefHeading___Toc2868_1002645125">
             <w:r>
               <w:rPr>
                 <w:rStyle w:val="IndexLink"/>
@@ -822,7 +822,7 @@
             </w:tabs>
             <w:rPr/>
           </w:pPr>
-          <w:hyperlink w:anchor="__RefHeading___Toc2870_1828919045">
+          <w:hyperlink w:anchor="__RefHeading___Toc2870_1002645125">
             <w:r>
               <w:rPr>
                 <w:rStyle w:val="IndexLink"/>
@@ -842,7 +842,7 @@
             </w:tabs>
             <w:rPr/>
           </w:pPr>
-          <w:hyperlink w:anchor="__RefHeading___Toc2872_1828919045">
+          <w:hyperlink w:anchor="__RefHeading___Toc2872_1002645125">
             <w:r>
               <w:rPr>
                 <w:rStyle w:val="IndexLink"/>
@@ -862,7 +862,7 @@
             </w:tabs>
             <w:rPr/>
           </w:pPr>
-          <w:hyperlink w:anchor="__RefHeading___Toc2874_1828919045">
+          <w:hyperlink w:anchor="__RefHeading___Toc2874_1002645125">
             <w:r>
               <w:rPr>
                 <w:rStyle w:val="IndexLink"/>
@@ -882,7 +882,7 @@
             </w:tabs>
             <w:rPr/>
           </w:pPr>
-          <w:hyperlink w:anchor="__RefHeading___Toc2876_1828919045">
+          <w:hyperlink w:anchor="__RefHeading___Toc2876_1002645125">
             <w:r>
               <w:rPr>
                 <w:rStyle w:val="IndexLink"/>
@@ -902,7 +902,7 @@
             </w:tabs>
             <w:rPr/>
           </w:pPr>
-          <w:hyperlink w:anchor="__RefHeading___Toc2878_1828919045">
+          <w:hyperlink w:anchor="__RefHeading___Toc2878_1002645125">
             <w:r>
               <w:rPr>
                 <w:rStyle w:val="IndexLink"/>
@@ -922,7 +922,7 @@
             </w:tabs>
             <w:rPr/>
           </w:pPr>
-          <w:hyperlink w:anchor="__RefHeading___Toc2880_1828919045">
+          <w:hyperlink w:anchor="__RefHeading___Toc2880_1002645125">
             <w:r>
               <w:rPr>
                 <w:rStyle w:val="IndexLink"/>
@@ -942,7 +942,7 @@
             </w:tabs>
             <w:rPr/>
           </w:pPr>
-          <w:hyperlink w:anchor="__RefHeading___Toc2882_1828919045">
+          <w:hyperlink w:anchor="__RefHeading___Toc2882_1002645125">
             <w:r>
               <w:rPr>
                 <w:rStyle w:val="IndexLink"/>
@@ -962,7 +962,7 @@
             </w:tabs>
             <w:rPr/>
           </w:pPr>
-          <w:hyperlink w:anchor="__RefHeading___Toc2884_1828919045">
+          <w:hyperlink w:anchor="__RefHeading___Toc2884_1002645125">
             <w:r>
               <w:rPr>
                 <w:rStyle w:val="IndexLink"/>
@@ -1012,7 +1012,7 @@
         <w:spacing w:before="0" w:after="160"/>
         <w:rPr/>
       </w:pPr>
-      <w:bookmarkStart w:id="0" w:name="__RefHeading___Toc2798_1828919045"/>
+      <w:bookmarkStart w:id="0" w:name="__RefHeading___Toc2798_1002645125"/>
       <w:bookmarkEnd w:id="0"/>
       <w:r>
         <w:rPr/>
@@ -1024,7 +1024,7 @@
         <w:pStyle w:val="Heading2"/>
         <w:rPr/>
       </w:pPr>
-      <w:bookmarkStart w:id="1" w:name="__RefHeading___Toc2800_1828919045"/>
+      <w:bookmarkStart w:id="1" w:name="__RefHeading___Toc2800_1002645125"/>
       <w:bookmarkEnd w:id="1"/>
       <w:r>
         <w:rPr/>
@@ -1234,7 +1234,7 @@
         <w:pStyle w:val="Heading2"/>
         <w:rPr/>
       </w:pPr>
-      <w:bookmarkStart w:id="2" w:name="__RefHeading___Toc2802_1828919045"/>
+      <w:bookmarkStart w:id="2" w:name="__RefHeading___Toc2802_1002645125"/>
       <w:bookmarkEnd w:id="2"/>
       <w:r>
         <w:rPr/>
@@ -2960,7 +2960,7 @@
         <w:spacing w:before="0" w:after="160"/>
         <w:rPr/>
       </w:pPr>
-      <w:bookmarkStart w:id="3" w:name="__RefHeading___Toc2804_1828919045"/>
+      <w:bookmarkStart w:id="3" w:name="__RefHeading___Toc2804_1002645125"/>
       <w:bookmarkEnd w:id="3"/>
       <w:r>
         <w:rPr/>
@@ -3043,7 +3043,7 @@
         <w:pStyle w:val="Heading2"/>
         <w:rPr/>
       </w:pPr>
-      <w:bookmarkStart w:id="4" w:name="__RefHeading___Toc2806_1828919045"/>
+      <w:bookmarkStart w:id="4" w:name="__RefHeading___Toc2806_1002645125"/>
       <w:bookmarkEnd w:id="4"/>
       <w:r>
         <w:rPr/>
@@ -3116,7 +3116,7 @@
         <w:pStyle w:val="Heading2"/>
         <w:rPr/>
       </w:pPr>
-      <w:bookmarkStart w:id="5" w:name="__RefHeading___Toc2808_1828919045"/>
+      <w:bookmarkStart w:id="5" w:name="__RefHeading___Toc2808_1002645125"/>
       <w:bookmarkEnd w:id="5"/>
       <w:r>
         <w:rPr/>
@@ -3189,7 +3189,7 @@
         <w:pStyle w:val="Heading2"/>
         <w:rPr/>
       </w:pPr>
-      <w:bookmarkStart w:id="6" w:name="__RefHeading___Toc2810_1828919045"/>
+      <w:bookmarkStart w:id="6" w:name="__RefHeading___Toc2810_1002645125"/>
       <w:bookmarkEnd w:id="6"/>
       <w:r>
         <w:rPr/>
@@ -3262,7 +3262,7 @@
         <w:pStyle w:val="Heading2"/>
         <w:rPr/>
       </w:pPr>
-      <w:bookmarkStart w:id="7" w:name="__RefHeading___Toc2812_1828919045"/>
+      <w:bookmarkStart w:id="7" w:name="__RefHeading___Toc2812_1002645125"/>
       <w:bookmarkEnd w:id="7"/>
       <w:r>
         <w:rPr/>
@@ -3335,7 +3335,7 @@
         <w:pStyle w:val="Heading2"/>
         <w:rPr/>
       </w:pPr>
-      <w:bookmarkStart w:id="8" w:name="__RefHeading___Toc2814_1828919045"/>
+      <w:bookmarkStart w:id="8" w:name="__RefHeading___Toc2814_1002645125"/>
       <w:bookmarkEnd w:id="8"/>
       <w:r>
         <w:rPr/>
@@ -3408,7 +3408,7 @@
         <w:pStyle w:val="Heading2"/>
         <w:rPr/>
       </w:pPr>
-      <w:bookmarkStart w:id="9" w:name="__RefHeading___Toc2816_1828919045"/>
+      <w:bookmarkStart w:id="9" w:name="__RefHeading___Toc2816_1002645125"/>
       <w:bookmarkEnd w:id="9"/>
       <w:r>
         <w:rPr/>
@@ -3494,7 +3494,7 @@
         <w:spacing w:before="0" w:after="160"/>
         <w:rPr/>
       </w:pPr>
-      <w:bookmarkStart w:id="10" w:name="__RefHeading___Toc2818_1828919045"/>
+      <w:bookmarkStart w:id="10" w:name="__RefHeading___Toc2818_1002645125"/>
       <w:bookmarkEnd w:id="10"/>
       <w:r>
         <w:rPr/>
@@ -3517,7 +3517,7 @@
         <w:pStyle w:val="Heading2"/>
         <w:rPr/>
       </w:pPr>
-      <w:bookmarkStart w:id="11" w:name="__RefHeading___Toc2820_1828919045"/>
+      <w:bookmarkStart w:id="11" w:name="__RefHeading___Toc2820_1002645125"/>
       <w:bookmarkEnd w:id="11"/>
       <w:r>
         <w:rPr/>
@@ -3541,7 +3541,7 @@
         <w:keepNext w:val="true"/>
         <w:rPr/>
       </w:pPr>
-      <w:bookmarkStart w:id="12" w:name="__RefHeading___Toc2822_1828919045"/>
+      <w:bookmarkStart w:id="12" w:name="__RefHeading___Toc2822_1002645125"/>
       <w:bookmarkEnd w:id="12"/>
       <w:r>
         <w:rPr/>
@@ -4183,7 +4183,7 @@
         <w:keepNext w:val="true"/>
         <w:rPr/>
       </w:pPr>
-      <w:bookmarkStart w:id="13" w:name="__RefHeading___Toc2824_1828919045"/>
+      <w:bookmarkStart w:id="13" w:name="__RefHeading___Toc2824_1002645125"/>
       <w:bookmarkEnd w:id="13"/>
       <w:r>
         <w:rPr/>
@@ -4832,7 +4832,7 @@
         <w:keepNext w:val="true"/>
         <w:rPr/>
       </w:pPr>
-      <w:bookmarkStart w:id="14" w:name="__RefHeading___Toc2826_1828919045"/>
+      <w:bookmarkStart w:id="14" w:name="__RefHeading___Toc2826_1002645125"/>
       <w:bookmarkEnd w:id="14"/>
       <w:r>
         <w:rPr/>
@@ -5597,7 +5597,7 @@
         <w:keepNext w:val="true"/>
         <w:rPr/>
       </w:pPr>
-      <w:bookmarkStart w:id="15" w:name="__RefHeading___Toc2828_1828919045"/>
+      <w:bookmarkStart w:id="15" w:name="__RefHeading___Toc2828_1002645125"/>
       <w:bookmarkEnd w:id="15"/>
       <w:r>
         <w:rPr/>
@@ -6689,7 +6689,7 @@
         <w:keepNext w:val="true"/>
         <w:rPr/>
       </w:pPr>
-      <w:bookmarkStart w:id="16" w:name="__RefHeading___Toc2830_1828919045"/>
+      <w:bookmarkStart w:id="16" w:name="__RefHeading___Toc2830_1002645125"/>
       <w:bookmarkEnd w:id="16"/>
       <w:r>
         <w:rPr/>
@@ -8013,7 +8013,7 @@
         <w:keepNext w:val="true"/>
         <w:rPr/>
       </w:pPr>
-      <w:bookmarkStart w:id="17" w:name="__RefHeading___Toc2832_1828919045"/>
+      <w:bookmarkStart w:id="17" w:name="__RefHeading___Toc2832_1002645125"/>
       <w:bookmarkEnd w:id="17"/>
       <w:r>
         <w:rPr/>
@@ -9439,7 +9439,7 @@
         <w:keepNext w:val="true"/>
         <w:rPr/>
       </w:pPr>
-      <w:bookmarkStart w:id="18" w:name="__RefHeading___Toc2834_1828919045"/>
+      <w:bookmarkStart w:id="18" w:name="__RefHeading___Toc2834_1002645125"/>
       <w:bookmarkEnd w:id="18"/>
       <w:r>
         <w:rPr/>
@@ -10421,7 +10421,7 @@
         <w:pStyle w:val="Heading2"/>
         <w:rPr/>
       </w:pPr>
-      <w:bookmarkStart w:id="19" w:name="__RefHeading___Toc2836_1828919045"/>
+      <w:bookmarkStart w:id="19" w:name="__RefHeading___Toc2836_1002645125"/>
       <w:bookmarkEnd w:id="19"/>
       <w:r>
         <w:rPr/>
@@ -10445,7 +10445,7 @@
         <w:keepNext w:val="true"/>
         <w:rPr/>
       </w:pPr>
-      <w:bookmarkStart w:id="20" w:name="__RefHeading___Toc2838_1828919045"/>
+      <w:bookmarkStart w:id="20" w:name="__RefHeading___Toc2838_1002645125"/>
       <w:bookmarkEnd w:id="20"/>
       <w:r>
         <w:rPr/>
@@ -11298,7 +11298,7 @@
         <w:keepNext w:val="true"/>
         <w:rPr/>
       </w:pPr>
-      <w:bookmarkStart w:id="21" w:name="__RefHeading___Toc2840_1828919045"/>
+      <w:bookmarkStart w:id="21" w:name="__RefHeading___Toc2840_1002645125"/>
       <w:bookmarkEnd w:id="21"/>
       <w:r>
         <w:rPr/>
@@ -12151,7 +12151,7 @@
         <w:keepNext w:val="true"/>
         <w:rPr/>
       </w:pPr>
-      <w:bookmarkStart w:id="22" w:name="__RefHeading___Toc2842_1828919045"/>
+      <w:bookmarkStart w:id="22" w:name="__RefHeading___Toc2842_1002645125"/>
       <w:bookmarkEnd w:id="22"/>
       <w:r>
         <w:rPr/>
@@ -12799,7 +12799,7 @@
         <w:keepNext w:val="true"/>
         <w:rPr/>
       </w:pPr>
-      <w:bookmarkStart w:id="23" w:name="__RefHeading___Toc2844_1828919045"/>
+      <w:bookmarkStart w:id="23" w:name="__RefHeading___Toc2844_1002645125"/>
       <w:bookmarkEnd w:id="23"/>
       <w:r>
         <w:rPr/>
@@ -14007,7 +14007,7 @@
         <w:keepNext w:val="true"/>
         <w:rPr/>
       </w:pPr>
-      <w:bookmarkStart w:id="24" w:name="__RefHeading___Toc2846_1828919045"/>
+      <w:bookmarkStart w:id="24" w:name="__RefHeading___Toc2846_1002645125"/>
       <w:bookmarkEnd w:id="24"/>
       <w:r>
         <w:rPr/>
@@ -14997,7 +14997,7 @@
         <w:keepNext w:val="true"/>
         <w:rPr/>
       </w:pPr>
-      <w:bookmarkStart w:id="25" w:name="__RefHeading___Toc2848_1828919045"/>
+      <w:bookmarkStart w:id="25" w:name="__RefHeading___Toc2848_1002645125"/>
       <w:bookmarkEnd w:id="25"/>
       <w:r>
         <w:rPr/>
@@ -15877,7 +15877,7 @@
         <w:pStyle w:val="Heading2"/>
         <w:rPr/>
       </w:pPr>
-      <w:bookmarkStart w:id="26" w:name="__RefHeading___Toc2850_1828919045"/>
+      <w:bookmarkStart w:id="26" w:name="__RefHeading___Toc2850_1002645125"/>
       <w:bookmarkEnd w:id="26"/>
       <w:r>
         <w:rPr/>
@@ -15901,7 +15901,7 @@
         <w:keepNext w:val="true"/>
         <w:rPr/>
       </w:pPr>
-      <w:bookmarkStart w:id="27" w:name="__RefHeading___Toc2852_1828919045"/>
+      <w:bookmarkStart w:id="27" w:name="__RefHeading___Toc2852_1002645125"/>
       <w:bookmarkEnd w:id="27"/>
       <w:r>
         <w:rPr/>
@@ -17218,7 +17218,7 @@
         <w:keepNext w:val="true"/>
         <w:rPr/>
       </w:pPr>
-      <w:bookmarkStart w:id="28" w:name="__RefHeading___Toc2854_1828919045"/>
+      <w:bookmarkStart w:id="28" w:name="__RefHeading___Toc2854_1002645125"/>
       <w:bookmarkEnd w:id="28"/>
       <w:r>
         <w:rPr/>
@@ -18426,7 +18426,7 @@
         <w:keepNext w:val="true"/>
         <w:rPr/>
       </w:pPr>
-      <w:bookmarkStart w:id="29" w:name="__RefHeading___Toc2856_1828919045"/>
+      <w:bookmarkStart w:id="29" w:name="__RefHeading___Toc2856_1002645125"/>
       <w:bookmarkEnd w:id="29"/>
       <w:r>
         <w:rPr/>
@@ -20179,7 +20179,7 @@
         <w:keepNext w:val="true"/>
         <w:rPr/>
       </w:pPr>
-      <w:bookmarkStart w:id="30" w:name="__RefHeading___Toc2858_1828919045"/>
+      <w:bookmarkStart w:id="30" w:name="__RefHeading___Toc2858_1002645125"/>
       <w:bookmarkEnd w:id="30"/>
       <w:r>
         <w:rPr/>
@@ -21384,7 +21384,7 @@
         <w:pStyle w:val="Heading2"/>
         <w:rPr/>
       </w:pPr>
-      <w:bookmarkStart w:id="31" w:name="__RefHeading___Toc2860_1828919045"/>
+      <w:bookmarkStart w:id="31" w:name="__RefHeading___Toc2860_1002645125"/>
       <w:bookmarkEnd w:id="31"/>
       <w:r>
         <w:rPr/>
@@ -21408,7 +21408,7 @@
         <w:keepNext w:val="true"/>
         <w:rPr/>
       </w:pPr>
-      <w:bookmarkStart w:id="32" w:name="__RefHeading___Toc2862_1828919045"/>
+      <w:bookmarkStart w:id="32" w:name="__RefHeading___Toc2862_1002645125"/>
       <w:bookmarkEnd w:id="32"/>
       <w:r>
         <w:rPr/>
@@ -22370,7 +22370,7 @@
         <w:keepNext w:val="true"/>
         <w:rPr/>
       </w:pPr>
-      <w:bookmarkStart w:id="33" w:name="__RefHeading___Toc2864_1828919045"/>
+      <w:bookmarkStart w:id="33" w:name="__RefHeading___Toc2864_1002645125"/>
       <w:bookmarkEnd w:id="33"/>
       <w:r>
         <w:rPr/>
@@ -22787,7 +22787,7 @@
         <w:keepNext w:val="true"/>
         <w:rPr/>
       </w:pPr>
-      <w:bookmarkStart w:id="34" w:name="__RefHeading___Toc2866_1828919045"/>
+      <w:bookmarkStart w:id="34" w:name="__RefHeading___Toc2866_1002645125"/>
       <w:bookmarkEnd w:id="34"/>
       <w:r>
         <w:rPr/>
@@ -23640,7 +23640,7 @@
         <w:keepNext w:val="true"/>
         <w:rPr/>
       </w:pPr>
-      <w:bookmarkStart w:id="35" w:name="__RefHeading___Toc2868_1828919045"/>
+      <w:bookmarkStart w:id="35" w:name="__RefHeading___Toc2868_1002645125"/>
       <w:bookmarkEnd w:id="35"/>
       <w:r>
         <w:rPr/>
@@ -24282,7 +24282,7 @@
         <w:keepNext w:val="true"/>
         <w:rPr/>
       </w:pPr>
-      <w:bookmarkStart w:id="36" w:name="__RefHeading___Toc2870_1828919045"/>
+      <w:bookmarkStart w:id="36" w:name="__RefHeading___Toc2870_1002645125"/>
       <w:bookmarkEnd w:id="36"/>
       <w:r>
         <w:rPr/>
@@ -24923,7 +24923,7 @@
         <w:pStyle w:val="Heading2"/>
         <w:rPr/>
       </w:pPr>
-      <w:bookmarkStart w:id="37" w:name="__RefHeading___Toc2872_1828919045"/>
+      <w:bookmarkStart w:id="37" w:name="__RefHeading___Toc2872_1002645125"/>
       <w:bookmarkEnd w:id="37"/>
       <w:r>
         <w:rPr/>
@@ -24947,7 +24947,7 @@
         <w:keepNext w:val="true"/>
         <w:rPr/>
       </w:pPr>
-      <w:bookmarkStart w:id="38" w:name="__RefHeading___Toc2874_1828919045"/>
+      <w:bookmarkStart w:id="38" w:name="__RefHeading___Toc2874_1002645125"/>
       <w:bookmarkEnd w:id="38"/>
       <w:r>
         <w:rPr/>
@@ -26243,7 +26243,7 @@
         <w:keepNext w:val="true"/>
         <w:rPr/>
       </w:pPr>
-      <w:bookmarkStart w:id="39" w:name="__RefHeading___Toc2876_1828919045"/>
+      <w:bookmarkStart w:id="39" w:name="__RefHeading___Toc2876_1002645125"/>
       <w:bookmarkEnd w:id="39"/>
       <w:r>
         <w:rPr/>
@@ -26776,7 +26776,7 @@
         <w:keepNext w:val="true"/>
         <w:rPr/>
       </w:pPr>
-      <w:bookmarkStart w:id="40" w:name="__RefHeading___Toc2878_1828919045"/>
+      <w:bookmarkStart w:id="40" w:name="__RefHeading___Toc2878_1002645125"/>
       <w:bookmarkEnd w:id="40"/>
       <w:r>
         <w:rPr/>
@@ -27881,7 +27881,7 @@
         <w:pStyle w:val="Heading2"/>
         <w:rPr/>
       </w:pPr>
-      <w:bookmarkStart w:id="41" w:name="__RefHeading___Toc2880_1828919045"/>
+      <w:bookmarkStart w:id="41" w:name="__RefHeading___Toc2880_1002645125"/>
       <w:bookmarkEnd w:id="41"/>
       <w:r>
         <w:rPr/>
@@ -27905,7 +27905,7 @@
         <w:keepNext w:val="true"/>
         <w:rPr/>
       </w:pPr>
-      <w:bookmarkStart w:id="42" w:name="__RefHeading___Toc2882_1828919045"/>
+      <w:bookmarkStart w:id="42" w:name="__RefHeading___Toc2882_1002645125"/>
       <w:bookmarkEnd w:id="42"/>
       <w:r>
         <w:rPr/>
@@ -28438,7 +28438,7 @@
         <w:keepNext w:val="true"/>
         <w:rPr/>
       </w:pPr>
-      <w:bookmarkStart w:id="43" w:name="__RefHeading___Toc2884_1828919045"/>
+      <w:bookmarkStart w:id="43" w:name="__RefHeading___Toc2884_1002645125"/>
       <w:bookmarkEnd w:id="43"/>
       <w:r>
         <w:rPr/>

</xml_diff>

<commit_message>
Add episode table, episode_id to the hierarchy, and asset URLs
- Add the episode table (one row per sequence); production now has one row
  per episode instead of per sequence.
- Add episode_id to scene, shot, frame and to every table keyed by shot or
  frame (exposure_sheet, layer, audio_ref, dialog, note, camera tables,
  timeline, review, review_by_frame); update the review_by_frame hook.
- Add episode_url, sequence_url, scene_url (static), shot_url and frame_url.
- Update README, documentation generators, diagrams and regenerated docs.

Co-Authored-By: Claude Sonnet 5.5 <noreply@anthropic.com>
</commit_message>
<xml_diff>
--- a/doc/MLW_Cassandra_Schema.docx
+++ b/doc/MLW_Cassandra_Schema.docx
@@ -39,7 +39,7 @@
         <w:rPr>
           <w:color w:val="666666"/>
         </w:rPr>
-        <w:t>Keyspace mlw  ·  27 tables  ·  Generated 2026-10-06</w:t>
+        <w:t>Keyspace mlw  ·  28 tables  ·  Generated 2026-10-08</w:t>
       </w:r>
     </w:p>
     <w:p>
@@ -102,7 +102,7 @@
             </w:rPr>
             <w:fldChar w:fldCharType="separate"/>
           </w:r>
-          <w:hyperlink w:anchor="__RefHeading___Toc2798_1002645125">
+          <w:hyperlink w:anchor="__RefHeading___Toc6273_4212114258">
             <w:r>
               <w:rPr>
                 <w:rStyle w:val="IndexLink"/>
@@ -122,7 +122,7 @@
             </w:tabs>
             <w:rPr/>
           </w:pPr>
-          <w:hyperlink w:anchor="__RefHeading___Toc2800_1002645125">
+          <w:hyperlink w:anchor="__RefHeading___Toc6275_4212114258">
             <w:r>
               <w:rPr>
                 <w:rStyle w:val="IndexLink"/>
@@ -142,7 +142,7 @@
             </w:tabs>
             <w:rPr/>
           </w:pPr>
-          <w:hyperlink w:anchor="__RefHeading___Toc2802_1002645125">
+          <w:hyperlink w:anchor="__RefHeading___Toc6277_4212114258">
             <w:r>
               <w:rPr>
                 <w:rStyle w:val="IndexLink"/>
@@ -162,7 +162,7 @@
             </w:tabs>
             <w:rPr/>
           </w:pPr>
-          <w:hyperlink w:anchor="__RefHeading___Toc2804_1002645125">
+          <w:hyperlink w:anchor="__RefHeading___Toc6279_4212114258">
             <w:r>
               <w:rPr>
                 <w:rStyle w:val="IndexLink"/>
@@ -182,7 +182,7 @@
             </w:tabs>
             <w:rPr/>
           </w:pPr>
-          <w:hyperlink w:anchor="__RefHeading___Toc2806_1002645125">
+          <w:hyperlink w:anchor="__RefHeading___Toc6281_4212114258">
             <w:r>
               <w:rPr>
                 <w:rStyle w:val="IndexLink"/>
@@ -202,7 +202,7 @@
             </w:tabs>
             <w:rPr/>
           </w:pPr>
-          <w:hyperlink w:anchor="__RefHeading___Toc2808_1002645125">
+          <w:hyperlink w:anchor="__RefHeading___Toc6283_4212114258">
             <w:r>
               <w:rPr>
                 <w:rStyle w:val="IndexLink"/>
@@ -222,7 +222,7 @@
             </w:tabs>
             <w:rPr/>
           </w:pPr>
-          <w:hyperlink w:anchor="__RefHeading___Toc2810_1002645125">
+          <w:hyperlink w:anchor="__RefHeading___Toc6285_4212114258">
             <w:r>
               <w:rPr>
                 <w:rStyle w:val="IndexLink"/>
@@ -242,7 +242,7 @@
             </w:tabs>
             <w:rPr/>
           </w:pPr>
-          <w:hyperlink w:anchor="__RefHeading___Toc2812_1002645125">
+          <w:hyperlink w:anchor="__RefHeading___Toc6287_4212114258">
             <w:r>
               <w:rPr>
                 <w:rStyle w:val="IndexLink"/>
@@ -262,7 +262,7 @@
             </w:tabs>
             <w:rPr/>
           </w:pPr>
-          <w:hyperlink w:anchor="__RefHeading___Toc2814_1002645125">
+          <w:hyperlink w:anchor="__RefHeading___Toc6289_4212114258">
             <w:r>
               <w:rPr>
                 <w:rStyle w:val="IndexLink"/>
@@ -282,7 +282,7 @@
             </w:tabs>
             <w:rPr/>
           </w:pPr>
-          <w:hyperlink w:anchor="__RefHeading___Toc2816_1002645125">
+          <w:hyperlink w:anchor="__RefHeading___Toc6291_4212114258">
             <w:r>
               <w:rPr>
                 <w:rStyle w:val="IndexLink"/>
@@ -302,7 +302,7 @@
             </w:tabs>
             <w:rPr/>
           </w:pPr>
-          <w:hyperlink w:anchor="__RefHeading___Toc2818_1002645125">
+          <w:hyperlink w:anchor="__RefHeading___Toc6293_4212114258">
             <w:r>
               <w:rPr>
                 <w:rStyle w:val="IndexLink"/>
@@ -322,7 +322,7 @@
             </w:tabs>
             <w:rPr/>
           </w:pPr>
-          <w:hyperlink w:anchor="__RefHeading___Toc2820_1002645125">
+          <w:hyperlink w:anchor="__RefHeading___Toc6295_4212114258">
             <w:r>
               <w:rPr>
                 <w:rStyle w:val="IndexLink"/>
@@ -342,7 +342,7 @@
             </w:tabs>
             <w:rPr/>
           </w:pPr>
-          <w:hyperlink w:anchor="__RefHeading___Toc2822_1002645125">
+          <w:hyperlink w:anchor="__RefHeading___Toc6297_4212114258">
             <w:r>
               <w:rPr>
                 <w:rStyle w:val="IndexLink"/>
@@ -362,12 +362,12 @@
             </w:tabs>
             <w:rPr/>
           </w:pPr>
-          <w:hyperlink w:anchor="__RefHeading___Toc2824_1002645125">
+          <w:hyperlink w:anchor="__RefHeading___Toc6299_4212114258">
             <w:r>
               <w:rPr>
                 <w:rStyle w:val="IndexLink"/>
               </w:rPr>
-              <w:t>sequence</w:t>
+              <w:t>episode</w:t>
               <w:tab/>
               <w:t>9</w:t>
             </w:r>
@@ -382,12 +382,12 @@
             </w:tabs>
             <w:rPr/>
           </w:pPr>
-          <w:hyperlink w:anchor="__RefHeading___Toc2826_1002645125">
+          <w:hyperlink w:anchor="__RefHeading___Toc6301_4212114258">
             <w:r>
               <w:rPr>
                 <w:rStyle w:val="IndexLink"/>
               </w:rPr>
-              <w:t>scene</w:t>
+              <w:t>sequence</w:t>
               <w:tab/>
               <w:t>10</w:t>
             </w:r>
@@ -402,12 +402,12 @@
             </w:tabs>
             <w:rPr/>
           </w:pPr>
-          <w:hyperlink w:anchor="__RefHeading___Toc2828_1002645125">
+          <w:hyperlink w:anchor="__RefHeading___Toc6303_4212114258">
             <w:r>
               <w:rPr>
                 <w:rStyle w:val="IndexLink"/>
               </w:rPr>
-              <w:t>shot</w:t>
+              <w:t>scene</w:t>
               <w:tab/>
               <w:t>10</w:t>
             </w:r>
@@ -422,12 +422,12 @@
             </w:tabs>
             <w:rPr/>
           </w:pPr>
-          <w:hyperlink w:anchor="__RefHeading___Toc2830_1002645125">
+          <w:hyperlink w:anchor="__RefHeading___Toc6305_4212114258">
             <w:r>
               <w:rPr>
                 <w:rStyle w:val="IndexLink"/>
               </w:rPr>
-              <w:t>frame</w:t>
+              <w:t>shot</w:t>
               <w:tab/>
               <w:t>11</w:t>
             </w:r>
@@ -442,12 +442,12 @@
             </w:tabs>
             <w:rPr/>
           </w:pPr>
-          <w:hyperlink w:anchor="__RefHeading___Toc2832_1002645125">
+          <w:hyperlink w:anchor="__RefHeading___Toc6307_4212114258">
             <w:r>
               <w:rPr>
                 <w:rStyle w:val="IndexLink"/>
               </w:rPr>
-              <w:t>layer</w:t>
+              <w:t>frame</w:t>
               <w:tab/>
               <w:t>12</w:t>
             </w:r>
@@ -462,14 +462,34 @@
             </w:tabs>
             <w:rPr/>
           </w:pPr>
-          <w:hyperlink w:anchor="__RefHeading___Toc2834_1002645125">
+          <w:hyperlink w:anchor="__RefHeading___Toc6309_4212114258">
+            <w:r>
+              <w:rPr>
+                <w:rStyle w:val="IndexLink"/>
+              </w:rPr>
+              <w:t>layer</w:t>
+              <w:tab/>
+              <w:t>13</w:t>
+            </w:r>
+          </w:hyperlink>
+        </w:p>
+        <w:p>
+          <w:pPr>
+            <w:pStyle w:val="TOC3"/>
+            <w:tabs>
+              <w:tab w:val="clear" w:pos="8793"/>
+              <w:tab w:val="right" w:pos="9359" w:leader="dot"/>
+            </w:tabs>
+            <w:rPr/>
+          </w:pPr>
+          <w:hyperlink w:anchor="__RefHeading___Toc6311_4212114258">
             <w:r>
               <w:rPr>
                 <w:rStyle w:val="IndexLink"/>
               </w:rPr>
               <w:t>exposure_sheet</w:t>
               <w:tab/>
-              <w:t>12</w:t>
+              <w:t>14</w:t>
             </w:r>
           </w:hyperlink>
         </w:p>
@@ -482,14 +502,14 @@
             </w:tabs>
             <w:rPr/>
           </w:pPr>
-          <w:hyperlink w:anchor="__RefHeading___Toc2836_1002645125">
+          <w:hyperlink w:anchor="__RefHeading___Toc6313_4212114258">
             <w:r>
               <w:rPr>
                 <w:rStyle w:val="IndexLink"/>
               </w:rPr>
               <w:t>3.2 Assets, Audio and Notes</w:t>
               <w:tab/>
-              <w:t>13</w:t>
+              <w:t>14</w:t>
             </w:r>
           </w:hyperlink>
         </w:p>
@@ -502,14 +522,14 @@
             </w:tabs>
             <w:rPr/>
           </w:pPr>
-          <w:hyperlink w:anchor="__RefHeading___Toc2838_1002645125">
+          <w:hyperlink w:anchor="__RefHeading___Toc6315_4212114258">
             <w:r>
               <w:rPr>
                 <w:rStyle w:val="IndexLink"/>
               </w:rPr>
               <w:t>asset</w:t>
               <w:tab/>
-              <w:t>13</w:t>
+              <w:t>14</w:t>
             </w:r>
           </w:hyperlink>
         </w:p>
@@ -522,14 +542,14 @@
             </w:tabs>
             <w:rPr/>
           </w:pPr>
-          <w:hyperlink w:anchor="__RefHeading___Toc2840_1002645125">
+          <w:hyperlink w:anchor="__RefHeading___Toc6317_4212114258">
             <w:r>
               <w:rPr>
                 <w:rStyle w:val="IndexLink"/>
               </w:rPr>
               <w:t>track</w:t>
               <w:tab/>
-              <w:t>13</w:t>
+              <w:t>15</w:t>
             </w:r>
           </w:hyperlink>
         </w:p>
@@ -542,14 +562,14 @@
             </w:tabs>
             <w:rPr/>
           </w:pPr>
-          <w:hyperlink w:anchor="__RefHeading___Toc2842_1002645125">
+          <w:hyperlink w:anchor="__RefHeading___Toc6319_4212114258">
             <w:r>
               <w:rPr>
                 <w:rStyle w:val="IndexLink"/>
               </w:rPr>
               <w:t>audio_tracks</w:t>
               <w:tab/>
-              <w:t>14</w:t>
+              <w:t>15</w:t>
             </w:r>
           </w:hyperlink>
         </w:p>
@@ -562,14 +582,14 @@
             </w:tabs>
             <w:rPr/>
           </w:pPr>
-          <w:hyperlink w:anchor="__RefHeading___Toc2844_1002645125">
+          <w:hyperlink w:anchor="__RefHeading___Toc6321_4212114258">
             <w:r>
               <w:rPr>
                 <w:rStyle w:val="IndexLink"/>
               </w:rPr>
               <w:t>audio_ref</w:t>
               <w:tab/>
-              <w:t>14</w:t>
+              <w:t>16</w:t>
             </w:r>
           </w:hyperlink>
         </w:p>
@@ -582,14 +602,14 @@
             </w:tabs>
             <w:rPr/>
           </w:pPr>
-          <w:hyperlink w:anchor="__RefHeading___Toc2846_1002645125">
+          <w:hyperlink w:anchor="__RefHeading___Toc6323_4212114258">
             <w:r>
               <w:rPr>
                 <w:rStyle w:val="IndexLink"/>
               </w:rPr>
               <w:t>dialog</w:t>
               <w:tab/>
-              <w:t>15</w:t>
+              <w:t>16</w:t>
             </w:r>
           </w:hyperlink>
         </w:p>
@@ -602,14 +622,14 @@
             </w:tabs>
             <w:rPr/>
           </w:pPr>
-          <w:hyperlink w:anchor="__RefHeading___Toc2848_1002645125">
+          <w:hyperlink w:anchor="__RefHeading___Toc6325_4212114258">
             <w:r>
               <w:rPr>
                 <w:rStyle w:val="IndexLink"/>
               </w:rPr>
               <w:t>note</w:t>
               <w:tab/>
-              <w:t>15</w:t>
+              <w:t>17</w:t>
             </w:r>
           </w:hyperlink>
         </w:p>
@@ -622,14 +642,14 @@
             </w:tabs>
             <w:rPr/>
           </w:pPr>
-          <w:hyperlink w:anchor="__RefHeading___Toc2850_1002645125">
+          <w:hyperlink w:anchor="__RefHeading___Toc6327_4212114258">
             <w:r>
               <w:rPr>
                 <w:rStyle w:val="IndexLink"/>
               </w:rPr>
               <w:t>3.3 Camera and Timeline</w:t>
               <w:tab/>
-              <w:t>15</w:t>
+              <w:t>17</w:t>
             </w:r>
           </w:hyperlink>
         </w:p>
@@ -642,14 +662,14 @@
             </w:tabs>
             <w:rPr/>
           </w:pPr>
-          <w:hyperlink w:anchor="__RefHeading___Toc2852_1002645125">
+          <w:hyperlink w:anchor="__RefHeading___Toc6329_4212114258">
             <w:r>
               <w:rPr>
                 <w:rStyle w:val="IndexLink"/>
               </w:rPr>
               <w:t>camera</w:t>
               <w:tab/>
-              <w:t>16</w:t>
+              <w:t>18</w:t>
             </w:r>
           </w:hyperlink>
         </w:p>
@@ -662,14 +682,14 @@
             </w:tabs>
             <w:rPr/>
           </w:pPr>
-          <w:hyperlink w:anchor="__RefHeading___Toc2854_1002645125">
+          <w:hyperlink w:anchor="__RefHeading___Toc6331_4212114258">
             <w:r>
               <w:rPr>
                 <w:rStyle w:val="IndexLink"/>
               </w:rPr>
               <w:t>camera_move</w:t>
               <w:tab/>
-              <w:t>17</w:t>
+              <w:t>19</w:t>
             </w:r>
           </w:hyperlink>
         </w:p>
@@ -682,14 +702,14 @@
             </w:tabs>
             <w:rPr/>
           </w:pPr>
-          <w:hyperlink w:anchor="__RefHeading___Toc2856_1002645125">
+          <w:hyperlink w:anchor="__RefHeading___Toc6333_4212114258">
             <w:r>
               <w:rPr>
                 <w:rStyle w:val="IndexLink"/>
               </w:rPr>
               <w:t>keyframe</w:t>
               <w:tab/>
-              <w:t>18</w:t>
+              <w:t>20</w:t>
             </w:r>
           </w:hyperlink>
         </w:p>
@@ -702,14 +722,14 @@
             </w:tabs>
             <w:rPr/>
           </w:pPr>
-          <w:hyperlink w:anchor="__RefHeading___Toc2858_1002645125">
+          <w:hyperlink w:anchor="__RefHeading___Toc6335_4212114258">
             <w:r>
               <w:rPr>
                 <w:rStyle w:val="IndexLink"/>
               </w:rPr>
               <w:t>timeline</w:t>
               <w:tab/>
-              <w:t>19</w:t>
+              <w:t>21</w:t>
             </w:r>
           </w:hyperlink>
         </w:p>
@@ -722,14 +742,14 @@
             </w:tabs>
             <w:rPr/>
           </w:pPr>
-          <w:hyperlink w:anchor="__RefHeading___Toc2860_1002645125">
+          <w:hyperlink w:anchor="__RefHeading___Toc6337_4212114258">
             <w:r>
               <w:rPr>
                 <w:rStyle w:val="IndexLink"/>
               </w:rPr>
               <w:t>3.4 Users and Projects</w:t>
               <w:tab/>
-              <w:t>19</w:t>
+              <w:t>21</w:t>
             </w:r>
           </w:hyperlink>
         </w:p>
@@ -742,14 +762,14 @@
             </w:tabs>
             <w:rPr/>
           </w:pPr>
-          <w:hyperlink w:anchor="__RefHeading___Toc2862_1002645125">
+          <w:hyperlink w:anchor="__RefHeading___Toc6339_4212114258">
             <w:r>
               <w:rPr>
                 <w:rStyle w:val="IndexLink"/>
               </w:rPr>
               <w:t>user</w:t>
               <w:tab/>
-              <w:t>20</w:t>
+              <w:t>22</w:t>
             </w:r>
           </w:hyperlink>
         </w:p>
@@ -762,14 +782,14 @@
             </w:tabs>
             <w:rPr/>
           </w:pPr>
-          <w:hyperlink w:anchor="__RefHeading___Toc2864_1002645125">
+          <w:hyperlink w:anchor="__RefHeading___Toc6341_4212114258">
             <w:r>
               <w:rPr>
                 <w:rStyle w:val="IndexLink"/>
               </w:rPr>
               <w:t>user_by_email</w:t>
               <w:tab/>
-              <w:t>20</w:t>
+              <w:t>22</w:t>
             </w:r>
           </w:hyperlink>
         </w:p>
@@ -782,14 +802,14 @@
             </w:tabs>
             <w:rPr/>
           </w:pPr>
-          <w:hyperlink w:anchor="__RefHeading___Toc2866_1002645125">
+          <w:hyperlink w:anchor="__RefHeading___Toc6343_4212114258">
             <w:r>
               <w:rPr>
                 <w:rStyle w:val="IndexLink"/>
               </w:rPr>
               <w:t>project</w:t>
               <w:tab/>
-              <w:t>21</w:t>
+              <w:t>23</w:t>
             </w:r>
           </w:hyperlink>
         </w:p>
@@ -802,14 +822,14 @@
             </w:tabs>
             <w:rPr/>
           </w:pPr>
-          <w:hyperlink w:anchor="__RefHeading___Toc2868_1002645125">
+          <w:hyperlink w:anchor="__RefHeading___Toc6345_4212114258">
             <w:r>
               <w:rPr>
                 <w:rStyle w:val="IndexLink"/>
               </w:rPr>
               <w:t>project_member</w:t>
               <w:tab/>
-              <w:t>21</w:t>
+              <w:t>23</w:t>
             </w:r>
           </w:hyperlink>
         </w:p>
@@ -822,14 +842,14 @@
             </w:tabs>
             <w:rPr/>
           </w:pPr>
-          <w:hyperlink w:anchor="__RefHeading___Toc2870_1002645125">
+          <w:hyperlink w:anchor="__RefHeading___Toc6347_4212114258">
             <w:r>
               <w:rPr>
                 <w:rStyle w:val="IndexLink"/>
               </w:rPr>
               <w:t>project_by_user</w:t>
               <w:tab/>
-              <w:t>22</w:t>
+              <w:t>24</w:t>
             </w:r>
           </w:hyperlink>
         </w:p>
@@ -842,14 +862,14 @@
             </w:tabs>
             <w:rPr/>
           </w:pPr>
-          <w:hyperlink w:anchor="__RefHeading___Toc2872_1002645125">
+          <w:hyperlink w:anchor="__RefHeading___Toc6349_4212114258">
             <w:r>
               <w:rPr>
                 <w:rStyle w:val="IndexLink"/>
               </w:rPr>
               <w:t>3.5 Review</w:t>
               <w:tab/>
-              <w:t>22</w:t>
+              <w:t>24</w:t>
             </w:r>
           </w:hyperlink>
         </w:p>
@@ -862,14 +882,14 @@
             </w:tabs>
             <w:rPr/>
           </w:pPr>
-          <w:hyperlink w:anchor="__RefHeading___Toc2874_1002645125">
+          <w:hyperlink w:anchor="__RefHeading___Toc6351_4212114258">
             <w:r>
               <w:rPr>
                 <w:rStyle w:val="IndexLink"/>
               </w:rPr>
               <w:t>review</w:t>
               <w:tab/>
-              <w:t>23</w:t>
+              <w:t>25</w:t>
             </w:r>
           </w:hyperlink>
         </w:p>
@@ -882,14 +902,14 @@
             </w:tabs>
             <w:rPr/>
           </w:pPr>
-          <w:hyperlink w:anchor="__RefHeading___Toc2876_1002645125">
+          <w:hyperlink w:anchor="__RefHeading___Toc6353_4212114258">
             <w:r>
               <w:rPr>
                 <w:rStyle w:val="IndexLink"/>
               </w:rPr>
               <w:t>comment</w:t>
               <w:tab/>
-              <w:t>23</w:t>
+              <w:t>25</w:t>
             </w:r>
           </w:hyperlink>
         </w:p>
@@ -902,14 +922,14 @@
             </w:tabs>
             <w:rPr/>
           </w:pPr>
-          <w:hyperlink w:anchor="__RefHeading___Toc2878_1002645125">
+          <w:hyperlink w:anchor="__RefHeading___Toc6355_4212114258">
             <w:r>
               <w:rPr>
                 <w:rStyle w:val="IndexLink"/>
               </w:rPr>
               <w:t>review_by_frame</w:t>
               <w:tab/>
-              <w:t>24</w:t>
+              <w:t>26</w:t>
             </w:r>
           </w:hyperlink>
         </w:p>
@@ -922,14 +942,14 @@
             </w:tabs>
             <w:rPr/>
           </w:pPr>
-          <w:hyperlink w:anchor="__RefHeading___Toc2880_1002645125">
+          <w:hyperlink w:anchor="__RefHeading___Toc6357_4212114258">
             <w:r>
               <w:rPr>
                 <w:rStyle w:val="IndexLink"/>
               </w:rPr>
               <w:t>3.6 Version Control</w:t>
               <w:tab/>
-              <w:t>24</w:t>
+              <w:t>26</w:t>
             </w:r>
           </w:hyperlink>
         </w:p>
@@ -942,14 +962,14 @@
             </w:tabs>
             <w:rPr/>
           </w:pPr>
-          <w:hyperlink w:anchor="__RefHeading___Toc2882_1002645125">
+          <w:hyperlink w:anchor="__RefHeading___Toc6359_4212114258">
             <w:r>
               <w:rPr>
                 <w:rStyle w:val="IndexLink"/>
               </w:rPr>
               <w:t>version_control</w:t>
               <w:tab/>
-              <w:t>24</w:t>
+              <w:t>26</w:t>
             </w:r>
           </w:hyperlink>
         </w:p>
@@ -962,14 +982,14 @@
             </w:tabs>
             <w:rPr/>
           </w:pPr>
-          <w:hyperlink w:anchor="__RefHeading___Toc2884_1002645125">
+          <w:hyperlink w:anchor="__RefHeading___Toc6361_4212114258">
             <w:r>
               <w:rPr>
                 <w:rStyle w:val="IndexLink"/>
               </w:rPr>
               <w:t>revision</w:t>
               <w:tab/>
-              <w:t>25</w:t>
+              <w:t>27</w:t>
             </w:r>
           </w:hyperlink>
           <w:r>
@@ -1012,7 +1032,7 @@
         <w:spacing w:before="0" w:after="160"/>
         <w:rPr/>
       </w:pPr>
-      <w:bookmarkStart w:id="0" w:name="__RefHeading___Toc2798_1002645125"/>
+      <w:bookmarkStart w:id="0" w:name="__RefHeading___Toc6273_4212114258"/>
       <w:bookmarkEnd w:id="0"/>
       <w:r>
         <w:rPr/>
@@ -1024,7 +1044,7 @@
         <w:pStyle w:val="Heading2"/>
         <w:rPr/>
       </w:pPr>
-      <w:bookmarkStart w:id="1" w:name="__RefHeading___Toc2800_1002645125"/>
+      <w:bookmarkStart w:id="1" w:name="__RefHeading___Toc6275_4212114258"/>
       <w:bookmarkEnd w:id="1"/>
       <w:r>
         <w:rPr/>
@@ -1234,7 +1254,7 @@
         <w:pStyle w:val="Heading2"/>
         <w:rPr/>
       </w:pPr>
-      <w:bookmarkStart w:id="2" w:name="__RefHeading___Toc2802_1002645125"/>
+      <w:bookmarkStart w:id="2" w:name="__RefHeading___Toc6277_4212114258"/>
       <w:bookmarkEnd w:id="2"/>
       <w:r>
         <w:rPr/>
@@ -1409,6 +1429,66 @@
                 <w:sz w:val="18"/>
                 <w:szCs w:val="18"/>
               </w:rPr>
+              <w:t>episode</w:t>
+            </w:r>
+          </w:p>
+        </w:tc>
+        <w:tc>
+          <w:tcPr>
+            <w:tcW w:w="7060" w:type="dxa"/>
+            <w:tcBorders>
+              <w:top w:val="single" w:sz="4" w:space="0" w:color="B7B7B7"/>
+              <w:left w:val="single" w:sz="4" w:space="0" w:color="B7B7B7"/>
+              <w:bottom w:val="single" w:sz="4" w:space="0" w:color="B7B7B7"/>
+              <w:right w:val="single" w:sz="4" w:space="0" w:color="B7B7B7"/>
+            </w:tcBorders>
+          </w:tcPr>
+          <w:p>
+            <w:pPr>
+              <w:pStyle w:val="Normal"/>
+              <w:keepNext w:val="false"/>
+              <w:rPr/>
+            </w:pPr>
+            <w:r>
+              <w:rPr>
+                <w:b w:val="false"/>
+                <w:bCs w:val="false"/>
+                <w:sz w:val="20"/>
+                <w:szCs w:val="20"/>
+              </w:rPr>
+              <w:t>An episode is one or more sequences.</w:t>
+            </w:r>
+          </w:p>
+        </w:tc>
+      </w:tr>
+      <w:tr>
+        <w:trPr>
+          <w:cantSplit w:val="true"/>
+        </w:trPr>
+        <w:tc>
+          <w:tcPr>
+            <w:tcW w:w="2299" w:type="dxa"/>
+            <w:tcBorders>
+              <w:top w:val="single" w:sz="4" w:space="0" w:color="B7B7B7"/>
+              <w:left w:val="single" w:sz="4" w:space="0" w:color="B7B7B7"/>
+              <w:bottom w:val="single" w:sz="4" w:space="0" w:color="B7B7B7"/>
+              <w:right w:val="single" w:sz="4" w:space="0" w:color="B7B7B7"/>
+            </w:tcBorders>
+          </w:tcPr>
+          <w:p>
+            <w:pPr>
+              <w:pStyle w:val="Normal"/>
+              <w:keepNext w:val="false"/>
+              <w:rPr/>
+            </w:pPr>
+            <w:r>
+              <w:rPr>
+                <w:rFonts w:eastAsia="Consolas" w:cs="Consolas" w:ascii="Consolas" w:hAnsi="Consolas"/>
+                <w:b w:val="false"/>
+                <w:bCs w:val="false"/>
+                <w:sz w:val="18"/>
+                <w:szCs w:val="18"/>
+              </w:rPr>
               <w:t>sequence</w:t>
             </w:r>
           </w:p>
@@ -2960,7 +3040,7 @@
         <w:spacing w:before="0" w:after="160"/>
         <w:rPr/>
       </w:pPr>
-      <w:bookmarkStart w:id="3" w:name="__RefHeading___Toc2804_1002645125"/>
+      <w:bookmarkStart w:id="3" w:name="__RefHeading___Toc6279_4212114258"/>
       <w:bookmarkEnd w:id="3"/>
       <w:r>
         <w:rPr/>
@@ -3043,7 +3123,7 @@
         <w:pStyle w:val="Heading2"/>
         <w:rPr/>
       </w:pPr>
-      <w:bookmarkStart w:id="4" w:name="__RefHeading___Toc2806_1002645125"/>
+      <w:bookmarkStart w:id="4" w:name="__RefHeading___Toc6281_4212114258"/>
       <w:bookmarkEnd w:id="4"/>
       <w:r>
         <w:rPr/>
@@ -3059,7 +3139,7 @@
       </w:pPr>
       <w:r>
         <w:rPr/>
-        <w:t>A project contains a production of one or more sequences. Each sequence has one or more scenes, each scene one or more shots, and each shot a list of frames. Each table in the chain is partitioned by its parent, so all the children of a parent are read together.</w:t>
+        <w:t>A project contains a production of one or more episodes. Each episode has one or more sequences, each sequence has one or more scenes, each scene one or more shots, and each shot a list of frames. Each table in the chain is partitioned by its parent, so all the children of a parent are read together.</w:t>
       </w:r>
     </w:p>
     <w:p>
@@ -3074,7 +3154,7 @@
         <w:rPr/>
         <w:drawing>
           <wp:inline distT="0" distB="0" distL="0" distR="0">
-            <wp:extent cx="5848350" cy="342900"/>
+            <wp:extent cx="5848350" cy="285750"/>
             <wp:effectExtent l="0" t="0" r="0" b="0"/>
             <wp:docPr id="1" name="overview.png" descr="overview.png&#10;overview.png"/>
             <wp:cNvGraphicFramePr>
@@ -3098,7 +3178,7 @@
                   <pic:spPr bwMode="auto">
                     <a:xfrm>
                       <a:off x="0" y="0"/>
-                      <a:ext cx="5848350" cy="342900"/>
+                      <a:ext cx="5848350" cy="285750"/>
                     </a:xfrm>
                     <a:prstGeom prst="rect">
                       <a:avLst/>
@@ -3116,7 +3196,7 @@
         <w:pStyle w:val="Heading2"/>
         <w:rPr/>
       </w:pPr>
-      <w:bookmarkStart w:id="5" w:name="__RefHeading___Toc2808_1002645125"/>
+      <w:bookmarkStart w:id="5" w:name="__RefHeading___Toc6283_4212114258"/>
       <w:bookmarkEnd w:id="5"/>
       <w:r>
         <w:rPr/>
@@ -3189,7 +3269,7 @@
         <w:pStyle w:val="Heading2"/>
         <w:rPr/>
       </w:pPr>
-      <w:bookmarkStart w:id="6" w:name="__RefHeading___Toc2810_1002645125"/>
+      <w:bookmarkStart w:id="6" w:name="__RefHeading___Toc6285_4212114258"/>
       <w:bookmarkEnd w:id="6"/>
       <w:r>
         <w:rPr/>
@@ -3262,7 +3342,7 @@
         <w:pStyle w:val="Heading2"/>
         <w:rPr/>
       </w:pPr>
-      <w:bookmarkStart w:id="7" w:name="__RefHeading___Toc2812_1002645125"/>
+      <w:bookmarkStart w:id="7" w:name="__RefHeading___Toc6287_4212114258"/>
       <w:bookmarkEnd w:id="7"/>
       <w:r>
         <w:rPr/>
@@ -3278,7 +3358,7 @@
       </w:pPr>
       <w:r>
         <w:rPr/>
-        <w:t>A shot has cameras. A camera refers to its camera moves and keyframes through ordered lists of identifiers. A timeline is a separate ordered list of frames: each entry points at a frame by sequence, scene, shot and frame number.</w:t>
+        <w:t>A shot has cameras. A camera refers to its camera moves and keyframes through ordered lists of identifiers. A timeline is a separate ordered list of frames: each entry points at a frame by episode, sequence, scene, shot and frame number.</w:t>
       </w:r>
     </w:p>
     <w:p>
@@ -3293,7 +3373,7 @@
         <w:rPr/>
         <w:drawing>
           <wp:inline distT="0" distB="0" distL="0" distR="0">
-            <wp:extent cx="5848350" cy="1866900"/>
+            <wp:extent cx="5848350" cy="1724025"/>
             <wp:effectExtent l="0" t="0" r="0" b="0"/>
             <wp:docPr id="4" name="camera.png" descr="camera.png&#10;camera.png"/>
             <wp:cNvGraphicFramePr>
@@ -3317,7 +3397,7 @@
                   <pic:spPr bwMode="auto">
                     <a:xfrm>
                       <a:off x="0" y="0"/>
-                      <a:ext cx="5848350" cy="1866900"/>
+                      <a:ext cx="5848350" cy="1724025"/>
                     </a:xfrm>
                     <a:prstGeom prst="rect">
                       <a:avLst/>
@@ -3335,7 +3415,7 @@
         <w:pStyle w:val="Heading2"/>
         <w:rPr/>
       </w:pPr>
-      <w:bookmarkStart w:id="8" w:name="__RefHeading___Toc2814_1002645125"/>
+      <w:bookmarkStart w:id="8" w:name="__RefHeading___Toc6289_4212114258"/>
       <w:bookmarkEnd w:id="8"/>
       <w:r>
         <w:rPr/>
@@ -3408,7 +3488,7 @@
         <w:pStyle w:val="Heading2"/>
         <w:rPr/>
       </w:pPr>
-      <w:bookmarkStart w:id="9" w:name="__RefHeading___Toc2816_1002645125"/>
+      <w:bookmarkStart w:id="9" w:name="__RefHeading___Toc6291_4212114258"/>
       <w:bookmarkEnd w:id="9"/>
       <w:r>
         <w:rPr/>
@@ -3439,7 +3519,7 @@
         <w:rPr/>
         <w:drawing>
           <wp:inline distT="0" distB="0" distL="0" distR="0">
-            <wp:extent cx="5848350" cy="2381250"/>
+            <wp:extent cx="5848350" cy="2200275"/>
             <wp:effectExtent l="0" t="0" r="0" b="0"/>
             <wp:docPr id="6" name="review.png" descr="review.png&#10;review.png"/>
             <wp:cNvGraphicFramePr>
@@ -3463,7 +3543,7 @@
                   <pic:spPr bwMode="auto">
                     <a:xfrm>
                       <a:off x="0" y="0"/>
-                      <a:ext cx="5848350" cy="2381250"/>
+                      <a:ext cx="5848350" cy="2200275"/>
                     </a:xfrm>
                     <a:prstGeom prst="rect">
                       <a:avLst/>
@@ -3494,7 +3574,7 @@
         <w:spacing w:before="0" w:after="160"/>
         <w:rPr/>
       </w:pPr>
-      <w:bookmarkStart w:id="10" w:name="__RefHeading___Toc2818_1002645125"/>
+      <w:bookmarkStart w:id="10" w:name="__RefHeading___Toc6293_4212114258"/>
       <w:bookmarkEnd w:id="10"/>
       <w:r>
         <w:rPr/>
@@ -3517,7 +3597,7 @@
         <w:pStyle w:val="Heading2"/>
         <w:rPr/>
       </w:pPr>
-      <w:bookmarkStart w:id="11" w:name="__RefHeading___Toc2820_1002645125"/>
+      <w:bookmarkStart w:id="11" w:name="__RefHeading___Toc6295_4212114258"/>
       <w:bookmarkEnd w:id="11"/>
       <w:r>
         <w:rPr/>
@@ -3532,7 +3612,7 @@
       </w:pPr>
       <w:r>
         <w:rPr/>
-        <w:t>Tables that describe the structure of a production, from sequences down to frames and layers.</w:t>
+        <w:t>Tables that describe the structure of a production, from episodes down to frames and layers.</w:t>
       </w:r>
     </w:p>
     <w:p>
@@ -3541,7 +3621,7 @@
         <w:keepNext w:val="true"/>
         <w:rPr/>
       </w:pPr>
-      <w:bookmarkStart w:id="12" w:name="__RefHeading___Toc2822_1002645125"/>
+      <w:bookmarkStart w:id="12" w:name="__RefHeading___Toc6297_4212114258"/>
       <w:bookmarkEnd w:id="12"/>
       <w:r>
         <w:rPr/>
@@ -3557,7 +3637,7 @@
       </w:pPr>
       <w:r>
         <w:rPr/>
-        <w:t>Holds the production hierarchy at its top level. A production is one or more sequences, so the table has one row per sequence, partitioned by project. Reading one partition returns all sequences of a project in order.</w:t>
+        <w:t>Holds the production hierarchy at its top level. A production is one or more episodes, so the table has one row per episode, partitioned by project. Reading one partition returns all episodes of a project in order.</w:t>
       </w:r>
     </w:p>
     <w:p>
@@ -3573,7 +3653,7 @@
           <w:iCs/>
           <w:color w:val="444444"/>
         </w:rPr>
-        <w:t>Primary key: partition (project_id), clustering (sequence_id).</w:t>
+        <w:t>Primary key: partition (project_id), clustering (episode_id).</w:t>
       </w:r>
     </w:p>
     <w:tbl>
@@ -3861,7 +3941,7 @@
                 <w:sz w:val="18"/>
                 <w:szCs w:val="18"/>
               </w:rPr>
-              <w:t>sequence_id</w:t>
+              <w:t>episode_id</w:t>
             </w:r>
           </w:p>
         </w:tc>
@@ -3943,7 +4023,7 @@
                 <w:sz w:val="20"/>
                 <w:szCs w:val="20"/>
               </w:rPr>
-              <w:t>Identifier of a sequence in the production. The table holds one row per sequence.</w:t>
+              <w:t>Identifier of an episode in the production. The table holds one row per episode.</w:t>
             </w:r>
           </w:p>
         </w:tc>
@@ -4052,7 +4132,7 @@
                 <w:sz w:val="20"/>
                 <w:szCs w:val="20"/>
               </w:rPr>
-              <w:t>Title of the sequence.</w:t>
+              <w:t>Title of the episode.</w:t>
             </w:r>
           </w:p>
         </w:tc>
@@ -4161,7 +4241,7 @@
                 <w:sz w:val="20"/>
                 <w:szCs w:val="20"/>
               </w:rPr>
-              <w:t>Description of the sequence.</w:t>
+              <w:t>Description of the episode.</w:t>
             </w:r>
           </w:p>
         </w:tc>
@@ -4183,8 +4263,772 @@
         <w:keepNext w:val="true"/>
         <w:rPr/>
       </w:pPr>
-      <w:bookmarkStart w:id="13" w:name="__RefHeading___Toc2824_1002645125"/>
+      <w:bookmarkStart w:id="13" w:name="__RefHeading___Toc6299_4212114258"/>
       <w:bookmarkEnd w:id="13"/>
+      <w:r>
+        <w:rPr/>
+        <w:t>episode</w:t>
+      </w:r>
+    </w:p>
+    <w:p>
+      <w:pPr>
+        <w:pStyle w:val="Normal"/>
+        <w:keepNext w:val="true"/>
+        <w:spacing w:before="0" w:after="100"/>
+        <w:rPr/>
+      </w:pPr>
+      <w:r>
+        <w:rPr/>
+        <w:t>An episode is one or more sequences. The table has one row per sequence, partitioned by project and episode, so one query returns all sequences of an episode.</w:t>
+      </w:r>
+    </w:p>
+    <w:p>
+      <w:pPr>
+        <w:pStyle w:val="Normal"/>
+        <w:keepNext w:val="true"/>
+        <w:spacing w:before="0" w:after="100"/>
+        <w:rPr/>
+      </w:pPr>
+      <w:r>
+        <w:rPr>
+          <w:i/>
+          <w:iCs/>
+          <w:color w:val="444444"/>
+        </w:rPr>
+        <w:t>Primary key: partition (project_id, episode_id), clustering (sequence_id).</w:t>
+      </w:r>
+    </w:p>
+    <w:tbl>
+      <w:tblPr>
+        <w:tblW w:w="9360" w:type="dxa"/>
+        <w:jc w:val="left"/>
+        <w:tblInd w:w="0" w:type="dxa"/>
+        <w:tblLayout w:type="fixed"/>
+        <w:tblCellMar>
+          <w:top w:w="50" w:type="dxa"/>
+          <w:left w:w="90" w:type="dxa"/>
+          <w:bottom w:w="50" w:type="dxa"/>
+          <w:right w:w="90" w:type="dxa"/>
+        </w:tblCellMar>
+      </w:tblPr>
+      <w:tblGrid>
+        <w:gridCol w:w="1900"/>
+        <w:gridCol w:w="1249"/>
+        <w:gridCol w:w="1251"/>
+        <w:gridCol w:w="4959"/>
+      </w:tblGrid>
+      <w:tr>
+        <w:trPr>
+          <w:tblHeader w:val="true"/>
+        </w:trPr>
+        <w:tc>
+          <w:tcPr>
+            <w:tcW w:w="1900" w:type="dxa"/>
+            <w:tcBorders>
+              <w:top w:val="single" w:sz="4" w:space="0" w:color="B7B7B7"/>
+              <w:left w:val="single" w:sz="4" w:space="0" w:color="B7B7B7"/>
+              <w:bottom w:val="single" w:sz="4" w:space="0" w:color="B7B7B7"/>
+              <w:right w:val="single" w:sz="4" w:space="0" w:color="B7B7B7"/>
+            </w:tcBorders>
+            <w:shd w:color="auto" w:fill="2F5C8F" w:val="clear"/>
+          </w:tcPr>
+          <w:p>
+            <w:pPr>
+              <w:pStyle w:val="Normal"/>
+              <w:keepNext w:val="true"/>
+              <w:rPr/>
+            </w:pPr>
+            <w:r>
+              <w:rPr>
+                <w:b/>
+                <w:bCs/>
+                <w:color w:val="FFFFFF"/>
+                <w:sz w:val="20"/>
+                <w:szCs w:val="20"/>
+              </w:rPr>
+              <w:t>Column</w:t>
+            </w:r>
+          </w:p>
+        </w:tc>
+        <w:tc>
+          <w:tcPr>
+            <w:tcW w:w="1249" w:type="dxa"/>
+            <w:tcBorders>
+              <w:top w:val="single" w:sz="4" w:space="0" w:color="B7B7B7"/>
+              <w:left w:val="single" w:sz="4" w:space="0" w:color="B7B7B7"/>
+              <w:bottom w:val="single" w:sz="4" w:space="0" w:color="B7B7B7"/>
+              <w:right w:val="single" w:sz="4" w:space="0" w:color="B7B7B7"/>
+            </w:tcBorders>
+            <w:shd w:color="auto" w:fill="2F5C8F" w:val="clear"/>
+          </w:tcPr>
+          <w:p>
+            <w:pPr>
+              <w:pStyle w:val="Normal"/>
+              <w:keepNext w:val="true"/>
+              <w:rPr/>
+            </w:pPr>
+            <w:r>
+              <w:rPr>
+                <w:b/>
+                <w:bCs/>
+                <w:color w:val="FFFFFF"/>
+                <w:sz w:val="20"/>
+                <w:szCs w:val="20"/>
+              </w:rPr>
+              <w:t>Type</w:t>
+            </w:r>
+          </w:p>
+        </w:tc>
+        <w:tc>
+          <w:tcPr>
+            <w:tcW w:w="1251" w:type="dxa"/>
+            <w:tcBorders>
+              <w:top w:val="single" w:sz="4" w:space="0" w:color="B7B7B7"/>
+              <w:left w:val="single" w:sz="4" w:space="0" w:color="B7B7B7"/>
+              <w:bottom w:val="single" w:sz="4" w:space="0" w:color="B7B7B7"/>
+              <w:right w:val="single" w:sz="4" w:space="0" w:color="B7B7B7"/>
+            </w:tcBorders>
+            <w:shd w:color="auto" w:fill="2F5C8F" w:val="clear"/>
+          </w:tcPr>
+          <w:p>
+            <w:pPr>
+              <w:pStyle w:val="Normal"/>
+              <w:keepNext w:val="true"/>
+              <w:rPr/>
+            </w:pPr>
+            <w:r>
+              <w:rPr>
+                <w:b/>
+                <w:bCs/>
+                <w:color w:val="FFFFFF"/>
+                <w:sz w:val="20"/>
+                <w:szCs w:val="20"/>
+              </w:rPr>
+              <w:t>Key</w:t>
+            </w:r>
+          </w:p>
+        </w:tc>
+        <w:tc>
+          <w:tcPr>
+            <w:tcW w:w="4959" w:type="dxa"/>
+            <w:tcBorders>
+              <w:top w:val="single" w:sz="4" w:space="0" w:color="B7B7B7"/>
+              <w:left w:val="single" w:sz="4" w:space="0" w:color="B7B7B7"/>
+              <w:bottom w:val="single" w:sz="4" w:space="0" w:color="B7B7B7"/>
+              <w:right w:val="single" w:sz="4" w:space="0" w:color="B7B7B7"/>
+            </w:tcBorders>
+            <w:shd w:color="auto" w:fill="2F5C8F" w:val="clear"/>
+          </w:tcPr>
+          <w:p>
+            <w:pPr>
+              <w:pStyle w:val="Normal"/>
+              <w:keepNext w:val="true"/>
+              <w:rPr/>
+            </w:pPr>
+            <w:r>
+              <w:rPr>
+                <w:b/>
+                <w:bCs/>
+                <w:color w:val="FFFFFF"/>
+                <w:sz w:val="20"/>
+                <w:szCs w:val="20"/>
+              </w:rPr>
+              <w:t>Description</w:t>
+            </w:r>
+          </w:p>
+        </w:tc>
+      </w:tr>
+      <w:tr>
+        <w:trPr>
+          <w:cantSplit w:val="true"/>
+        </w:trPr>
+        <w:tc>
+          <w:tcPr>
+            <w:tcW w:w="1900" w:type="dxa"/>
+            <w:tcBorders>
+              <w:top w:val="single" w:sz="4" w:space="0" w:color="B7B7B7"/>
+              <w:left w:val="single" w:sz="4" w:space="0" w:color="B7B7B7"/>
+              <w:bottom w:val="single" w:sz="4" w:space="0" w:color="B7B7B7"/>
+              <w:right w:val="single" w:sz="4" w:space="0" w:color="B7B7B7"/>
+            </w:tcBorders>
+            <w:shd w:color="auto" w:fill="EEF3FA" w:val="clear"/>
+          </w:tcPr>
+          <w:p>
+            <w:pPr>
+              <w:pStyle w:val="Normal"/>
+              <w:keepNext w:val="true"/>
+              <w:rPr/>
+            </w:pPr>
+            <w:r>
+              <w:rPr>
+                <w:rFonts w:eastAsia="Consolas" w:cs="Consolas" w:ascii="Consolas" w:hAnsi="Consolas"/>
+                <w:b w:val="false"/>
+                <w:bCs w:val="false"/>
+                <w:sz w:val="18"/>
+                <w:szCs w:val="18"/>
+              </w:rPr>
+              <w:t>project_id</w:t>
+            </w:r>
+          </w:p>
+        </w:tc>
+        <w:tc>
+          <w:tcPr>
+            <w:tcW w:w="1249" w:type="dxa"/>
+            <w:tcBorders>
+              <w:top w:val="single" w:sz="4" w:space="0" w:color="B7B7B7"/>
+              <w:left w:val="single" w:sz="4" w:space="0" w:color="B7B7B7"/>
+              <w:bottom w:val="single" w:sz="4" w:space="0" w:color="B7B7B7"/>
+              <w:right w:val="single" w:sz="4" w:space="0" w:color="B7B7B7"/>
+            </w:tcBorders>
+          </w:tcPr>
+          <w:p>
+            <w:pPr>
+              <w:pStyle w:val="Normal"/>
+              <w:keepNext w:val="true"/>
+              <w:rPr/>
+            </w:pPr>
+            <w:r>
+              <w:rPr>
+                <w:rFonts w:eastAsia="Consolas" w:cs="Consolas" w:ascii="Consolas" w:hAnsi="Consolas"/>
+                <w:b w:val="false"/>
+                <w:bCs w:val="false"/>
+                <w:sz w:val="18"/>
+                <w:szCs w:val="18"/>
+              </w:rPr>
+              <w:t>text</w:t>
+            </w:r>
+          </w:p>
+        </w:tc>
+        <w:tc>
+          <w:tcPr>
+            <w:tcW w:w="1251" w:type="dxa"/>
+            <w:tcBorders>
+              <w:top w:val="single" w:sz="4" w:space="0" w:color="B7B7B7"/>
+              <w:left w:val="single" w:sz="4" w:space="0" w:color="B7B7B7"/>
+              <w:bottom w:val="single" w:sz="4" w:space="0" w:color="B7B7B7"/>
+              <w:right w:val="single" w:sz="4" w:space="0" w:color="B7B7B7"/>
+            </w:tcBorders>
+          </w:tcPr>
+          <w:p>
+            <w:pPr>
+              <w:pStyle w:val="Normal"/>
+              <w:keepNext w:val="true"/>
+              <w:rPr/>
+            </w:pPr>
+            <w:r>
+              <w:rPr>
+                <w:b w:val="false"/>
+                <w:bCs w:val="false"/>
+                <w:sz w:val="20"/>
+                <w:szCs w:val="20"/>
+              </w:rPr>
+              <w:t>Partition</w:t>
+            </w:r>
+          </w:p>
+        </w:tc>
+        <w:tc>
+          <w:tcPr>
+            <w:tcW w:w="4959" w:type="dxa"/>
+            <w:tcBorders>
+              <w:top w:val="single" w:sz="4" w:space="0" w:color="B7B7B7"/>
+              <w:left w:val="single" w:sz="4" w:space="0" w:color="B7B7B7"/>
+              <w:bottom w:val="single" w:sz="4" w:space="0" w:color="B7B7B7"/>
+              <w:right w:val="single" w:sz="4" w:space="0" w:color="B7B7B7"/>
+            </w:tcBorders>
+          </w:tcPr>
+          <w:p>
+            <w:pPr>
+              <w:pStyle w:val="Normal"/>
+              <w:keepNext w:val="true"/>
+              <w:rPr/>
+            </w:pPr>
+            <w:r>
+              <w:rPr>
+                <w:b w:val="false"/>
+                <w:bCs w:val="false"/>
+                <w:sz w:val="20"/>
+                <w:szCs w:val="20"/>
+              </w:rPr>
+              <w:t>Identifier of the project the row belongs to (project.project_id).</w:t>
+            </w:r>
+          </w:p>
+        </w:tc>
+      </w:tr>
+      <w:tr>
+        <w:trPr>
+          <w:cantSplit w:val="true"/>
+        </w:trPr>
+        <w:tc>
+          <w:tcPr>
+            <w:tcW w:w="1900" w:type="dxa"/>
+            <w:tcBorders>
+              <w:top w:val="single" w:sz="4" w:space="0" w:color="B7B7B7"/>
+              <w:left w:val="single" w:sz="4" w:space="0" w:color="B7B7B7"/>
+              <w:bottom w:val="single" w:sz="4" w:space="0" w:color="B7B7B7"/>
+              <w:right w:val="single" w:sz="4" w:space="0" w:color="B7B7B7"/>
+            </w:tcBorders>
+            <w:shd w:color="auto" w:fill="EEF3FA" w:val="clear"/>
+          </w:tcPr>
+          <w:p>
+            <w:pPr>
+              <w:pStyle w:val="Normal"/>
+              <w:keepNext w:val="true"/>
+              <w:rPr/>
+            </w:pPr>
+            <w:r>
+              <w:rPr>
+                <w:rFonts w:eastAsia="Consolas" w:cs="Consolas" w:ascii="Consolas" w:hAnsi="Consolas"/>
+                <w:b w:val="false"/>
+                <w:bCs w:val="false"/>
+                <w:sz w:val="18"/>
+                <w:szCs w:val="18"/>
+              </w:rPr>
+              <w:t>episode_id</w:t>
+            </w:r>
+          </w:p>
+        </w:tc>
+        <w:tc>
+          <w:tcPr>
+            <w:tcW w:w="1249" w:type="dxa"/>
+            <w:tcBorders>
+              <w:top w:val="single" w:sz="4" w:space="0" w:color="B7B7B7"/>
+              <w:left w:val="single" w:sz="4" w:space="0" w:color="B7B7B7"/>
+              <w:bottom w:val="single" w:sz="4" w:space="0" w:color="B7B7B7"/>
+              <w:right w:val="single" w:sz="4" w:space="0" w:color="B7B7B7"/>
+            </w:tcBorders>
+          </w:tcPr>
+          <w:p>
+            <w:pPr>
+              <w:pStyle w:val="Normal"/>
+              <w:keepNext w:val="true"/>
+              <w:rPr/>
+            </w:pPr>
+            <w:r>
+              <w:rPr>
+                <w:rFonts w:eastAsia="Consolas" w:cs="Consolas" w:ascii="Consolas" w:hAnsi="Consolas"/>
+                <w:b w:val="false"/>
+                <w:bCs w:val="false"/>
+                <w:sz w:val="18"/>
+                <w:szCs w:val="18"/>
+              </w:rPr>
+              <w:t>text</w:t>
+            </w:r>
+          </w:p>
+        </w:tc>
+        <w:tc>
+          <w:tcPr>
+            <w:tcW w:w="1251" w:type="dxa"/>
+            <w:tcBorders>
+              <w:top w:val="single" w:sz="4" w:space="0" w:color="B7B7B7"/>
+              <w:left w:val="single" w:sz="4" w:space="0" w:color="B7B7B7"/>
+              <w:bottom w:val="single" w:sz="4" w:space="0" w:color="B7B7B7"/>
+              <w:right w:val="single" w:sz="4" w:space="0" w:color="B7B7B7"/>
+            </w:tcBorders>
+          </w:tcPr>
+          <w:p>
+            <w:pPr>
+              <w:pStyle w:val="Normal"/>
+              <w:keepNext w:val="true"/>
+              <w:rPr/>
+            </w:pPr>
+            <w:r>
+              <w:rPr>
+                <w:b w:val="false"/>
+                <w:bCs w:val="false"/>
+                <w:sz w:val="20"/>
+                <w:szCs w:val="20"/>
+              </w:rPr>
+              <w:t>Partition</w:t>
+            </w:r>
+          </w:p>
+        </w:tc>
+        <w:tc>
+          <w:tcPr>
+            <w:tcW w:w="4959" w:type="dxa"/>
+            <w:tcBorders>
+              <w:top w:val="single" w:sz="4" w:space="0" w:color="B7B7B7"/>
+              <w:left w:val="single" w:sz="4" w:space="0" w:color="B7B7B7"/>
+              <w:bottom w:val="single" w:sz="4" w:space="0" w:color="B7B7B7"/>
+              <w:right w:val="single" w:sz="4" w:space="0" w:color="B7B7B7"/>
+            </w:tcBorders>
+          </w:tcPr>
+          <w:p>
+            <w:pPr>
+              <w:pStyle w:val="Normal"/>
+              <w:keepNext w:val="true"/>
+              <w:rPr/>
+            </w:pPr>
+            <w:r>
+              <w:rPr>
+                <w:b w:val="false"/>
+                <w:bCs w:val="false"/>
+                <w:sz w:val="20"/>
+                <w:szCs w:val="20"/>
+              </w:rPr>
+              <w:t>Identifier of the episode the row belongs to.</w:t>
+            </w:r>
+          </w:p>
+        </w:tc>
+      </w:tr>
+      <w:tr>
+        <w:trPr>
+          <w:cantSplit w:val="true"/>
+        </w:trPr>
+        <w:tc>
+          <w:tcPr>
+            <w:tcW w:w="1900" w:type="dxa"/>
+            <w:tcBorders>
+              <w:top w:val="single" w:sz="4" w:space="0" w:color="B7B7B7"/>
+              <w:left w:val="single" w:sz="4" w:space="0" w:color="B7B7B7"/>
+              <w:bottom w:val="single" w:sz="4" w:space="0" w:color="B7B7B7"/>
+              <w:right w:val="single" w:sz="4" w:space="0" w:color="B7B7B7"/>
+            </w:tcBorders>
+            <w:shd w:color="auto" w:fill="EEF3FA" w:val="clear"/>
+          </w:tcPr>
+          <w:p>
+            <w:pPr>
+              <w:pStyle w:val="Normal"/>
+              <w:keepNext w:val="true"/>
+              <w:rPr/>
+            </w:pPr>
+            <w:r>
+              <w:rPr>
+                <w:rFonts w:eastAsia="Consolas" w:cs="Consolas" w:ascii="Consolas" w:hAnsi="Consolas"/>
+                <w:b w:val="false"/>
+                <w:bCs w:val="false"/>
+                <w:sz w:val="18"/>
+                <w:szCs w:val="18"/>
+              </w:rPr>
+              <w:t>sequence_id</w:t>
+            </w:r>
+          </w:p>
+        </w:tc>
+        <w:tc>
+          <w:tcPr>
+            <w:tcW w:w="1249" w:type="dxa"/>
+            <w:tcBorders>
+              <w:top w:val="single" w:sz="4" w:space="0" w:color="B7B7B7"/>
+              <w:left w:val="single" w:sz="4" w:space="0" w:color="B7B7B7"/>
+              <w:bottom w:val="single" w:sz="4" w:space="0" w:color="B7B7B7"/>
+              <w:right w:val="single" w:sz="4" w:space="0" w:color="B7B7B7"/>
+            </w:tcBorders>
+          </w:tcPr>
+          <w:p>
+            <w:pPr>
+              <w:pStyle w:val="Normal"/>
+              <w:keepNext w:val="true"/>
+              <w:rPr/>
+            </w:pPr>
+            <w:r>
+              <w:rPr>
+                <w:rFonts w:eastAsia="Consolas" w:cs="Consolas" w:ascii="Consolas" w:hAnsi="Consolas"/>
+                <w:b w:val="false"/>
+                <w:bCs w:val="false"/>
+                <w:sz w:val="18"/>
+                <w:szCs w:val="18"/>
+              </w:rPr>
+              <w:t>text</w:t>
+            </w:r>
+          </w:p>
+        </w:tc>
+        <w:tc>
+          <w:tcPr>
+            <w:tcW w:w="1251" w:type="dxa"/>
+            <w:tcBorders>
+              <w:top w:val="single" w:sz="4" w:space="0" w:color="B7B7B7"/>
+              <w:left w:val="single" w:sz="4" w:space="0" w:color="B7B7B7"/>
+              <w:bottom w:val="single" w:sz="4" w:space="0" w:color="B7B7B7"/>
+              <w:right w:val="single" w:sz="4" w:space="0" w:color="B7B7B7"/>
+            </w:tcBorders>
+          </w:tcPr>
+          <w:p>
+            <w:pPr>
+              <w:pStyle w:val="Normal"/>
+              <w:keepNext w:val="true"/>
+              <w:rPr/>
+            </w:pPr>
+            <w:r>
+              <w:rPr>
+                <w:b w:val="false"/>
+                <w:bCs w:val="false"/>
+                <w:sz w:val="20"/>
+                <w:szCs w:val="20"/>
+              </w:rPr>
+              <w:t>Clustering</w:t>
+            </w:r>
+          </w:p>
+        </w:tc>
+        <w:tc>
+          <w:tcPr>
+            <w:tcW w:w="4959" w:type="dxa"/>
+            <w:tcBorders>
+              <w:top w:val="single" w:sz="4" w:space="0" w:color="B7B7B7"/>
+              <w:left w:val="single" w:sz="4" w:space="0" w:color="B7B7B7"/>
+              <w:bottom w:val="single" w:sz="4" w:space="0" w:color="B7B7B7"/>
+              <w:right w:val="single" w:sz="4" w:space="0" w:color="B7B7B7"/>
+            </w:tcBorders>
+          </w:tcPr>
+          <w:p>
+            <w:pPr>
+              <w:pStyle w:val="Normal"/>
+              <w:keepNext w:val="true"/>
+              <w:rPr/>
+            </w:pPr>
+            <w:r>
+              <w:rPr>
+                <w:b w:val="false"/>
+                <w:bCs w:val="false"/>
+                <w:sz w:val="20"/>
+                <w:szCs w:val="20"/>
+              </w:rPr>
+              <w:t>Identifier of a sequence in the episode. The table holds one row per sequence.</w:t>
+            </w:r>
+          </w:p>
+        </w:tc>
+      </w:tr>
+      <w:tr>
+        <w:trPr>
+          <w:cantSplit w:val="true"/>
+        </w:trPr>
+        <w:tc>
+          <w:tcPr>
+            <w:tcW w:w="1900" w:type="dxa"/>
+            <w:tcBorders>
+              <w:top w:val="single" w:sz="4" w:space="0" w:color="B7B7B7"/>
+              <w:left w:val="single" w:sz="4" w:space="0" w:color="B7B7B7"/>
+              <w:bottom w:val="single" w:sz="4" w:space="0" w:color="B7B7B7"/>
+              <w:right w:val="single" w:sz="4" w:space="0" w:color="B7B7B7"/>
+            </w:tcBorders>
+          </w:tcPr>
+          <w:p>
+            <w:pPr>
+              <w:pStyle w:val="Normal"/>
+              <w:keepNext w:val="true"/>
+              <w:rPr/>
+            </w:pPr>
+            <w:r>
+              <w:rPr>
+                <w:rFonts w:eastAsia="Consolas" w:cs="Consolas" w:ascii="Consolas" w:hAnsi="Consolas"/>
+                <w:b w:val="false"/>
+                <w:bCs w:val="false"/>
+                <w:sz w:val="18"/>
+                <w:szCs w:val="18"/>
+              </w:rPr>
+              <w:t>episode_url</w:t>
+            </w:r>
+          </w:p>
+        </w:tc>
+        <w:tc>
+          <w:tcPr>
+            <w:tcW w:w="1249" w:type="dxa"/>
+            <w:tcBorders>
+              <w:top w:val="single" w:sz="4" w:space="0" w:color="B7B7B7"/>
+              <w:left w:val="single" w:sz="4" w:space="0" w:color="B7B7B7"/>
+              <w:bottom w:val="single" w:sz="4" w:space="0" w:color="B7B7B7"/>
+              <w:right w:val="single" w:sz="4" w:space="0" w:color="B7B7B7"/>
+            </w:tcBorders>
+          </w:tcPr>
+          <w:p>
+            <w:pPr>
+              <w:pStyle w:val="Normal"/>
+              <w:keepNext w:val="true"/>
+              <w:rPr/>
+            </w:pPr>
+            <w:r>
+              <w:rPr>
+                <w:rFonts w:eastAsia="Consolas" w:cs="Consolas" w:ascii="Consolas" w:hAnsi="Consolas"/>
+                <w:b w:val="false"/>
+                <w:bCs w:val="false"/>
+                <w:sz w:val="18"/>
+                <w:szCs w:val="18"/>
+              </w:rPr>
+              <w:t>text</w:t>
+            </w:r>
+          </w:p>
+        </w:tc>
+        <w:tc>
+          <w:tcPr>
+            <w:tcW w:w="1251" w:type="dxa"/>
+            <w:tcBorders>
+              <w:top w:val="single" w:sz="4" w:space="0" w:color="B7B7B7"/>
+              <w:left w:val="single" w:sz="4" w:space="0" w:color="B7B7B7"/>
+              <w:bottom w:val="single" w:sz="4" w:space="0" w:color="B7B7B7"/>
+              <w:right w:val="single" w:sz="4" w:space="0" w:color="B7B7B7"/>
+            </w:tcBorders>
+          </w:tcPr>
+          <w:p>
+            <w:pPr>
+              <w:pStyle w:val="Normal"/>
+              <w:keepNext w:val="true"/>
+              <w:rPr/>
+            </w:pPr>
+            <w:r>
+              <w:rPr>
+                <w:b w:val="false"/>
+                <w:bCs w:val="false"/>
+                <w:sz w:val="20"/>
+                <w:szCs w:val="20"/>
+              </w:rPr>
+              <w:t>Static</w:t>
+            </w:r>
+          </w:p>
+        </w:tc>
+        <w:tc>
+          <w:tcPr>
+            <w:tcW w:w="4959" w:type="dxa"/>
+            <w:tcBorders>
+              <w:top w:val="single" w:sz="4" w:space="0" w:color="B7B7B7"/>
+              <w:left w:val="single" w:sz="4" w:space="0" w:color="B7B7B7"/>
+              <w:bottom w:val="single" w:sz="4" w:space="0" w:color="B7B7B7"/>
+              <w:right w:val="single" w:sz="4" w:space="0" w:color="B7B7B7"/>
+            </w:tcBorders>
+          </w:tcPr>
+          <w:p>
+            <w:pPr>
+              <w:pStyle w:val="Normal"/>
+              <w:keepNext w:val="true"/>
+              <w:rPr/>
+            </w:pPr>
+            <w:r>
+              <w:rPr>
+                <w:b w:val="false"/>
+                <w:bCs w:val="false"/>
+                <w:sz w:val="20"/>
+                <w:szCs w:val="20"/>
+              </w:rPr>
+              <w:t>URL of the episode in an asset management tool. Static: stored once per episode and shared by its rows.</w:t>
+            </w:r>
+          </w:p>
+        </w:tc>
+      </w:tr>
+      <w:tr>
+        <w:trPr>
+          <w:cantSplit w:val="true"/>
+        </w:trPr>
+        <w:tc>
+          <w:tcPr>
+            <w:tcW w:w="1900" w:type="dxa"/>
+            <w:tcBorders>
+              <w:top w:val="single" w:sz="4" w:space="0" w:color="B7B7B7"/>
+              <w:left w:val="single" w:sz="4" w:space="0" w:color="B7B7B7"/>
+              <w:bottom w:val="single" w:sz="4" w:space="0" w:color="B7B7B7"/>
+              <w:right w:val="single" w:sz="4" w:space="0" w:color="B7B7B7"/>
+            </w:tcBorders>
+          </w:tcPr>
+          <w:p>
+            <w:pPr>
+              <w:pStyle w:val="Normal"/>
+              <w:keepNext w:val="false"/>
+              <w:rPr/>
+            </w:pPr>
+            <w:r>
+              <w:rPr>
+                <w:rFonts w:eastAsia="Consolas" w:cs="Consolas" w:ascii="Consolas" w:hAnsi="Consolas"/>
+                <w:b w:val="false"/>
+                <w:bCs w:val="false"/>
+                <w:sz w:val="18"/>
+                <w:szCs w:val="18"/>
+              </w:rPr>
+              <w:t>description</w:t>
+            </w:r>
+          </w:p>
+        </w:tc>
+        <w:tc>
+          <w:tcPr>
+            <w:tcW w:w="1249" w:type="dxa"/>
+            <w:tcBorders>
+              <w:top w:val="single" w:sz="4" w:space="0" w:color="B7B7B7"/>
+              <w:left w:val="single" w:sz="4" w:space="0" w:color="B7B7B7"/>
+              <w:bottom w:val="single" w:sz="4" w:space="0" w:color="B7B7B7"/>
+              <w:right w:val="single" w:sz="4" w:space="0" w:color="B7B7B7"/>
+            </w:tcBorders>
+          </w:tcPr>
+          <w:p>
+            <w:pPr>
+              <w:pStyle w:val="Normal"/>
+              <w:keepNext w:val="false"/>
+              <w:rPr/>
+            </w:pPr>
+            <w:r>
+              <w:rPr>
+                <w:rFonts w:eastAsia="Consolas" w:cs="Consolas" w:ascii="Consolas" w:hAnsi="Consolas"/>
+                <w:b w:val="false"/>
+                <w:bCs w:val="false"/>
+                <w:sz w:val="18"/>
+                <w:szCs w:val="18"/>
+              </w:rPr>
+              <w:t>text</w:t>
+            </w:r>
+          </w:p>
+        </w:tc>
+        <w:tc>
+          <w:tcPr>
+            <w:tcW w:w="1251" w:type="dxa"/>
+            <w:tcBorders>
+              <w:top w:val="single" w:sz="4" w:space="0" w:color="B7B7B7"/>
+              <w:left w:val="single" w:sz="4" w:space="0" w:color="B7B7B7"/>
+              <w:bottom w:val="single" w:sz="4" w:space="0" w:color="B7B7B7"/>
+              <w:right w:val="single" w:sz="4" w:space="0" w:color="B7B7B7"/>
+            </w:tcBorders>
+          </w:tcPr>
+          <w:p>
+            <w:pPr>
+              <w:pStyle w:val="Normal"/>
+              <w:keepNext w:val="false"/>
+              <w:rPr/>
+            </w:pPr>
+            <w:r>
+              <w:rPr/>
+            </w:r>
+          </w:p>
+        </w:tc>
+        <w:tc>
+          <w:tcPr>
+            <w:tcW w:w="4959" w:type="dxa"/>
+            <w:tcBorders>
+              <w:top w:val="single" w:sz="4" w:space="0" w:color="B7B7B7"/>
+              <w:left w:val="single" w:sz="4" w:space="0" w:color="B7B7B7"/>
+              <w:bottom w:val="single" w:sz="4" w:space="0" w:color="B7B7B7"/>
+              <w:right w:val="single" w:sz="4" w:space="0" w:color="B7B7B7"/>
+            </w:tcBorders>
+          </w:tcPr>
+          <w:p>
+            <w:pPr>
+              <w:pStyle w:val="Normal"/>
+              <w:keepNext w:val="false"/>
+              <w:rPr/>
+            </w:pPr>
+            <w:r>
+              <w:rPr>
+                <w:b w:val="false"/>
+                <w:bCs w:val="false"/>
+                <w:sz w:val="20"/>
+                <w:szCs w:val="20"/>
+              </w:rPr>
+              <w:t>Description of the sequence.</w:t>
+            </w:r>
+          </w:p>
+        </w:tc>
+      </w:tr>
+    </w:tbl>
+    <w:p>
+      <w:pPr>
+        <w:pStyle w:val="Normal"/>
+        <w:spacing w:before="0" w:after="200"/>
+        <w:rPr/>
+      </w:pPr>
+      <w:r>
+        <w:rPr/>
+      </w:r>
+    </w:p>
+    <w:p>
+      <w:pPr>
+        <w:pStyle w:val="Heading3"/>
+        <w:keepNext w:val="true"/>
+        <w:rPr/>
+      </w:pPr>
+      <w:bookmarkStart w:id="14" w:name="__RefHeading___Toc6301_4212114258"/>
+      <w:bookmarkEnd w:id="14"/>
       <w:r>
         <w:rPr/>
         <w:t>sequence</w:t>
@@ -4723,6 +5567,121 @@
           <w:p>
             <w:pPr>
               <w:pStyle w:val="Normal"/>
+              <w:keepNext w:val="true"/>
+              <w:rPr/>
+            </w:pPr>
+            <w:r>
+              <w:rPr>
+                <w:rFonts w:eastAsia="Consolas" w:cs="Consolas" w:ascii="Consolas" w:hAnsi="Consolas"/>
+                <w:b w:val="false"/>
+                <w:bCs w:val="false"/>
+                <w:sz w:val="18"/>
+                <w:szCs w:val="18"/>
+              </w:rPr>
+              <w:t>sequence_url</w:t>
+            </w:r>
+          </w:p>
+        </w:tc>
+        <w:tc>
+          <w:tcPr>
+            <w:tcW w:w="1249" w:type="dxa"/>
+            <w:tcBorders>
+              <w:top w:val="single" w:sz="4" w:space="0" w:color="B7B7B7"/>
+              <w:left w:val="single" w:sz="4" w:space="0" w:color="B7B7B7"/>
+              <w:bottom w:val="single" w:sz="4" w:space="0" w:color="B7B7B7"/>
+              <w:right w:val="single" w:sz="4" w:space="0" w:color="B7B7B7"/>
+            </w:tcBorders>
+          </w:tcPr>
+          <w:p>
+            <w:pPr>
+              <w:pStyle w:val="Normal"/>
+              <w:keepNext w:val="true"/>
+              <w:rPr/>
+            </w:pPr>
+            <w:r>
+              <w:rPr>
+                <w:rFonts w:eastAsia="Consolas" w:cs="Consolas" w:ascii="Consolas" w:hAnsi="Consolas"/>
+                <w:b w:val="false"/>
+                <w:bCs w:val="false"/>
+                <w:sz w:val="18"/>
+                <w:szCs w:val="18"/>
+              </w:rPr>
+              <w:t>text</w:t>
+            </w:r>
+          </w:p>
+        </w:tc>
+        <w:tc>
+          <w:tcPr>
+            <w:tcW w:w="1251" w:type="dxa"/>
+            <w:tcBorders>
+              <w:top w:val="single" w:sz="4" w:space="0" w:color="B7B7B7"/>
+              <w:left w:val="single" w:sz="4" w:space="0" w:color="B7B7B7"/>
+              <w:bottom w:val="single" w:sz="4" w:space="0" w:color="B7B7B7"/>
+              <w:right w:val="single" w:sz="4" w:space="0" w:color="B7B7B7"/>
+            </w:tcBorders>
+          </w:tcPr>
+          <w:p>
+            <w:pPr>
+              <w:pStyle w:val="Normal"/>
+              <w:keepNext w:val="true"/>
+              <w:rPr/>
+            </w:pPr>
+            <w:r>
+              <w:rPr>
+                <w:b w:val="false"/>
+                <w:bCs w:val="false"/>
+                <w:sz w:val="20"/>
+                <w:szCs w:val="20"/>
+              </w:rPr>
+              <w:t>Static</w:t>
+            </w:r>
+          </w:p>
+        </w:tc>
+        <w:tc>
+          <w:tcPr>
+            <w:tcW w:w="4959" w:type="dxa"/>
+            <w:tcBorders>
+              <w:top w:val="single" w:sz="4" w:space="0" w:color="B7B7B7"/>
+              <w:left w:val="single" w:sz="4" w:space="0" w:color="B7B7B7"/>
+              <w:bottom w:val="single" w:sz="4" w:space="0" w:color="B7B7B7"/>
+              <w:right w:val="single" w:sz="4" w:space="0" w:color="B7B7B7"/>
+            </w:tcBorders>
+          </w:tcPr>
+          <w:p>
+            <w:pPr>
+              <w:pStyle w:val="Normal"/>
+              <w:keepNext w:val="true"/>
+              <w:rPr/>
+            </w:pPr>
+            <w:r>
+              <w:rPr>
+                <w:b w:val="false"/>
+                <w:bCs w:val="false"/>
+                <w:sz w:val="20"/>
+                <w:szCs w:val="20"/>
+              </w:rPr>
+              <w:t>URL of the sequence in an asset management tool. Static: stored once per sequence and shared by its rows.</w:t>
+            </w:r>
+          </w:p>
+        </w:tc>
+      </w:tr>
+      <w:tr>
+        <w:trPr>
+          <w:cantSplit w:val="true"/>
+        </w:trPr>
+        <w:tc>
+          <w:tcPr>
+            <w:tcW w:w="1900" w:type="dxa"/>
+            <w:tcBorders>
+              <w:top w:val="single" w:sz="4" w:space="0" w:color="B7B7B7"/>
+              <w:left w:val="single" w:sz="4" w:space="0" w:color="B7B7B7"/>
+              <w:bottom w:val="single" w:sz="4" w:space="0" w:color="B7B7B7"/>
+              <w:right w:val="single" w:sz="4" w:space="0" w:color="B7B7B7"/>
+            </w:tcBorders>
+          </w:tcPr>
+          <w:p>
+            <w:pPr>
+              <w:pStyle w:val="Normal"/>
               <w:keepNext w:val="false"/>
               <w:rPr/>
             </w:pPr>
@@ -4832,8 +5791,8 @@
         <w:keepNext w:val="true"/>
         <w:rPr/>
       </w:pPr>
-      <w:bookmarkStart w:id="14" w:name="__RefHeading___Toc2826_1002645125"/>
-      <w:bookmarkEnd w:id="14"/>
+      <w:bookmarkStart w:id="15" w:name="__RefHeading___Toc6303_4212114258"/>
+      <w:bookmarkEnd w:id="15"/>
       <w:r>
         <w:rPr/>
         <w:t>scene</w:t>
@@ -4848,7 +5807,7 @@
       </w:pPr>
       <w:r>
         <w:rPr/>
-        <w:t>A scene is one or more shots. The table has one row per shot, partitioned by project, sequence and scene, so one query returns all shots of a scene.</w:t>
+        <w:t>A scene is one or more shots. The table has one row per shot, partitioned by project, episode, sequence and scene, so one query returns all shots of a scene.</w:t>
       </w:r>
     </w:p>
     <w:p>
@@ -4864,7 +5823,7 @@
           <w:iCs/>
           <w:color w:val="444444"/>
         </w:rPr>
-        <w:t>Primary key: partition (project_id, sequence_id, scene_id), clustering (shot_id).</w:t>
+        <w:t>Primary key: partition (project_id, episode_id, sequence_id, scene_id), clustering (shot_id).</w:t>
       </w:r>
     </w:p>
     <w:tbl>
@@ -5152,7 +6111,7 @@
                 <w:sz w:val="18"/>
                 <w:szCs w:val="18"/>
               </w:rPr>
-              <w:t>sequence_id</w:t>
+              <w:t>episode_id</w:t>
             </w:r>
           </w:p>
         </w:tc>
@@ -5234,7 +6193,7 @@
                 <w:sz w:val="20"/>
                 <w:szCs w:val="20"/>
               </w:rPr>
-              <w:t>Identifier of the sequence the row belongs to.</w:t>
+              <w:t>Identifier of the episode the row belongs to.</w:t>
             </w:r>
           </w:p>
         </w:tc>
@@ -5268,7 +6227,7 @@
                 <w:sz w:val="18"/>
                 <w:szCs w:val="18"/>
               </w:rPr>
-              <w:t>scene_id</w:t>
+              <w:t>sequence_id</w:t>
             </w:r>
           </w:p>
         </w:tc>
@@ -5350,7 +6309,7 @@
                 <w:sz w:val="20"/>
                 <w:szCs w:val="20"/>
               </w:rPr>
-              <w:t>Identifier of the scene the row belongs to.</w:t>
+              <w:t>Identifier of the sequence the row belongs to.</w:t>
             </w:r>
           </w:p>
         </w:tc>
@@ -5384,6 +6343,122 @@
                 <w:sz w:val="18"/>
                 <w:szCs w:val="18"/>
               </w:rPr>
+              <w:t>scene_id</w:t>
+            </w:r>
+          </w:p>
+        </w:tc>
+        <w:tc>
+          <w:tcPr>
+            <w:tcW w:w="1249" w:type="dxa"/>
+            <w:tcBorders>
+              <w:top w:val="single" w:sz="4" w:space="0" w:color="B7B7B7"/>
+              <w:left w:val="single" w:sz="4" w:space="0" w:color="B7B7B7"/>
+              <w:bottom w:val="single" w:sz="4" w:space="0" w:color="B7B7B7"/>
+              <w:right w:val="single" w:sz="4" w:space="0" w:color="B7B7B7"/>
+            </w:tcBorders>
+          </w:tcPr>
+          <w:p>
+            <w:pPr>
+              <w:pStyle w:val="Normal"/>
+              <w:keepNext w:val="true"/>
+              <w:rPr/>
+            </w:pPr>
+            <w:r>
+              <w:rPr>
+                <w:rFonts w:eastAsia="Consolas" w:cs="Consolas" w:ascii="Consolas" w:hAnsi="Consolas"/>
+                <w:b w:val="false"/>
+                <w:bCs w:val="false"/>
+                <w:sz w:val="18"/>
+                <w:szCs w:val="18"/>
+              </w:rPr>
+              <w:t>text</w:t>
+            </w:r>
+          </w:p>
+        </w:tc>
+        <w:tc>
+          <w:tcPr>
+            <w:tcW w:w="1251" w:type="dxa"/>
+            <w:tcBorders>
+              <w:top w:val="single" w:sz="4" w:space="0" w:color="B7B7B7"/>
+              <w:left w:val="single" w:sz="4" w:space="0" w:color="B7B7B7"/>
+              <w:bottom w:val="single" w:sz="4" w:space="0" w:color="B7B7B7"/>
+              <w:right w:val="single" w:sz="4" w:space="0" w:color="B7B7B7"/>
+            </w:tcBorders>
+          </w:tcPr>
+          <w:p>
+            <w:pPr>
+              <w:pStyle w:val="Normal"/>
+              <w:keepNext w:val="true"/>
+              <w:rPr/>
+            </w:pPr>
+            <w:r>
+              <w:rPr>
+                <w:b w:val="false"/>
+                <w:bCs w:val="false"/>
+                <w:sz w:val="20"/>
+                <w:szCs w:val="20"/>
+              </w:rPr>
+              <w:t>Partition</w:t>
+            </w:r>
+          </w:p>
+        </w:tc>
+        <w:tc>
+          <w:tcPr>
+            <w:tcW w:w="4959" w:type="dxa"/>
+            <w:tcBorders>
+              <w:top w:val="single" w:sz="4" w:space="0" w:color="B7B7B7"/>
+              <w:left w:val="single" w:sz="4" w:space="0" w:color="B7B7B7"/>
+              <w:bottom w:val="single" w:sz="4" w:space="0" w:color="B7B7B7"/>
+              <w:right w:val="single" w:sz="4" w:space="0" w:color="B7B7B7"/>
+            </w:tcBorders>
+          </w:tcPr>
+          <w:p>
+            <w:pPr>
+              <w:pStyle w:val="Normal"/>
+              <w:keepNext w:val="true"/>
+              <w:rPr/>
+            </w:pPr>
+            <w:r>
+              <w:rPr>
+                <w:b w:val="false"/>
+                <w:bCs w:val="false"/>
+                <w:sz w:val="20"/>
+                <w:szCs w:val="20"/>
+              </w:rPr>
+              <w:t>Identifier of the scene the row belongs to.</w:t>
+            </w:r>
+          </w:p>
+        </w:tc>
+      </w:tr>
+      <w:tr>
+        <w:trPr>
+          <w:cantSplit w:val="true"/>
+        </w:trPr>
+        <w:tc>
+          <w:tcPr>
+            <w:tcW w:w="1900" w:type="dxa"/>
+            <w:tcBorders>
+              <w:top w:val="single" w:sz="4" w:space="0" w:color="B7B7B7"/>
+              <w:left w:val="single" w:sz="4" w:space="0" w:color="B7B7B7"/>
+              <w:bottom w:val="single" w:sz="4" w:space="0" w:color="B7B7B7"/>
+              <w:right w:val="single" w:sz="4" w:space="0" w:color="B7B7B7"/>
+            </w:tcBorders>
+            <w:shd w:color="auto" w:fill="EEF3FA" w:val="clear"/>
+          </w:tcPr>
+          <w:p>
+            <w:pPr>
+              <w:pStyle w:val="Normal"/>
+              <w:keepNext w:val="true"/>
+              <w:rPr/>
+            </w:pPr>
+            <w:r>
+              <w:rPr>
+                <w:rFonts w:eastAsia="Consolas" w:cs="Consolas" w:ascii="Consolas" w:hAnsi="Consolas"/>
+                <w:b w:val="false"/>
+                <w:bCs w:val="false"/>
+                <w:sz w:val="18"/>
+                <w:szCs w:val="18"/>
+              </w:rPr>
               <w:t>shot_id</w:t>
             </w:r>
           </w:p>
@@ -5467,6 +6542,121 @@
                 <w:szCs w:val="20"/>
               </w:rPr>
               <w:t>Identifier of a shot in the scene. The table holds one row per shot.</w:t>
+            </w:r>
+          </w:p>
+        </w:tc>
+      </w:tr>
+      <w:tr>
+        <w:trPr>
+          <w:cantSplit w:val="true"/>
+        </w:trPr>
+        <w:tc>
+          <w:tcPr>
+            <w:tcW w:w="1900" w:type="dxa"/>
+            <w:tcBorders>
+              <w:top w:val="single" w:sz="4" w:space="0" w:color="B7B7B7"/>
+              <w:left w:val="single" w:sz="4" w:space="0" w:color="B7B7B7"/>
+              <w:bottom w:val="single" w:sz="4" w:space="0" w:color="B7B7B7"/>
+              <w:right w:val="single" w:sz="4" w:space="0" w:color="B7B7B7"/>
+            </w:tcBorders>
+          </w:tcPr>
+          <w:p>
+            <w:pPr>
+              <w:pStyle w:val="Normal"/>
+              <w:keepNext w:val="true"/>
+              <w:rPr/>
+            </w:pPr>
+            <w:r>
+              <w:rPr>
+                <w:rFonts w:eastAsia="Consolas" w:cs="Consolas" w:ascii="Consolas" w:hAnsi="Consolas"/>
+                <w:b w:val="false"/>
+                <w:bCs w:val="false"/>
+                <w:sz w:val="18"/>
+                <w:szCs w:val="18"/>
+              </w:rPr>
+              <w:t>scene_url</w:t>
+            </w:r>
+          </w:p>
+        </w:tc>
+        <w:tc>
+          <w:tcPr>
+            <w:tcW w:w="1249" w:type="dxa"/>
+            <w:tcBorders>
+              <w:top w:val="single" w:sz="4" w:space="0" w:color="B7B7B7"/>
+              <w:left w:val="single" w:sz="4" w:space="0" w:color="B7B7B7"/>
+              <w:bottom w:val="single" w:sz="4" w:space="0" w:color="B7B7B7"/>
+              <w:right w:val="single" w:sz="4" w:space="0" w:color="B7B7B7"/>
+            </w:tcBorders>
+          </w:tcPr>
+          <w:p>
+            <w:pPr>
+              <w:pStyle w:val="Normal"/>
+              <w:keepNext w:val="true"/>
+              <w:rPr/>
+            </w:pPr>
+            <w:r>
+              <w:rPr>
+                <w:rFonts w:eastAsia="Consolas" w:cs="Consolas" w:ascii="Consolas" w:hAnsi="Consolas"/>
+                <w:b w:val="false"/>
+                <w:bCs w:val="false"/>
+                <w:sz w:val="18"/>
+                <w:szCs w:val="18"/>
+              </w:rPr>
+              <w:t>text</w:t>
+            </w:r>
+          </w:p>
+        </w:tc>
+        <w:tc>
+          <w:tcPr>
+            <w:tcW w:w="1251" w:type="dxa"/>
+            <w:tcBorders>
+              <w:top w:val="single" w:sz="4" w:space="0" w:color="B7B7B7"/>
+              <w:left w:val="single" w:sz="4" w:space="0" w:color="B7B7B7"/>
+              <w:bottom w:val="single" w:sz="4" w:space="0" w:color="B7B7B7"/>
+              <w:right w:val="single" w:sz="4" w:space="0" w:color="B7B7B7"/>
+            </w:tcBorders>
+          </w:tcPr>
+          <w:p>
+            <w:pPr>
+              <w:pStyle w:val="Normal"/>
+              <w:keepNext w:val="true"/>
+              <w:rPr/>
+            </w:pPr>
+            <w:r>
+              <w:rPr>
+                <w:b w:val="false"/>
+                <w:bCs w:val="false"/>
+                <w:sz w:val="20"/>
+                <w:szCs w:val="20"/>
+              </w:rPr>
+              <w:t>Static</w:t>
+            </w:r>
+          </w:p>
+        </w:tc>
+        <w:tc>
+          <w:tcPr>
+            <w:tcW w:w="4959" w:type="dxa"/>
+            <w:tcBorders>
+              <w:top w:val="single" w:sz="4" w:space="0" w:color="B7B7B7"/>
+              <w:left w:val="single" w:sz="4" w:space="0" w:color="B7B7B7"/>
+              <w:bottom w:val="single" w:sz="4" w:space="0" w:color="B7B7B7"/>
+              <w:right w:val="single" w:sz="4" w:space="0" w:color="B7B7B7"/>
+            </w:tcBorders>
+          </w:tcPr>
+          <w:p>
+            <w:pPr>
+              <w:pStyle w:val="Normal"/>
+              <w:keepNext w:val="true"/>
+              <w:rPr/>
+            </w:pPr>
+            <w:r>
+              <w:rPr>
+                <w:b w:val="false"/>
+                <w:bCs w:val="false"/>
+                <w:sz w:val="20"/>
+                <w:szCs w:val="20"/>
+              </w:rPr>
+              <w:t>URL of the scene in an asset management tool. Static: stored once per scene and shared by its rows.</w:t>
             </w:r>
           </w:p>
         </w:tc>
@@ -5597,8 +6787,8 @@
         <w:keepNext w:val="true"/>
         <w:rPr/>
       </w:pPr>
-      <w:bookmarkStart w:id="15" w:name="__RefHeading___Toc2828_1002645125"/>
-      <w:bookmarkEnd w:id="15"/>
+      <w:bookmarkStart w:id="16" w:name="__RefHeading___Toc6305_4212114258"/>
+      <w:bookmarkEnd w:id="16"/>
       <w:r>
         <w:rPr/>
         <w:t>shot</w:t>
@@ -5629,7 +6819,7 @@
           <w:iCs/>
           <w:color w:val="444444"/>
         </w:rPr>
-        <w:t>Primary key: partition (project_id, sequence_id, scene_id, shot_id).</w:t>
+        <w:t>Primary key: partition (project_id, episode_id, sequence_id, scene_id, shot_id).</w:t>
       </w:r>
     </w:p>
     <w:tbl>
@@ -5917,7 +7107,7 @@
                 <w:sz w:val="18"/>
                 <w:szCs w:val="18"/>
               </w:rPr>
-              <w:t>sequence_id</w:t>
+              <w:t>episode_id</w:t>
             </w:r>
           </w:p>
         </w:tc>
@@ -5999,7 +7189,7 @@
                 <w:sz w:val="20"/>
                 <w:szCs w:val="20"/>
               </w:rPr>
-              <w:t>Identifier of the sequence the row belongs to.</w:t>
+              <w:t>Identifier of the episode the row belongs to.</w:t>
             </w:r>
           </w:p>
         </w:tc>
@@ -6033,7 +7223,7 @@
                 <w:sz w:val="18"/>
                 <w:szCs w:val="18"/>
               </w:rPr>
-              <w:t>scene_id</w:t>
+              <w:t>sequence_id</w:t>
             </w:r>
           </w:p>
         </w:tc>
@@ -6115,7 +7305,7 @@
                 <w:sz w:val="20"/>
                 <w:szCs w:val="20"/>
               </w:rPr>
-              <w:t>Identifier of the scene the row belongs to.</w:t>
+              <w:t>Identifier of the sequence the row belongs to.</w:t>
             </w:r>
           </w:p>
         </w:tc>
@@ -6149,6 +7339,122 @@
                 <w:sz w:val="18"/>
                 <w:szCs w:val="18"/>
               </w:rPr>
+              <w:t>scene_id</w:t>
+            </w:r>
+          </w:p>
+        </w:tc>
+        <w:tc>
+          <w:tcPr>
+            <w:tcW w:w="1249" w:type="dxa"/>
+            <w:tcBorders>
+              <w:top w:val="single" w:sz="4" w:space="0" w:color="B7B7B7"/>
+              <w:left w:val="single" w:sz="4" w:space="0" w:color="B7B7B7"/>
+              <w:bottom w:val="single" w:sz="4" w:space="0" w:color="B7B7B7"/>
+              <w:right w:val="single" w:sz="4" w:space="0" w:color="B7B7B7"/>
+            </w:tcBorders>
+          </w:tcPr>
+          <w:p>
+            <w:pPr>
+              <w:pStyle w:val="Normal"/>
+              <w:keepNext w:val="true"/>
+              <w:rPr/>
+            </w:pPr>
+            <w:r>
+              <w:rPr>
+                <w:rFonts w:eastAsia="Consolas" w:cs="Consolas" w:ascii="Consolas" w:hAnsi="Consolas"/>
+                <w:b w:val="false"/>
+                <w:bCs w:val="false"/>
+                <w:sz w:val="18"/>
+                <w:szCs w:val="18"/>
+              </w:rPr>
+              <w:t>text</w:t>
+            </w:r>
+          </w:p>
+        </w:tc>
+        <w:tc>
+          <w:tcPr>
+            <w:tcW w:w="1251" w:type="dxa"/>
+            <w:tcBorders>
+              <w:top w:val="single" w:sz="4" w:space="0" w:color="B7B7B7"/>
+              <w:left w:val="single" w:sz="4" w:space="0" w:color="B7B7B7"/>
+              <w:bottom w:val="single" w:sz="4" w:space="0" w:color="B7B7B7"/>
+              <w:right w:val="single" w:sz="4" w:space="0" w:color="B7B7B7"/>
+            </w:tcBorders>
+          </w:tcPr>
+          <w:p>
+            <w:pPr>
+              <w:pStyle w:val="Normal"/>
+              <w:keepNext w:val="true"/>
+              <w:rPr/>
+            </w:pPr>
+            <w:r>
+              <w:rPr>
+                <w:b w:val="false"/>
+                <w:bCs w:val="false"/>
+                <w:sz w:val="20"/>
+                <w:szCs w:val="20"/>
+              </w:rPr>
+              <w:t>Partition</w:t>
+            </w:r>
+          </w:p>
+        </w:tc>
+        <w:tc>
+          <w:tcPr>
+            <w:tcW w:w="4959" w:type="dxa"/>
+            <w:tcBorders>
+              <w:top w:val="single" w:sz="4" w:space="0" w:color="B7B7B7"/>
+              <w:left w:val="single" w:sz="4" w:space="0" w:color="B7B7B7"/>
+              <w:bottom w:val="single" w:sz="4" w:space="0" w:color="B7B7B7"/>
+              <w:right w:val="single" w:sz="4" w:space="0" w:color="B7B7B7"/>
+            </w:tcBorders>
+          </w:tcPr>
+          <w:p>
+            <w:pPr>
+              <w:pStyle w:val="Normal"/>
+              <w:keepNext w:val="true"/>
+              <w:rPr/>
+            </w:pPr>
+            <w:r>
+              <w:rPr>
+                <w:b w:val="false"/>
+                <w:bCs w:val="false"/>
+                <w:sz w:val="20"/>
+                <w:szCs w:val="20"/>
+              </w:rPr>
+              <w:t>Identifier of the scene the row belongs to.</w:t>
+            </w:r>
+          </w:p>
+        </w:tc>
+      </w:tr>
+      <w:tr>
+        <w:trPr>
+          <w:cantSplit w:val="true"/>
+        </w:trPr>
+        <w:tc>
+          <w:tcPr>
+            <w:tcW w:w="1900" w:type="dxa"/>
+            <w:tcBorders>
+              <w:top w:val="single" w:sz="4" w:space="0" w:color="B7B7B7"/>
+              <w:left w:val="single" w:sz="4" w:space="0" w:color="B7B7B7"/>
+              <w:bottom w:val="single" w:sz="4" w:space="0" w:color="B7B7B7"/>
+              <w:right w:val="single" w:sz="4" w:space="0" w:color="B7B7B7"/>
+            </w:tcBorders>
+            <w:shd w:color="auto" w:fill="EEF3FA" w:val="clear"/>
+          </w:tcPr>
+          <w:p>
+            <w:pPr>
+              <w:pStyle w:val="Normal"/>
+              <w:keepNext w:val="true"/>
+              <w:rPr/>
+            </w:pPr>
+            <w:r>
+              <w:rPr>
+                <w:rFonts w:eastAsia="Consolas" w:cs="Consolas" w:ascii="Consolas" w:hAnsi="Consolas"/>
+                <w:b w:val="false"/>
+                <w:bCs w:val="false"/>
+                <w:sz w:val="18"/>
+                <w:szCs w:val="18"/>
+              </w:rPr>
               <w:t>shot_id</w:t>
             </w:r>
           </w:p>
@@ -6232,6 +7538,115 @@
                 <w:szCs w:val="20"/>
               </w:rPr>
               <w:t>Identifier of the shot. The table holds one row per shot.</w:t>
+            </w:r>
+          </w:p>
+        </w:tc>
+      </w:tr>
+      <w:tr>
+        <w:trPr>
+          <w:cantSplit w:val="true"/>
+        </w:trPr>
+        <w:tc>
+          <w:tcPr>
+            <w:tcW w:w="1900" w:type="dxa"/>
+            <w:tcBorders>
+              <w:top w:val="single" w:sz="4" w:space="0" w:color="B7B7B7"/>
+              <w:left w:val="single" w:sz="4" w:space="0" w:color="B7B7B7"/>
+              <w:bottom w:val="single" w:sz="4" w:space="0" w:color="B7B7B7"/>
+              <w:right w:val="single" w:sz="4" w:space="0" w:color="B7B7B7"/>
+            </w:tcBorders>
+          </w:tcPr>
+          <w:p>
+            <w:pPr>
+              <w:pStyle w:val="Normal"/>
+              <w:keepNext w:val="true"/>
+              <w:rPr/>
+            </w:pPr>
+            <w:r>
+              <w:rPr>
+                <w:rFonts w:eastAsia="Consolas" w:cs="Consolas" w:ascii="Consolas" w:hAnsi="Consolas"/>
+                <w:b w:val="false"/>
+                <w:bCs w:val="false"/>
+                <w:sz w:val="18"/>
+                <w:szCs w:val="18"/>
+              </w:rPr>
+              <w:t>shot_url</w:t>
+            </w:r>
+          </w:p>
+        </w:tc>
+        <w:tc>
+          <w:tcPr>
+            <w:tcW w:w="1249" w:type="dxa"/>
+            <w:tcBorders>
+              <w:top w:val="single" w:sz="4" w:space="0" w:color="B7B7B7"/>
+              <w:left w:val="single" w:sz="4" w:space="0" w:color="B7B7B7"/>
+              <w:bottom w:val="single" w:sz="4" w:space="0" w:color="B7B7B7"/>
+              <w:right w:val="single" w:sz="4" w:space="0" w:color="B7B7B7"/>
+            </w:tcBorders>
+          </w:tcPr>
+          <w:p>
+            <w:pPr>
+              <w:pStyle w:val="Normal"/>
+              <w:keepNext w:val="true"/>
+              <w:rPr/>
+            </w:pPr>
+            <w:r>
+              <w:rPr>
+                <w:rFonts w:eastAsia="Consolas" w:cs="Consolas" w:ascii="Consolas" w:hAnsi="Consolas"/>
+                <w:b w:val="false"/>
+                <w:bCs w:val="false"/>
+                <w:sz w:val="18"/>
+                <w:szCs w:val="18"/>
+              </w:rPr>
+              <w:t>text</w:t>
+            </w:r>
+          </w:p>
+        </w:tc>
+        <w:tc>
+          <w:tcPr>
+            <w:tcW w:w="1251" w:type="dxa"/>
+            <w:tcBorders>
+              <w:top w:val="single" w:sz="4" w:space="0" w:color="B7B7B7"/>
+              <w:left w:val="single" w:sz="4" w:space="0" w:color="B7B7B7"/>
+              <w:bottom w:val="single" w:sz="4" w:space="0" w:color="B7B7B7"/>
+              <w:right w:val="single" w:sz="4" w:space="0" w:color="B7B7B7"/>
+            </w:tcBorders>
+          </w:tcPr>
+          <w:p>
+            <w:pPr>
+              <w:pStyle w:val="Normal"/>
+              <w:keepNext w:val="true"/>
+              <w:rPr/>
+            </w:pPr>
+            <w:r>
+              <w:rPr/>
+            </w:r>
+          </w:p>
+        </w:tc>
+        <w:tc>
+          <w:tcPr>
+            <w:tcW w:w="4959" w:type="dxa"/>
+            <w:tcBorders>
+              <w:top w:val="single" w:sz="4" w:space="0" w:color="B7B7B7"/>
+              <w:left w:val="single" w:sz="4" w:space="0" w:color="B7B7B7"/>
+              <w:bottom w:val="single" w:sz="4" w:space="0" w:color="B7B7B7"/>
+              <w:right w:val="single" w:sz="4" w:space="0" w:color="B7B7B7"/>
+            </w:tcBorders>
+          </w:tcPr>
+          <w:p>
+            <w:pPr>
+              <w:pStyle w:val="Normal"/>
+              <w:keepNext w:val="true"/>
+              <w:rPr/>
+            </w:pPr>
+            <w:r>
+              <w:rPr>
+                <w:b w:val="false"/>
+                <w:bCs w:val="false"/>
+                <w:sz w:val="20"/>
+                <w:szCs w:val="20"/>
+              </w:rPr>
+              <w:t>URL of the shot in an asset management tool.</w:t>
             </w:r>
           </w:p>
         </w:tc>
@@ -6689,8 +8104,8 @@
         <w:keepNext w:val="true"/>
         <w:rPr/>
       </w:pPr>
-      <w:bookmarkStart w:id="16" w:name="__RefHeading___Toc2830_1002645125"/>
-      <w:bookmarkEnd w:id="16"/>
+      <w:bookmarkStart w:id="17" w:name="__RefHeading___Toc6307_4212114258"/>
+      <w:bookmarkEnd w:id="17"/>
       <w:r>
         <w:rPr/>
         <w:t>frame</w:t>
@@ -6721,7 +8136,7 @@
           <w:iCs/>
           <w:color w:val="444444"/>
         </w:rPr>
-        <w:t>Primary key: partition (project_id, sequence_id, scene_id, shot_id), clustering (frame_number, layer_id).</w:t>
+        <w:t>Primary key: partition (project_id, episode_id, sequence_id, scene_id, shot_id), clustering (frame_number, layer_id).</w:t>
       </w:r>
     </w:p>
     <w:tbl>
@@ -7009,7 +8424,7 @@
                 <w:sz w:val="18"/>
                 <w:szCs w:val="18"/>
               </w:rPr>
-              <w:t>sequence_id</w:t>
+              <w:t>episode_id</w:t>
             </w:r>
           </w:p>
         </w:tc>
@@ -7091,7 +8506,7 @@
                 <w:sz w:val="20"/>
                 <w:szCs w:val="20"/>
               </w:rPr>
-              <w:t>Identifier of the sequence the row belongs to.</w:t>
+              <w:t>Identifier of the episode the row belongs to.</w:t>
             </w:r>
           </w:p>
         </w:tc>
@@ -7125,7 +8540,7 @@
                 <w:sz w:val="18"/>
                 <w:szCs w:val="18"/>
               </w:rPr>
-              <w:t>scene_id</w:t>
+              <w:t>sequence_id</w:t>
             </w:r>
           </w:p>
         </w:tc>
@@ -7207,7 +8622,7 @@
                 <w:sz w:val="20"/>
                 <w:szCs w:val="20"/>
               </w:rPr>
-              <w:t>Identifier of the scene the row belongs to.</w:t>
+              <w:t>Identifier of the sequence the row belongs to.</w:t>
             </w:r>
           </w:p>
         </w:tc>
@@ -7241,7 +8656,7 @@
                 <w:sz w:val="18"/>
                 <w:szCs w:val="18"/>
               </w:rPr>
-              <w:t>shot_id</w:t>
+              <w:t>scene_id</w:t>
             </w:r>
           </w:p>
         </w:tc>
@@ -7323,7 +8738,7 @@
                 <w:sz w:val="20"/>
                 <w:szCs w:val="20"/>
               </w:rPr>
-              <w:t>Identifier of the shot the row belongs to.</w:t>
+              <w:t>Identifier of the scene the row belongs to.</w:t>
             </w:r>
           </w:p>
         </w:tc>
@@ -7357,7 +8772,7 @@
                 <w:sz w:val="18"/>
                 <w:szCs w:val="18"/>
               </w:rPr>
-              <w:t>frame_number</w:t>
+              <w:t>shot_id</w:t>
             </w:r>
           </w:p>
         </w:tc>
@@ -7385,7 +8800,7 @@
                 <w:sz w:val="18"/>
                 <w:szCs w:val="18"/>
               </w:rPr>
-              <w:t>int</w:t>
+              <w:t>text</w:t>
             </w:r>
           </w:p>
         </w:tc>
@@ -7412,7 +8827,7 @@
                 <w:sz w:val="20"/>
                 <w:szCs w:val="20"/>
               </w:rPr>
-              <w:t>Clustering</w:t>
+              <w:t>Partition</w:t>
             </w:r>
           </w:p>
         </w:tc>
@@ -7439,7 +8854,7 @@
                 <w:sz w:val="20"/>
                 <w:szCs w:val="20"/>
               </w:rPr>
-              <w:t>Number of the frame within the shot.</w:t>
+              <w:t>Identifier of the shot the row belongs to.</w:t>
             </w:r>
           </w:p>
         </w:tc>
@@ -7473,6 +8888,122 @@
                 <w:sz w:val="18"/>
                 <w:szCs w:val="18"/>
               </w:rPr>
+              <w:t>frame_number</w:t>
+            </w:r>
+          </w:p>
+        </w:tc>
+        <w:tc>
+          <w:tcPr>
+            <w:tcW w:w="1249" w:type="dxa"/>
+            <w:tcBorders>
+              <w:top w:val="single" w:sz="4" w:space="0" w:color="B7B7B7"/>
+              <w:left w:val="single" w:sz="4" w:space="0" w:color="B7B7B7"/>
+              <w:bottom w:val="single" w:sz="4" w:space="0" w:color="B7B7B7"/>
+              <w:right w:val="single" w:sz="4" w:space="0" w:color="B7B7B7"/>
+            </w:tcBorders>
+          </w:tcPr>
+          <w:p>
+            <w:pPr>
+              <w:pStyle w:val="Normal"/>
+              <w:keepNext w:val="true"/>
+              <w:rPr/>
+            </w:pPr>
+            <w:r>
+              <w:rPr>
+                <w:rFonts w:eastAsia="Consolas" w:cs="Consolas" w:ascii="Consolas" w:hAnsi="Consolas"/>
+                <w:b w:val="false"/>
+                <w:bCs w:val="false"/>
+                <w:sz w:val="18"/>
+                <w:szCs w:val="18"/>
+              </w:rPr>
+              <w:t>int</w:t>
+            </w:r>
+          </w:p>
+        </w:tc>
+        <w:tc>
+          <w:tcPr>
+            <w:tcW w:w="1251" w:type="dxa"/>
+            <w:tcBorders>
+              <w:top w:val="single" w:sz="4" w:space="0" w:color="B7B7B7"/>
+              <w:left w:val="single" w:sz="4" w:space="0" w:color="B7B7B7"/>
+              <w:bottom w:val="single" w:sz="4" w:space="0" w:color="B7B7B7"/>
+              <w:right w:val="single" w:sz="4" w:space="0" w:color="B7B7B7"/>
+            </w:tcBorders>
+          </w:tcPr>
+          <w:p>
+            <w:pPr>
+              <w:pStyle w:val="Normal"/>
+              <w:keepNext w:val="true"/>
+              <w:rPr/>
+            </w:pPr>
+            <w:r>
+              <w:rPr>
+                <w:b w:val="false"/>
+                <w:bCs w:val="false"/>
+                <w:sz w:val="20"/>
+                <w:szCs w:val="20"/>
+              </w:rPr>
+              <w:t>Clustering</w:t>
+            </w:r>
+          </w:p>
+        </w:tc>
+        <w:tc>
+          <w:tcPr>
+            <w:tcW w:w="4959" w:type="dxa"/>
+            <w:tcBorders>
+              <w:top w:val="single" w:sz="4" w:space="0" w:color="B7B7B7"/>
+              <w:left w:val="single" w:sz="4" w:space="0" w:color="B7B7B7"/>
+              <w:bottom w:val="single" w:sz="4" w:space="0" w:color="B7B7B7"/>
+              <w:right w:val="single" w:sz="4" w:space="0" w:color="B7B7B7"/>
+            </w:tcBorders>
+          </w:tcPr>
+          <w:p>
+            <w:pPr>
+              <w:pStyle w:val="Normal"/>
+              <w:keepNext w:val="true"/>
+              <w:rPr/>
+            </w:pPr>
+            <w:r>
+              <w:rPr>
+                <w:b w:val="false"/>
+                <w:bCs w:val="false"/>
+                <w:sz w:val="20"/>
+                <w:szCs w:val="20"/>
+              </w:rPr>
+              <w:t>Number of the frame within the shot.</w:t>
+            </w:r>
+          </w:p>
+        </w:tc>
+      </w:tr>
+      <w:tr>
+        <w:trPr>
+          <w:cantSplit w:val="true"/>
+        </w:trPr>
+        <w:tc>
+          <w:tcPr>
+            <w:tcW w:w="1900" w:type="dxa"/>
+            <w:tcBorders>
+              <w:top w:val="single" w:sz="4" w:space="0" w:color="B7B7B7"/>
+              <w:left w:val="single" w:sz="4" w:space="0" w:color="B7B7B7"/>
+              <w:bottom w:val="single" w:sz="4" w:space="0" w:color="B7B7B7"/>
+              <w:right w:val="single" w:sz="4" w:space="0" w:color="B7B7B7"/>
+            </w:tcBorders>
+            <w:shd w:color="auto" w:fill="EEF3FA" w:val="clear"/>
+          </w:tcPr>
+          <w:p>
+            <w:pPr>
+              <w:pStyle w:val="Normal"/>
+              <w:keepNext w:val="true"/>
+              <w:rPr/>
+            </w:pPr>
+            <w:r>
+              <w:rPr>
+                <w:rFonts w:eastAsia="Consolas" w:cs="Consolas" w:ascii="Consolas" w:hAnsi="Consolas"/>
+                <w:b w:val="false"/>
+                <w:bCs w:val="false"/>
+                <w:sz w:val="18"/>
+                <w:szCs w:val="18"/>
+              </w:rPr>
               <w:t>layer_id</w:t>
             </w:r>
           </w:p>
@@ -7556,6 +9087,115 @@
                 <w:szCs w:val="20"/>
               </w:rPr>
               <w:t>Layer the row belongs to (layer.layer_id). A frame has one row per layer.</w:t>
+            </w:r>
+          </w:p>
+        </w:tc>
+      </w:tr>
+      <w:tr>
+        <w:trPr>
+          <w:cantSplit w:val="true"/>
+        </w:trPr>
+        <w:tc>
+          <w:tcPr>
+            <w:tcW w:w="1900" w:type="dxa"/>
+            <w:tcBorders>
+              <w:top w:val="single" w:sz="4" w:space="0" w:color="B7B7B7"/>
+              <w:left w:val="single" w:sz="4" w:space="0" w:color="B7B7B7"/>
+              <w:bottom w:val="single" w:sz="4" w:space="0" w:color="B7B7B7"/>
+              <w:right w:val="single" w:sz="4" w:space="0" w:color="B7B7B7"/>
+            </w:tcBorders>
+          </w:tcPr>
+          <w:p>
+            <w:pPr>
+              <w:pStyle w:val="Normal"/>
+              <w:keepNext w:val="true"/>
+              <w:rPr/>
+            </w:pPr>
+            <w:r>
+              <w:rPr>
+                <w:rFonts w:eastAsia="Consolas" w:cs="Consolas" w:ascii="Consolas" w:hAnsi="Consolas"/>
+                <w:b w:val="false"/>
+                <w:bCs w:val="false"/>
+                <w:sz w:val="18"/>
+                <w:szCs w:val="18"/>
+              </w:rPr>
+              <w:t>frame_url</w:t>
+            </w:r>
+          </w:p>
+        </w:tc>
+        <w:tc>
+          <w:tcPr>
+            <w:tcW w:w="1249" w:type="dxa"/>
+            <w:tcBorders>
+              <w:top w:val="single" w:sz="4" w:space="0" w:color="B7B7B7"/>
+              <w:left w:val="single" w:sz="4" w:space="0" w:color="B7B7B7"/>
+              <w:bottom w:val="single" w:sz="4" w:space="0" w:color="B7B7B7"/>
+              <w:right w:val="single" w:sz="4" w:space="0" w:color="B7B7B7"/>
+            </w:tcBorders>
+          </w:tcPr>
+          <w:p>
+            <w:pPr>
+              <w:pStyle w:val="Normal"/>
+              <w:keepNext w:val="true"/>
+              <w:rPr/>
+            </w:pPr>
+            <w:r>
+              <w:rPr>
+                <w:rFonts w:eastAsia="Consolas" w:cs="Consolas" w:ascii="Consolas" w:hAnsi="Consolas"/>
+                <w:b w:val="false"/>
+                <w:bCs w:val="false"/>
+                <w:sz w:val="18"/>
+                <w:szCs w:val="18"/>
+              </w:rPr>
+              <w:t>text</w:t>
+            </w:r>
+          </w:p>
+        </w:tc>
+        <w:tc>
+          <w:tcPr>
+            <w:tcW w:w="1251" w:type="dxa"/>
+            <w:tcBorders>
+              <w:top w:val="single" w:sz="4" w:space="0" w:color="B7B7B7"/>
+              <w:left w:val="single" w:sz="4" w:space="0" w:color="B7B7B7"/>
+              <w:bottom w:val="single" w:sz="4" w:space="0" w:color="B7B7B7"/>
+              <w:right w:val="single" w:sz="4" w:space="0" w:color="B7B7B7"/>
+            </w:tcBorders>
+          </w:tcPr>
+          <w:p>
+            <w:pPr>
+              <w:pStyle w:val="Normal"/>
+              <w:keepNext w:val="true"/>
+              <w:rPr/>
+            </w:pPr>
+            <w:r>
+              <w:rPr/>
+            </w:r>
+          </w:p>
+        </w:tc>
+        <w:tc>
+          <w:tcPr>
+            <w:tcW w:w="4959" w:type="dxa"/>
+            <w:tcBorders>
+              <w:top w:val="single" w:sz="4" w:space="0" w:color="B7B7B7"/>
+              <w:left w:val="single" w:sz="4" w:space="0" w:color="B7B7B7"/>
+              <w:bottom w:val="single" w:sz="4" w:space="0" w:color="B7B7B7"/>
+              <w:right w:val="single" w:sz="4" w:space="0" w:color="B7B7B7"/>
+            </w:tcBorders>
+          </w:tcPr>
+          <w:p>
+            <w:pPr>
+              <w:pStyle w:val="Normal"/>
+              <w:keepNext w:val="true"/>
+              <w:rPr/>
+            </w:pPr>
+            <w:r>
+              <w:rPr>
+                <w:b w:val="false"/>
+                <w:bCs w:val="false"/>
+                <w:sz w:val="20"/>
+                <w:szCs w:val="20"/>
+              </w:rPr>
+              <w:t>URL of the frame in an asset management tool. Each layer row of a frame holds its own copy.</w:t>
             </w:r>
           </w:p>
         </w:tc>
@@ -8013,8 +9653,8 @@
         <w:keepNext w:val="true"/>
         <w:rPr/>
       </w:pPr>
-      <w:bookmarkStart w:id="17" w:name="__RefHeading___Toc2832_1002645125"/>
-      <w:bookmarkEnd w:id="17"/>
+      <w:bookmarkStart w:id="18" w:name="__RefHeading___Toc6309_4212114258"/>
+      <w:bookmarkEnd w:id="18"/>
       <w:r>
         <w:rPr/>
         <w:t>layer</w:t>
@@ -8045,7 +9685,7 @@
           <w:iCs/>
           <w:color w:val="444444"/>
         </w:rPr>
-        <w:t>Primary key: partition (project_id, sequence_id, scene_id, shot_id), clustering (layer_id).</w:t>
+        <w:t>Primary key: partition (project_id, episode_id, sequence_id, scene_id, shot_id), clustering (layer_id).</w:t>
       </w:r>
     </w:p>
     <w:tbl>
@@ -8333,6 +9973,122 @@
                 <w:sz w:val="18"/>
                 <w:szCs w:val="18"/>
               </w:rPr>
+              <w:t>episode_id</w:t>
+            </w:r>
+          </w:p>
+        </w:tc>
+        <w:tc>
+          <w:tcPr>
+            <w:tcW w:w="1249" w:type="dxa"/>
+            <w:tcBorders>
+              <w:top w:val="single" w:sz="4" w:space="0" w:color="B7B7B7"/>
+              <w:left w:val="single" w:sz="4" w:space="0" w:color="B7B7B7"/>
+              <w:bottom w:val="single" w:sz="4" w:space="0" w:color="B7B7B7"/>
+              <w:right w:val="single" w:sz="4" w:space="0" w:color="B7B7B7"/>
+            </w:tcBorders>
+          </w:tcPr>
+          <w:p>
+            <w:pPr>
+              <w:pStyle w:val="Normal"/>
+              <w:keepNext w:val="true"/>
+              <w:rPr/>
+            </w:pPr>
+            <w:r>
+              <w:rPr>
+                <w:rFonts w:eastAsia="Consolas" w:cs="Consolas" w:ascii="Consolas" w:hAnsi="Consolas"/>
+                <w:b w:val="false"/>
+                <w:bCs w:val="false"/>
+                <w:sz w:val="18"/>
+                <w:szCs w:val="18"/>
+              </w:rPr>
+              <w:t>text</w:t>
+            </w:r>
+          </w:p>
+        </w:tc>
+        <w:tc>
+          <w:tcPr>
+            <w:tcW w:w="1251" w:type="dxa"/>
+            <w:tcBorders>
+              <w:top w:val="single" w:sz="4" w:space="0" w:color="B7B7B7"/>
+              <w:left w:val="single" w:sz="4" w:space="0" w:color="B7B7B7"/>
+              <w:bottom w:val="single" w:sz="4" w:space="0" w:color="B7B7B7"/>
+              <w:right w:val="single" w:sz="4" w:space="0" w:color="B7B7B7"/>
+            </w:tcBorders>
+          </w:tcPr>
+          <w:p>
+            <w:pPr>
+              <w:pStyle w:val="Normal"/>
+              <w:keepNext w:val="true"/>
+              <w:rPr/>
+            </w:pPr>
+            <w:r>
+              <w:rPr>
+                <w:b w:val="false"/>
+                <w:bCs w:val="false"/>
+                <w:sz w:val="20"/>
+                <w:szCs w:val="20"/>
+              </w:rPr>
+              <w:t>Partition</w:t>
+            </w:r>
+          </w:p>
+        </w:tc>
+        <w:tc>
+          <w:tcPr>
+            <w:tcW w:w="4959" w:type="dxa"/>
+            <w:tcBorders>
+              <w:top w:val="single" w:sz="4" w:space="0" w:color="B7B7B7"/>
+              <w:left w:val="single" w:sz="4" w:space="0" w:color="B7B7B7"/>
+              <w:bottom w:val="single" w:sz="4" w:space="0" w:color="B7B7B7"/>
+              <w:right w:val="single" w:sz="4" w:space="0" w:color="B7B7B7"/>
+            </w:tcBorders>
+          </w:tcPr>
+          <w:p>
+            <w:pPr>
+              <w:pStyle w:val="Normal"/>
+              <w:keepNext w:val="true"/>
+              <w:rPr/>
+            </w:pPr>
+            <w:r>
+              <w:rPr>
+                <w:b w:val="false"/>
+                <w:bCs w:val="false"/>
+                <w:sz w:val="20"/>
+                <w:szCs w:val="20"/>
+              </w:rPr>
+              <w:t>Identifier of the episode the row belongs to.</w:t>
+            </w:r>
+          </w:p>
+        </w:tc>
+      </w:tr>
+      <w:tr>
+        <w:trPr>
+          <w:cantSplit w:val="true"/>
+        </w:trPr>
+        <w:tc>
+          <w:tcPr>
+            <w:tcW w:w="1900" w:type="dxa"/>
+            <w:tcBorders>
+              <w:top w:val="single" w:sz="4" w:space="0" w:color="B7B7B7"/>
+              <w:left w:val="single" w:sz="4" w:space="0" w:color="B7B7B7"/>
+              <w:bottom w:val="single" w:sz="4" w:space="0" w:color="B7B7B7"/>
+              <w:right w:val="single" w:sz="4" w:space="0" w:color="B7B7B7"/>
+            </w:tcBorders>
+            <w:shd w:color="auto" w:fill="EEF3FA" w:val="clear"/>
+          </w:tcPr>
+          <w:p>
+            <w:pPr>
+              <w:pStyle w:val="Normal"/>
+              <w:keepNext w:val="true"/>
+              <w:rPr/>
+            </w:pPr>
+            <w:r>
+              <w:rPr>
+                <w:rFonts w:eastAsia="Consolas" w:cs="Consolas" w:ascii="Consolas" w:hAnsi="Consolas"/>
+                <w:b w:val="false"/>
+                <w:bCs w:val="false"/>
+                <w:sz w:val="18"/>
+                <w:szCs w:val="18"/>
+              </w:rPr>
               <w:t>sequence_id</w:t>
             </w:r>
           </w:p>
@@ -9439,8 +11195,8 @@
         <w:keepNext w:val="true"/>
         <w:rPr/>
       </w:pPr>
-      <w:bookmarkStart w:id="18" w:name="__RefHeading___Toc2834_1002645125"/>
-      <w:bookmarkEnd w:id="18"/>
+      <w:bookmarkStart w:id="19" w:name="__RefHeading___Toc6311_4212114258"/>
+      <w:bookmarkEnd w:id="19"/>
       <w:r>
         <w:rPr/>
         <w:t>exposure_sheet</w:t>
@@ -9471,7 +11227,7 @@
           <w:iCs/>
           <w:color w:val="444444"/>
         </w:rPr>
-        <w:t>Primary key: partition (project_id), clustering (sequence_id, scene_id, shot_id).</w:t>
+        <w:t>Primary key: partition (project_id), clustering (episode_id, sequence_id, scene_id, shot_id).</w:t>
       </w:r>
     </w:p>
     <w:tbl>
@@ -9759,6 +11515,122 @@
                 <w:sz w:val="18"/>
                 <w:szCs w:val="18"/>
               </w:rPr>
+              <w:t>episode_id</w:t>
+            </w:r>
+          </w:p>
+        </w:tc>
+        <w:tc>
+          <w:tcPr>
+            <w:tcW w:w="1249" w:type="dxa"/>
+            <w:tcBorders>
+              <w:top w:val="single" w:sz="4" w:space="0" w:color="B7B7B7"/>
+              <w:left w:val="single" w:sz="4" w:space="0" w:color="B7B7B7"/>
+              <w:bottom w:val="single" w:sz="4" w:space="0" w:color="B7B7B7"/>
+              <w:right w:val="single" w:sz="4" w:space="0" w:color="B7B7B7"/>
+            </w:tcBorders>
+          </w:tcPr>
+          <w:p>
+            <w:pPr>
+              <w:pStyle w:val="Normal"/>
+              <w:keepNext w:val="true"/>
+              <w:rPr/>
+            </w:pPr>
+            <w:r>
+              <w:rPr>
+                <w:rFonts w:eastAsia="Consolas" w:cs="Consolas" w:ascii="Consolas" w:hAnsi="Consolas"/>
+                <w:b w:val="false"/>
+                <w:bCs w:val="false"/>
+                <w:sz w:val="18"/>
+                <w:szCs w:val="18"/>
+              </w:rPr>
+              <w:t>text</w:t>
+            </w:r>
+          </w:p>
+        </w:tc>
+        <w:tc>
+          <w:tcPr>
+            <w:tcW w:w="1251" w:type="dxa"/>
+            <w:tcBorders>
+              <w:top w:val="single" w:sz="4" w:space="0" w:color="B7B7B7"/>
+              <w:left w:val="single" w:sz="4" w:space="0" w:color="B7B7B7"/>
+              <w:bottom w:val="single" w:sz="4" w:space="0" w:color="B7B7B7"/>
+              <w:right w:val="single" w:sz="4" w:space="0" w:color="B7B7B7"/>
+            </w:tcBorders>
+          </w:tcPr>
+          <w:p>
+            <w:pPr>
+              <w:pStyle w:val="Normal"/>
+              <w:keepNext w:val="true"/>
+              <w:rPr/>
+            </w:pPr>
+            <w:r>
+              <w:rPr>
+                <w:b w:val="false"/>
+                <w:bCs w:val="false"/>
+                <w:sz w:val="20"/>
+                <w:szCs w:val="20"/>
+              </w:rPr>
+              <w:t>Clustering</w:t>
+            </w:r>
+          </w:p>
+        </w:tc>
+        <w:tc>
+          <w:tcPr>
+            <w:tcW w:w="4959" w:type="dxa"/>
+            <w:tcBorders>
+              <w:top w:val="single" w:sz="4" w:space="0" w:color="B7B7B7"/>
+              <w:left w:val="single" w:sz="4" w:space="0" w:color="B7B7B7"/>
+              <w:bottom w:val="single" w:sz="4" w:space="0" w:color="B7B7B7"/>
+              <w:right w:val="single" w:sz="4" w:space="0" w:color="B7B7B7"/>
+            </w:tcBorders>
+          </w:tcPr>
+          <w:p>
+            <w:pPr>
+              <w:pStyle w:val="Normal"/>
+              <w:keepNext w:val="true"/>
+              <w:rPr/>
+            </w:pPr>
+            <w:r>
+              <w:rPr>
+                <w:b w:val="false"/>
+                <w:bCs w:val="false"/>
+                <w:sz w:val="20"/>
+                <w:szCs w:val="20"/>
+              </w:rPr>
+              <w:t>Identifier of the episode the row belongs to.</w:t>
+            </w:r>
+          </w:p>
+        </w:tc>
+      </w:tr>
+      <w:tr>
+        <w:trPr>
+          <w:cantSplit w:val="true"/>
+        </w:trPr>
+        <w:tc>
+          <w:tcPr>
+            <w:tcW w:w="1900" w:type="dxa"/>
+            <w:tcBorders>
+              <w:top w:val="single" w:sz="4" w:space="0" w:color="B7B7B7"/>
+              <w:left w:val="single" w:sz="4" w:space="0" w:color="B7B7B7"/>
+              <w:bottom w:val="single" w:sz="4" w:space="0" w:color="B7B7B7"/>
+              <w:right w:val="single" w:sz="4" w:space="0" w:color="B7B7B7"/>
+            </w:tcBorders>
+            <w:shd w:color="auto" w:fill="EEF3FA" w:val="clear"/>
+          </w:tcPr>
+          <w:p>
+            <w:pPr>
+              <w:pStyle w:val="Normal"/>
+              <w:keepNext w:val="true"/>
+              <w:rPr/>
+            </w:pPr>
+            <w:r>
+              <w:rPr>
+                <w:rFonts w:eastAsia="Consolas" w:cs="Consolas" w:ascii="Consolas" w:hAnsi="Consolas"/>
+                <w:b w:val="false"/>
+                <w:bCs w:val="false"/>
+                <w:sz w:val="18"/>
+                <w:szCs w:val="18"/>
+              </w:rPr>
               <w:t>sequence_id</w:t>
             </w:r>
           </w:p>
@@ -10421,8 +12293,8 @@
         <w:pStyle w:val="Heading2"/>
         <w:rPr/>
       </w:pPr>
-      <w:bookmarkStart w:id="19" w:name="__RefHeading___Toc2836_1002645125"/>
-      <w:bookmarkEnd w:id="19"/>
+      <w:bookmarkStart w:id="20" w:name="__RefHeading___Toc6313_4212114258"/>
+      <w:bookmarkEnd w:id="20"/>
       <w:r>
         <w:rPr/>
         <w:t>3.2 Assets, Audio and Notes</w:t>
@@ -10445,8 +12317,8 @@
         <w:keepNext w:val="true"/>
         <w:rPr/>
       </w:pPr>
-      <w:bookmarkStart w:id="20" w:name="__RefHeading___Toc2838_1002645125"/>
-      <w:bookmarkEnd w:id="20"/>
+      <w:bookmarkStart w:id="21" w:name="__RefHeading___Toc6315_4212114258"/>
+      <w:bookmarkEnd w:id="21"/>
       <w:r>
         <w:rPr/>
         <w:t>asset</w:t>
@@ -11298,8 +13170,8 @@
         <w:keepNext w:val="true"/>
         <w:rPr/>
       </w:pPr>
-      <w:bookmarkStart w:id="21" w:name="__RefHeading___Toc2840_1002645125"/>
-      <w:bookmarkEnd w:id="21"/>
+      <w:bookmarkStart w:id="22" w:name="__RefHeading___Toc6317_4212114258"/>
+      <w:bookmarkEnd w:id="22"/>
       <w:r>
         <w:rPr/>
         <w:t>track</w:t>
@@ -12151,8 +14023,8 @@
         <w:keepNext w:val="true"/>
         <w:rPr/>
       </w:pPr>
-      <w:bookmarkStart w:id="22" w:name="__RefHeading___Toc2842_1002645125"/>
-      <w:bookmarkEnd w:id="22"/>
+      <w:bookmarkStart w:id="23" w:name="__RefHeading___Toc6319_4212114258"/>
+      <w:bookmarkEnd w:id="23"/>
       <w:r>
         <w:rPr/>
         <w:t>audio_tracks</w:t>
@@ -12799,8 +14671,8 @@
         <w:keepNext w:val="true"/>
         <w:rPr/>
       </w:pPr>
-      <w:bookmarkStart w:id="23" w:name="__RefHeading___Toc2844_1002645125"/>
-      <w:bookmarkEnd w:id="23"/>
+      <w:bookmarkStart w:id="24" w:name="__RefHeading___Toc6321_4212114258"/>
+      <w:bookmarkEnd w:id="24"/>
       <w:r>
         <w:rPr/>
         <w:t>audio_ref</w:t>
@@ -12831,7 +14703,7 @@
           <w:iCs/>
           <w:color w:val="444444"/>
         </w:rPr>
-        <w:t>Primary key: partition (project_id, sequence_id, scene_id, shot_id), clustering (audio_ref_id).</w:t>
+        <w:t>Primary key: partition (project_id, episode_id, sequence_id, scene_id, shot_id), clustering (audio_ref_id).</w:t>
       </w:r>
     </w:p>
     <w:tbl>
@@ -13119,6 +14991,122 @@
                 <w:sz w:val="18"/>
                 <w:szCs w:val="18"/>
               </w:rPr>
+              <w:t>episode_id</w:t>
+            </w:r>
+          </w:p>
+        </w:tc>
+        <w:tc>
+          <w:tcPr>
+            <w:tcW w:w="1249" w:type="dxa"/>
+            <w:tcBorders>
+              <w:top w:val="single" w:sz="4" w:space="0" w:color="B7B7B7"/>
+              <w:left w:val="single" w:sz="4" w:space="0" w:color="B7B7B7"/>
+              <w:bottom w:val="single" w:sz="4" w:space="0" w:color="B7B7B7"/>
+              <w:right w:val="single" w:sz="4" w:space="0" w:color="B7B7B7"/>
+            </w:tcBorders>
+          </w:tcPr>
+          <w:p>
+            <w:pPr>
+              <w:pStyle w:val="Normal"/>
+              <w:keepNext w:val="true"/>
+              <w:rPr/>
+            </w:pPr>
+            <w:r>
+              <w:rPr>
+                <w:rFonts w:eastAsia="Consolas" w:cs="Consolas" w:ascii="Consolas" w:hAnsi="Consolas"/>
+                <w:b w:val="false"/>
+                <w:bCs w:val="false"/>
+                <w:sz w:val="18"/>
+                <w:szCs w:val="18"/>
+              </w:rPr>
+              <w:t>text</w:t>
+            </w:r>
+          </w:p>
+        </w:tc>
+        <w:tc>
+          <w:tcPr>
+            <w:tcW w:w="1251" w:type="dxa"/>
+            <w:tcBorders>
+              <w:top w:val="single" w:sz="4" w:space="0" w:color="B7B7B7"/>
+              <w:left w:val="single" w:sz="4" w:space="0" w:color="B7B7B7"/>
+              <w:bottom w:val="single" w:sz="4" w:space="0" w:color="B7B7B7"/>
+              <w:right w:val="single" w:sz="4" w:space="0" w:color="B7B7B7"/>
+            </w:tcBorders>
+          </w:tcPr>
+          <w:p>
+            <w:pPr>
+              <w:pStyle w:val="Normal"/>
+              <w:keepNext w:val="true"/>
+              <w:rPr/>
+            </w:pPr>
+            <w:r>
+              <w:rPr>
+                <w:b w:val="false"/>
+                <w:bCs w:val="false"/>
+                <w:sz w:val="20"/>
+                <w:szCs w:val="20"/>
+              </w:rPr>
+              <w:t>Partition</w:t>
+            </w:r>
+          </w:p>
+        </w:tc>
+        <w:tc>
+          <w:tcPr>
+            <w:tcW w:w="4959" w:type="dxa"/>
+            <w:tcBorders>
+              <w:top w:val="single" w:sz="4" w:space="0" w:color="B7B7B7"/>
+              <w:left w:val="single" w:sz="4" w:space="0" w:color="B7B7B7"/>
+              <w:bottom w:val="single" w:sz="4" w:space="0" w:color="B7B7B7"/>
+              <w:right w:val="single" w:sz="4" w:space="0" w:color="B7B7B7"/>
+            </w:tcBorders>
+          </w:tcPr>
+          <w:p>
+            <w:pPr>
+              <w:pStyle w:val="Normal"/>
+              <w:keepNext w:val="true"/>
+              <w:rPr/>
+            </w:pPr>
+            <w:r>
+              <w:rPr>
+                <w:b w:val="false"/>
+                <w:bCs w:val="false"/>
+                <w:sz w:val="20"/>
+                <w:szCs w:val="20"/>
+              </w:rPr>
+              <w:t>Identifier of the episode the row belongs to.</w:t>
+            </w:r>
+          </w:p>
+        </w:tc>
+      </w:tr>
+      <w:tr>
+        <w:trPr>
+          <w:cantSplit w:val="true"/>
+        </w:trPr>
+        <w:tc>
+          <w:tcPr>
+            <w:tcW w:w="1900" w:type="dxa"/>
+            <w:tcBorders>
+              <w:top w:val="single" w:sz="4" w:space="0" w:color="B7B7B7"/>
+              <w:left w:val="single" w:sz="4" w:space="0" w:color="B7B7B7"/>
+              <w:bottom w:val="single" w:sz="4" w:space="0" w:color="B7B7B7"/>
+              <w:right w:val="single" w:sz="4" w:space="0" w:color="B7B7B7"/>
+            </w:tcBorders>
+            <w:shd w:color="auto" w:fill="EEF3FA" w:val="clear"/>
+          </w:tcPr>
+          <w:p>
+            <w:pPr>
+              <w:pStyle w:val="Normal"/>
+              <w:keepNext w:val="true"/>
+              <w:rPr/>
+            </w:pPr>
+            <w:r>
+              <w:rPr>
+                <w:rFonts w:eastAsia="Consolas" w:cs="Consolas" w:ascii="Consolas" w:hAnsi="Consolas"/>
+                <w:b w:val="false"/>
+                <w:bCs w:val="false"/>
+                <w:sz w:val="18"/>
+                <w:szCs w:val="18"/>
+              </w:rPr>
               <w:t>sequence_id</w:t>
             </w:r>
           </w:p>
@@ -14007,8 +15995,8 @@
         <w:keepNext w:val="true"/>
         <w:rPr/>
       </w:pPr>
-      <w:bookmarkStart w:id="24" w:name="__RefHeading___Toc2846_1002645125"/>
-      <w:bookmarkEnd w:id="24"/>
+      <w:bookmarkStart w:id="25" w:name="__RefHeading___Toc6323_4212114258"/>
+      <w:bookmarkEnd w:id="25"/>
       <w:r>
         <w:rPr/>
         <w:t>dialog</w:t>
@@ -14039,7 +16027,7 @@
           <w:iCs/>
           <w:color w:val="444444"/>
         </w:rPr>
-        <w:t>Primary key: partition (project_id, sequence_id, scene_id, shot_id), clustering (dialog_id).</w:t>
+        <w:t>Primary key: partition (project_id, episode_id, sequence_id, scene_id, shot_id), clustering (dialog_id).</w:t>
       </w:r>
     </w:p>
     <w:tbl>
@@ -14327,6 +16315,122 @@
                 <w:sz w:val="18"/>
                 <w:szCs w:val="18"/>
               </w:rPr>
+              <w:t>episode_id</w:t>
+            </w:r>
+          </w:p>
+        </w:tc>
+        <w:tc>
+          <w:tcPr>
+            <w:tcW w:w="1249" w:type="dxa"/>
+            <w:tcBorders>
+              <w:top w:val="single" w:sz="4" w:space="0" w:color="B7B7B7"/>
+              <w:left w:val="single" w:sz="4" w:space="0" w:color="B7B7B7"/>
+              <w:bottom w:val="single" w:sz="4" w:space="0" w:color="B7B7B7"/>
+              <w:right w:val="single" w:sz="4" w:space="0" w:color="B7B7B7"/>
+            </w:tcBorders>
+          </w:tcPr>
+          <w:p>
+            <w:pPr>
+              <w:pStyle w:val="Normal"/>
+              <w:keepNext w:val="true"/>
+              <w:rPr/>
+            </w:pPr>
+            <w:r>
+              <w:rPr>
+                <w:rFonts w:eastAsia="Consolas" w:cs="Consolas" w:ascii="Consolas" w:hAnsi="Consolas"/>
+                <w:b w:val="false"/>
+                <w:bCs w:val="false"/>
+                <w:sz w:val="18"/>
+                <w:szCs w:val="18"/>
+              </w:rPr>
+              <w:t>text</w:t>
+            </w:r>
+          </w:p>
+        </w:tc>
+        <w:tc>
+          <w:tcPr>
+            <w:tcW w:w="1251" w:type="dxa"/>
+            <w:tcBorders>
+              <w:top w:val="single" w:sz="4" w:space="0" w:color="B7B7B7"/>
+              <w:left w:val="single" w:sz="4" w:space="0" w:color="B7B7B7"/>
+              <w:bottom w:val="single" w:sz="4" w:space="0" w:color="B7B7B7"/>
+              <w:right w:val="single" w:sz="4" w:space="0" w:color="B7B7B7"/>
+            </w:tcBorders>
+          </w:tcPr>
+          <w:p>
+            <w:pPr>
+              <w:pStyle w:val="Normal"/>
+              <w:keepNext w:val="true"/>
+              <w:rPr/>
+            </w:pPr>
+            <w:r>
+              <w:rPr>
+                <w:b w:val="false"/>
+                <w:bCs w:val="false"/>
+                <w:sz w:val="20"/>
+                <w:szCs w:val="20"/>
+              </w:rPr>
+              <w:t>Partition</w:t>
+            </w:r>
+          </w:p>
+        </w:tc>
+        <w:tc>
+          <w:tcPr>
+            <w:tcW w:w="4959" w:type="dxa"/>
+            <w:tcBorders>
+              <w:top w:val="single" w:sz="4" w:space="0" w:color="B7B7B7"/>
+              <w:left w:val="single" w:sz="4" w:space="0" w:color="B7B7B7"/>
+              <w:bottom w:val="single" w:sz="4" w:space="0" w:color="B7B7B7"/>
+              <w:right w:val="single" w:sz="4" w:space="0" w:color="B7B7B7"/>
+            </w:tcBorders>
+          </w:tcPr>
+          <w:p>
+            <w:pPr>
+              <w:pStyle w:val="Normal"/>
+              <w:keepNext w:val="true"/>
+              <w:rPr/>
+            </w:pPr>
+            <w:r>
+              <w:rPr>
+                <w:b w:val="false"/>
+                <w:bCs w:val="false"/>
+                <w:sz w:val="20"/>
+                <w:szCs w:val="20"/>
+              </w:rPr>
+              <w:t>Identifier of the episode the row belongs to.</w:t>
+            </w:r>
+          </w:p>
+        </w:tc>
+      </w:tr>
+      <w:tr>
+        <w:trPr>
+          <w:cantSplit w:val="true"/>
+        </w:trPr>
+        <w:tc>
+          <w:tcPr>
+            <w:tcW w:w="1900" w:type="dxa"/>
+            <w:tcBorders>
+              <w:top w:val="single" w:sz="4" w:space="0" w:color="B7B7B7"/>
+              <w:left w:val="single" w:sz="4" w:space="0" w:color="B7B7B7"/>
+              <w:bottom w:val="single" w:sz="4" w:space="0" w:color="B7B7B7"/>
+              <w:right w:val="single" w:sz="4" w:space="0" w:color="B7B7B7"/>
+            </w:tcBorders>
+            <w:shd w:color="auto" w:fill="EEF3FA" w:val="clear"/>
+          </w:tcPr>
+          <w:p>
+            <w:pPr>
+              <w:pStyle w:val="Normal"/>
+              <w:keepNext w:val="true"/>
+              <w:rPr/>
+            </w:pPr>
+            <w:r>
+              <w:rPr>
+                <w:rFonts w:eastAsia="Consolas" w:cs="Consolas" w:ascii="Consolas" w:hAnsi="Consolas"/>
+                <w:b w:val="false"/>
+                <w:bCs w:val="false"/>
+                <w:sz w:val="18"/>
+                <w:szCs w:val="18"/>
+              </w:rPr>
               <w:t>sequence_id</w:t>
             </w:r>
           </w:p>
@@ -14997,8 +17101,8 @@
         <w:keepNext w:val="true"/>
         <w:rPr/>
       </w:pPr>
-      <w:bookmarkStart w:id="25" w:name="__RefHeading___Toc2848_1002645125"/>
-      <w:bookmarkEnd w:id="25"/>
+      <w:bookmarkStart w:id="26" w:name="__RefHeading___Toc6325_4212114258"/>
+      <w:bookmarkEnd w:id="26"/>
       <w:r>
         <w:rPr/>
         <w:t>note</w:t>
@@ -15029,7 +17133,7 @@
           <w:iCs/>
           <w:color w:val="444444"/>
         </w:rPr>
-        <w:t>Primary key: partition (project_id, sequence_id, scene_id, shot_id), clustering (note_id).</w:t>
+        <w:t>Primary key: partition (project_id, episode_id, sequence_id, scene_id, shot_id), clustering (note_id).</w:t>
       </w:r>
     </w:p>
     <w:tbl>
@@ -15317,6 +17421,122 @@
                 <w:sz w:val="18"/>
                 <w:szCs w:val="18"/>
               </w:rPr>
+              <w:t>episode_id</w:t>
+            </w:r>
+          </w:p>
+        </w:tc>
+        <w:tc>
+          <w:tcPr>
+            <w:tcW w:w="1249" w:type="dxa"/>
+            <w:tcBorders>
+              <w:top w:val="single" w:sz="4" w:space="0" w:color="B7B7B7"/>
+              <w:left w:val="single" w:sz="4" w:space="0" w:color="B7B7B7"/>
+              <w:bottom w:val="single" w:sz="4" w:space="0" w:color="B7B7B7"/>
+              <w:right w:val="single" w:sz="4" w:space="0" w:color="B7B7B7"/>
+            </w:tcBorders>
+          </w:tcPr>
+          <w:p>
+            <w:pPr>
+              <w:pStyle w:val="Normal"/>
+              <w:keepNext w:val="true"/>
+              <w:rPr/>
+            </w:pPr>
+            <w:r>
+              <w:rPr>
+                <w:rFonts w:eastAsia="Consolas" w:cs="Consolas" w:ascii="Consolas" w:hAnsi="Consolas"/>
+                <w:b w:val="false"/>
+                <w:bCs w:val="false"/>
+                <w:sz w:val="18"/>
+                <w:szCs w:val="18"/>
+              </w:rPr>
+              <w:t>text</w:t>
+            </w:r>
+          </w:p>
+        </w:tc>
+        <w:tc>
+          <w:tcPr>
+            <w:tcW w:w="1251" w:type="dxa"/>
+            <w:tcBorders>
+              <w:top w:val="single" w:sz="4" w:space="0" w:color="B7B7B7"/>
+              <w:left w:val="single" w:sz="4" w:space="0" w:color="B7B7B7"/>
+              <w:bottom w:val="single" w:sz="4" w:space="0" w:color="B7B7B7"/>
+              <w:right w:val="single" w:sz="4" w:space="0" w:color="B7B7B7"/>
+            </w:tcBorders>
+          </w:tcPr>
+          <w:p>
+            <w:pPr>
+              <w:pStyle w:val="Normal"/>
+              <w:keepNext w:val="true"/>
+              <w:rPr/>
+            </w:pPr>
+            <w:r>
+              <w:rPr>
+                <w:b w:val="false"/>
+                <w:bCs w:val="false"/>
+                <w:sz w:val="20"/>
+                <w:szCs w:val="20"/>
+              </w:rPr>
+              <w:t>Partition</w:t>
+            </w:r>
+          </w:p>
+        </w:tc>
+        <w:tc>
+          <w:tcPr>
+            <w:tcW w:w="4959" w:type="dxa"/>
+            <w:tcBorders>
+              <w:top w:val="single" w:sz="4" w:space="0" w:color="B7B7B7"/>
+              <w:left w:val="single" w:sz="4" w:space="0" w:color="B7B7B7"/>
+              <w:bottom w:val="single" w:sz="4" w:space="0" w:color="B7B7B7"/>
+              <w:right w:val="single" w:sz="4" w:space="0" w:color="B7B7B7"/>
+            </w:tcBorders>
+          </w:tcPr>
+          <w:p>
+            <w:pPr>
+              <w:pStyle w:val="Normal"/>
+              <w:keepNext w:val="true"/>
+              <w:rPr/>
+            </w:pPr>
+            <w:r>
+              <w:rPr>
+                <w:b w:val="false"/>
+                <w:bCs w:val="false"/>
+                <w:sz w:val="20"/>
+                <w:szCs w:val="20"/>
+              </w:rPr>
+              <w:t>Identifier of the episode the row belongs to.</w:t>
+            </w:r>
+          </w:p>
+        </w:tc>
+      </w:tr>
+      <w:tr>
+        <w:trPr>
+          <w:cantSplit w:val="true"/>
+        </w:trPr>
+        <w:tc>
+          <w:tcPr>
+            <w:tcW w:w="1900" w:type="dxa"/>
+            <w:tcBorders>
+              <w:top w:val="single" w:sz="4" w:space="0" w:color="B7B7B7"/>
+              <w:left w:val="single" w:sz="4" w:space="0" w:color="B7B7B7"/>
+              <w:bottom w:val="single" w:sz="4" w:space="0" w:color="B7B7B7"/>
+              <w:right w:val="single" w:sz="4" w:space="0" w:color="B7B7B7"/>
+            </w:tcBorders>
+            <w:shd w:color="auto" w:fill="EEF3FA" w:val="clear"/>
+          </w:tcPr>
+          <w:p>
+            <w:pPr>
+              <w:pStyle w:val="Normal"/>
+              <w:keepNext w:val="true"/>
+              <w:rPr/>
+            </w:pPr>
+            <w:r>
+              <w:rPr>
+                <w:rFonts w:eastAsia="Consolas" w:cs="Consolas" w:ascii="Consolas" w:hAnsi="Consolas"/>
+                <w:b w:val="false"/>
+                <w:bCs w:val="false"/>
+                <w:sz w:val="18"/>
+                <w:szCs w:val="18"/>
+              </w:rPr>
               <w:t>sequence_id</w:t>
             </w:r>
           </w:p>
@@ -15877,8 +18097,8 @@
         <w:pStyle w:val="Heading2"/>
         <w:rPr/>
       </w:pPr>
-      <w:bookmarkStart w:id="26" w:name="__RefHeading___Toc2850_1002645125"/>
-      <w:bookmarkEnd w:id="26"/>
+      <w:bookmarkStart w:id="27" w:name="__RefHeading___Toc6327_4212114258"/>
+      <w:bookmarkEnd w:id="27"/>
       <w:r>
         <w:rPr/>
         <w:t>3.3 Camera and Timeline</w:t>
@@ -15901,8 +18121,8 @@
         <w:keepNext w:val="true"/>
         <w:rPr/>
       </w:pPr>
-      <w:bookmarkStart w:id="27" w:name="__RefHeading___Toc2852_1002645125"/>
-      <w:bookmarkEnd w:id="27"/>
+      <w:bookmarkStart w:id="28" w:name="__RefHeading___Toc6329_4212114258"/>
+      <w:bookmarkEnd w:id="28"/>
       <w:r>
         <w:rPr/>
         <w:t>camera</w:t>
@@ -15933,7 +18153,7 @@
           <w:iCs/>
           <w:color w:val="444444"/>
         </w:rPr>
-        <w:t>Primary key: partition (project_id, sequence_id, scene_id, shot_id), clustering (camera_id).</w:t>
+        <w:t>Primary key: partition (project_id, episode_id, sequence_id, scene_id, shot_id), clustering (camera_id).</w:t>
       </w:r>
     </w:p>
     <w:tbl>
@@ -16221,6 +18441,122 @@
                 <w:sz w:val="18"/>
                 <w:szCs w:val="18"/>
               </w:rPr>
+              <w:t>episode_id</w:t>
+            </w:r>
+          </w:p>
+        </w:tc>
+        <w:tc>
+          <w:tcPr>
+            <w:tcW w:w="1249" w:type="dxa"/>
+            <w:tcBorders>
+              <w:top w:val="single" w:sz="4" w:space="0" w:color="B7B7B7"/>
+              <w:left w:val="single" w:sz="4" w:space="0" w:color="B7B7B7"/>
+              <w:bottom w:val="single" w:sz="4" w:space="0" w:color="B7B7B7"/>
+              <w:right w:val="single" w:sz="4" w:space="0" w:color="B7B7B7"/>
+            </w:tcBorders>
+          </w:tcPr>
+          <w:p>
+            <w:pPr>
+              <w:pStyle w:val="Normal"/>
+              <w:keepNext w:val="true"/>
+              <w:rPr/>
+            </w:pPr>
+            <w:r>
+              <w:rPr>
+                <w:rFonts w:eastAsia="Consolas" w:cs="Consolas" w:ascii="Consolas" w:hAnsi="Consolas"/>
+                <w:b w:val="false"/>
+                <w:bCs w:val="false"/>
+                <w:sz w:val="18"/>
+                <w:szCs w:val="18"/>
+              </w:rPr>
+              <w:t>text</w:t>
+            </w:r>
+          </w:p>
+        </w:tc>
+        <w:tc>
+          <w:tcPr>
+            <w:tcW w:w="1251" w:type="dxa"/>
+            <w:tcBorders>
+              <w:top w:val="single" w:sz="4" w:space="0" w:color="B7B7B7"/>
+              <w:left w:val="single" w:sz="4" w:space="0" w:color="B7B7B7"/>
+              <w:bottom w:val="single" w:sz="4" w:space="0" w:color="B7B7B7"/>
+              <w:right w:val="single" w:sz="4" w:space="0" w:color="B7B7B7"/>
+            </w:tcBorders>
+          </w:tcPr>
+          <w:p>
+            <w:pPr>
+              <w:pStyle w:val="Normal"/>
+              <w:keepNext w:val="true"/>
+              <w:rPr/>
+            </w:pPr>
+            <w:r>
+              <w:rPr>
+                <w:b w:val="false"/>
+                <w:bCs w:val="false"/>
+                <w:sz w:val="20"/>
+                <w:szCs w:val="20"/>
+              </w:rPr>
+              <w:t>Partition</w:t>
+            </w:r>
+          </w:p>
+        </w:tc>
+        <w:tc>
+          <w:tcPr>
+            <w:tcW w:w="4959" w:type="dxa"/>
+            <w:tcBorders>
+              <w:top w:val="single" w:sz="4" w:space="0" w:color="B7B7B7"/>
+              <w:left w:val="single" w:sz="4" w:space="0" w:color="B7B7B7"/>
+              <w:bottom w:val="single" w:sz="4" w:space="0" w:color="B7B7B7"/>
+              <w:right w:val="single" w:sz="4" w:space="0" w:color="B7B7B7"/>
+            </w:tcBorders>
+          </w:tcPr>
+          <w:p>
+            <w:pPr>
+              <w:pStyle w:val="Normal"/>
+              <w:keepNext w:val="true"/>
+              <w:rPr/>
+            </w:pPr>
+            <w:r>
+              <w:rPr>
+                <w:b w:val="false"/>
+                <w:bCs w:val="false"/>
+                <w:sz w:val="20"/>
+                <w:szCs w:val="20"/>
+              </w:rPr>
+              <w:t>Identifier of the episode the row belongs to.</w:t>
+            </w:r>
+          </w:p>
+        </w:tc>
+      </w:tr>
+      <w:tr>
+        <w:trPr>
+          <w:cantSplit w:val="true"/>
+        </w:trPr>
+        <w:tc>
+          <w:tcPr>
+            <w:tcW w:w="1900" w:type="dxa"/>
+            <w:tcBorders>
+              <w:top w:val="single" w:sz="4" w:space="0" w:color="B7B7B7"/>
+              <w:left w:val="single" w:sz="4" w:space="0" w:color="B7B7B7"/>
+              <w:bottom w:val="single" w:sz="4" w:space="0" w:color="B7B7B7"/>
+              <w:right w:val="single" w:sz="4" w:space="0" w:color="B7B7B7"/>
+            </w:tcBorders>
+            <w:shd w:color="auto" w:fill="EEF3FA" w:val="clear"/>
+          </w:tcPr>
+          <w:p>
+            <w:pPr>
+              <w:pStyle w:val="Normal"/>
+              <w:keepNext w:val="true"/>
+              <w:rPr/>
+            </w:pPr>
+            <w:r>
+              <w:rPr>
+                <w:rFonts w:eastAsia="Consolas" w:cs="Consolas" w:ascii="Consolas" w:hAnsi="Consolas"/>
+                <w:b w:val="false"/>
+                <w:bCs w:val="false"/>
+                <w:sz w:val="18"/>
+                <w:szCs w:val="18"/>
+              </w:rPr>
               <w:t>sequence_id</w:t>
             </w:r>
           </w:p>
@@ -17218,8 +19554,8 @@
         <w:keepNext w:val="true"/>
         <w:rPr/>
       </w:pPr>
-      <w:bookmarkStart w:id="28" w:name="__RefHeading___Toc2854_1002645125"/>
-      <w:bookmarkEnd w:id="28"/>
+      <w:bookmarkStart w:id="29" w:name="__RefHeading___Toc6331_4212114258"/>
+      <w:bookmarkEnd w:id="29"/>
       <w:r>
         <w:rPr/>
         <w:t>camera_move</w:t>
@@ -17250,7 +19586,7 @@
           <w:iCs/>
           <w:color w:val="444444"/>
         </w:rPr>
-        <w:t>Primary key: partition (project_id, sequence_id, scene_id, shot_id), clustering (camera_move_id).</w:t>
+        <w:t>Primary key: partition (project_id, episode_id, sequence_id, scene_id, shot_id), clustering (camera_move_id).</w:t>
       </w:r>
     </w:p>
     <w:tbl>
@@ -17538,6 +19874,122 @@
                 <w:sz w:val="18"/>
                 <w:szCs w:val="18"/>
               </w:rPr>
+              <w:t>episode_id</w:t>
+            </w:r>
+          </w:p>
+        </w:tc>
+        <w:tc>
+          <w:tcPr>
+            <w:tcW w:w="1249" w:type="dxa"/>
+            <w:tcBorders>
+              <w:top w:val="single" w:sz="4" w:space="0" w:color="B7B7B7"/>
+              <w:left w:val="single" w:sz="4" w:space="0" w:color="B7B7B7"/>
+              <w:bottom w:val="single" w:sz="4" w:space="0" w:color="B7B7B7"/>
+              <w:right w:val="single" w:sz="4" w:space="0" w:color="B7B7B7"/>
+            </w:tcBorders>
+          </w:tcPr>
+          <w:p>
+            <w:pPr>
+              <w:pStyle w:val="Normal"/>
+              <w:keepNext w:val="true"/>
+              <w:rPr/>
+            </w:pPr>
+            <w:r>
+              <w:rPr>
+                <w:rFonts w:eastAsia="Consolas" w:cs="Consolas" w:ascii="Consolas" w:hAnsi="Consolas"/>
+                <w:b w:val="false"/>
+                <w:bCs w:val="false"/>
+                <w:sz w:val="18"/>
+                <w:szCs w:val="18"/>
+              </w:rPr>
+              <w:t>text</w:t>
+            </w:r>
+          </w:p>
+        </w:tc>
+        <w:tc>
+          <w:tcPr>
+            <w:tcW w:w="1251" w:type="dxa"/>
+            <w:tcBorders>
+              <w:top w:val="single" w:sz="4" w:space="0" w:color="B7B7B7"/>
+              <w:left w:val="single" w:sz="4" w:space="0" w:color="B7B7B7"/>
+              <w:bottom w:val="single" w:sz="4" w:space="0" w:color="B7B7B7"/>
+              <w:right w:val="single" w:sz="4" w:space="0" w:color="B7B7B7"/>
+            </w:tcBorders>
+          </w:tcPr>
+          <w:p>
+            <w:pPr>
+              <w:pStyle w:val="Normal"/>
+              <w:keepNext w:val="true"/>
+              <w:rPr/>
+            </w:pPr>
+            <w:r>
+              <w:rPr>
+                <w:b w:val="false"/>
+                <w:bCs w:val="false"/>
+                <w:sz w:val="20"/>
+                <w:szCs w:val="20"/>
+              </w:rPr>
+              <w:t>Partition</w:t>
+            </w:r>
+          </w:p>
+        </w:tc>
+        <w:tc>
+          <w:tcPr>
+            <w:tcW w:w="4959" w:type="dxa"/>
+            <w:tcBorders>
+              <w:top w:val="single" w:sz="4" w:space="0" w:color="B7B7B7"/>
+              <w:left w:val="single" w:sz="4" w:space="0" w:color="B7B7B7"/>
+              <w:bottom w:val="single" w:sz="4" w:space="0" w:color="B7B7B7"/>
+              <w:right w:val="single" w:sz="4" w:space="0" w:color="B7B7B7"/>
+            </w:tcBorders>
+          </w:tcPr>
+          <w:p>
+            <w:pPr>
+              <w:pStyle w:val="Normal"/>
+              <w:keepNext w:val="true"/>
+              <w:rPr/>
+            </w:pPr>
+            <w:r>
+              <w:rPr>
+                <w:b w:val="false"/>
+                <w:bCs w:val="false"/>
+                <w:sz w:val="20"/>
+                <w:szCs w:val="20"/>
+              </w:rPr>
+              <w:t>Identifier of the episode the row belongs to.</w:t>
+            </w:r>
+          </w:p>
+        </w:tc>
+      </w:tr>
+      <w:tr>
+        <w:trPr>
+          <w:cantSplit w:val="true"/>
+        </w:trPr>
+        <w:tc>
+          <w:tcPr>
+            <w:tcW w:w="1900" w:type="dxa"/>
+            <w:tcBorders>
+              <w:top w:val="single" w:sz="4" w:space="0" w:color="B7B7B7"/>
+              <w:left w:val="single" w:sz="4" w:space="0" w:color="B7B7B7"/>
+              <w:bottom w:val="single" w:sz="4" w:space="0" w:color="B7B7B7"/>
+              <w:right w:val="single" w:sz="4" w:space="0" w:color="B7B7B7"/>
+            </w:tcBorders>
+            <w:shd w:color="auto" w:fill="EEF3FA" w:val="clear"/>
+          </w:tcPr>
+          <w:p>
+            <w:pPr>
+              <w:pStyle w:val="Normal"/>
+              <w:keepNext w:val="true"/>
+              <w:rPr/>
+            </w:pPr>
+            <w:r>
+              <w:rPr>
+                <w:rFonts w:eastAsia="Consolas" w:cs="Consolas" w:ascii="Consolas" w:hAnsi="Consolas"/>
+                <w:b w:val="false"/>
+                <w:bCs w:val="false"/>
+                <w:sz w:val="18"/>
+                <w:szCs w:val="18"/>
+              </w:rPr>
               <w:t>sequence_id</w:t>
             </w:r>
           </w:p>
@@ -18426,8 +20878,8 @@
         <w:keepNext w:val="true"/>
         <w:rPr/>
       </w:pPr>
-      <w:bookmarkStart w:id="29" w:name="__RefHeading___Toc2856_1002645125"/>
-      <w:bookmarkEnd w:id="29"/>
+      <w:bookmarkStart w:id="30" w:name="__RefHeading___Toc6333_4212114258"/>
+      <w:bookmarkEnd w:id="30"/>
       <w:r>
         <w:rPr/>
         <w:t>keyframe</w:t>
@@ -18458,7 +20910,7 @@
           <w:iCs/>
           <w:color w:val="444444"/>
         </w:rPr>
-        <w:t>Primary key: partition (project_id, sequence_id, scene_id, shot_id), clustering (keyframe_id).</w:t>
+        <w:t>Primary key: partition (project_id, episode_id, sequence_id, scene_id, shot_id), clustering (keyframe_id).</w:t>
       </w:r>
     </w:p>
     <w:tbl>
@@ -18746,6 +21198,122 @@
                 <w:sz w:val="18"/>
                 <w:szCs w:val="18"/>
               </w:rPr>
+              <w:t>episode_id</w:t>
+            </w:r>
+          </w:p>
+        </w:tc>
+        <w:tc>
+          <w:tcPr>
+            <w:tcW w:w="1249" w:type="dxa"/>
+            <w:tcBorders>
+              <w:top w:val="single" w:sz="4" w:space="0" w:color="B7B7B7"/>
+              <w:left w:val="single" w:sz="4" w:space="0" w:color="B7B7B7"/>
+              <w:bottom w:val="single" w:sz="4" w:space="0" w:color="B7B7B7"/>
+              <w:right w:val="single" w:sz="4" w:space="0" w:color="B7B7B7"/>
+            </w:tcBorders>
+          </w:tcPr>
+          <w:p>
+            <w:pPr>
+              <w:pStyle w:val="Normal"/>
+              <w:keepNext w:val="true"/>
+              <w:rPr/>
+            </w:pPr>
+            <w:r>
+              <w:rPr>
+                <w:rFonts w:eastAsia="Consolas" w:cs="Consolas" w:ascii="Consolas" w:hAnsi="Consolas"/>
+                <w:b w:val="false"/>
+                <w:bCs w:val="false"/>
+                <w:sz w:val="18"/>
+                <w:szCs w:val="18"/>
+              </w:rPr>
+              <w:t>text</w:t>
+            </w:r>
+          </w:p>
+        </w:tc>
+        <w:tc>
+          <w:tcPr>
+            <w:tcW w:w="1251" w:type="dxa"/>
+            <w:tcBorders>
+              <w:top w:val="single" w:sz="4" w:space="0" w:color="B7B7B7"/>
+              <w:left w:val="single" w:sz="4" w:space="0" w:color="B7B7B7"/>
+              <w:bottom w:val="single" w:sz="4" w:space="0" w:color="B7B7B7"/>
+              <w:right w:val="single" w:sz="4" w:space="0" w:color="B7B7B7"/>
+            </w:tcBorders>
+          </w:tcPr>
+          <w:p>
+            <w:pPr>
+              <w:pStyle w:val="Normal"/>
+              <w:keepNext w:val="true"/>
+              <w:rPr/>
+            </w:pPr>
+            <w:r>
+              <w:rPr>
+                <w:b w:val="false"/>
+                <w:bCs w:val="false"/>
+                <w:sz w:val="20"/>
+                <w:szCs w:val="20"/>
+              </w:rPr>
+              <w:t>Partition</w:t>
+            </w:r>
+          </w:p>
+        </w:tc>
+        <w:tc>
+          <w:tcPr>
+            <w:tcW w:w="4959" w:type="dxa"/>
+            <w:tcBorders>
+              <w:top w:val="single" w:sz="4" w:space="0" w:color="B7B7B7"/>
+              <w:left w:val="single" w:sz="4" w:space="0" w:color="B7B7B7"/>
+              <w:bottom w:val="single" w:sz="4" w:space="0" w:color="B7B7B7"/>
+              <w:right w:val="single" w:sz="4" w:space="0" w:color="B7B7B7"/>
+            </w:tcBorders>
+          </w:tcPr>
+          <w:p>
+            <w:pPr>
+              <w:pStyle w:val="Normal"/>
+              <w:keepNext w:val="true"/>
+              <w:rPr/>
+            </w:pPr>
+            <w:r>
+              <w:rPr>
+                <w:b w:val="false"/>
+                <w:bCs w:val="false"/>
+                <w:sz w:val="20"/>
+                <w:szCs w:val="20"/>
+              </w:rPr>
+              <w:t>Identifier of the episode the row belongs to.</w:t>
+            </w:r>
+          </w:p>
+        </w:tc>
+      </w:tr>
+      <w:tr>
+        <w:trPr>
+          <w:cantSplit w:val="true"/>
+        </w:trPr>
+        <w:tc>
+          <w:tcPr>
+            <w:tcW w:w="1900" w:type="dxa"/>
+            <w:tcBorders>
+              <w:top w:val="single" w:sz="4" w:space="0" w:color="B7B7B7"/>
+              <w:left w:val="single" w:sz="4" w:space="0" w:color="B7B7B7"/>
+              <w:bottom w:val="single" w:sz="4" w:space="0" w:color="B7B7B7"/>
+              <w:right w:val="single" w:sz="4" w:space="0" w:color="B7B7B7"/>
+            </w:tcBorders>
+            <w:shd w:color="auto" w:fill="EEF3FA" w:val="clear"/>
+          </w:tcPr>
+          <w:p>
+            <w:pPr>
+              <w:pStyle w:val="Normal"/>
+              <w:keepNext w:val="true"/>
+              <w:rPr/>
+            </w:pPr>
+            <w:r>
+              <w:rPr>
+                <w:rFonts w:eastAsia="Consolas" w:cs="Consolas" w:ascii="Consolas" w:hAnsi="Consolas"/>
+                <w:b w:val="false"/>
+                <w:bCs w:val="false"/>
+                <w:sz w:val="18"/>
+                <w:szCs w:val="18"/>
+              </w:rPr>
               <w:t>sequence_id</w:t>
             </w:r>
           </w:p>
@@ -20179,8 +22747,8 @@
         <w:keepNext w:val="true"/>
         <w:rPr/>
       </w:pPr>
-      <w:bookmarkStart w:id="30" w:name="__RefHeading___Toc2858_1002645125"/>
-      <w:bookmarkEnd w:id="30"/>
+      <w:bookmarkStart w:id="31" w:name="__RefHeading___Toc6335_4212114258"/>
+      <w:bookmarkEnd w:id="31"/>
       <w:r>
         <w:rPr/>
         <w:t>timeline</w:t>
@@ -20195,7 +22763,7 @@
       </w:pPr>
       <w:r>
         <w:rPr/>
-        <w:t>A timeline is an ordered sequence of frames. The table has one row per entry, partitioned by timeline and ordered by position. Each entry points at a frame by its sequence, scene, shot and frame number.</w:t>
+        <w:t>A timeline is an ordered sequence of frames. The table has one row per entry, partitioned by timeline and ordered by position. Each entry points at a frame by its episode, sequence, scene, shot and frame number.</w:t>
       </w:r>
     </w:p>
     <w:p>
@@ -20960,6 +23528,115 @@
                 <w:sz w:val="18"/>
                 <w:szCs w:val="18"/>
               </w:rPr>
+              <w:t>episode_id</w:t>
+            </w:r>
+          </w:p>
+        </w:tc>
+        <w:tc>
+          <w:tcPr>
+            <w:tcW w:w="1249" w:type="dxa"/>
+            <w:tcBorders>
+              <w:top w:val="single" w:sz="4" w:space="0" w:color="B7B7B7"/>
+              <w:left w:val="single" w:sz="4" w:space="0" w:color="B7B7B7"/>
+              <w:bottom w:val="single" w:sz="4" w:space="0" w:color="B7B7B7"/>
+              <w:right w:val="single" w:sz="4" w:space="0" w:color="B7B7B7"/>
+            </w:tcBorders>
+          </w:tcPr>
+          <w:p>
+            <w:pPr>
+              <w:pStyle w:val="Normal"/>
+              <w:keepNext w:val="true"/>
+              <w:rPr/>
+            </w:pPr>
+            <w:r>
+              <w:rPr>
+                <w:rFonts w:eastAsia="Consolas" w:cs="Consolas" w:ascii="Consolas" w:hAnsi="Consolas"/>
+                <w:b w:val="false"/>
+                <w:bCs w:val="false"/>
+                <w:sz w:val="18"/>
+                <w:szCs w:val="18"/>
+              </w:rPr>
+              <w:t>text</w:t>
+            </w:r>
+          </w:p>
+        </w:tc>
+        <w:tc>
+          <w:tcPr>
+            <w:tcW w:w="1251" w:type="dxa"/>
+            <w:tcBorders>
+              <w:top w:val="single" w:sz="4" w:space="0" w:color="B7B7B7"/>
+              <w:left w:val="single" w:sz="4" w:space="0" w:color="B7B7B7"/>
+              <w:bottom w:val="single" w:sz="4" w:space="0" w:color="B7B7B7"/>
+              <w:right w:val="single" w:sz="4" w:space="0" w:color="B7B7B7"/>
+            </w:tcBorders>
+          </w:tcPr>
+          <w:p>
+            <w:pPr>
+              <w:pStyle w:val="Normal"/>
+              <w:keepNext w:val="true"/>
+              <w:rPr/>
+            </w:pPr>
+            <w:r>
+              <w:rPr/>
+            </w:r>
+          </w:p>
+        </w:tc>
+        <w:tc>
+          <w:tcPr>
+            <w:tcW w:w="4959" w:type="dxa"/>
+            <w:tcBorders>
+              <w:top w:val="single" w:sz="4" w:space="0" w:color="B7B7B7"/>
+              <w:left w:val="single" w:sz="4" w:space="0" w:color="B7B7B7"/>
+              <w:bottom w:val="single" w:sz="4" w:space="0" w:color="B7B7B7"/>
+              <w:right w:val="single" w:sz="4" w:space="0" w:color="B7B7B7"/>
+            </w:tcBorders>
+          </w:tcPr>
+          <w:p>
+            <w:pPr>
+              <w:pStyle w:val="Normal"/>
+              <w:keepNext w:val="true"/>
+              <w:rPr/>
+            </w:pPr>
+            <w:r>
+              <w:rPr>
+                <w:b w:val="false"/>
+                <w:bCs w:val="false"/>
+                <w:sz w:val="20"/>
+                <w:szCs w:val="20"/>
+              </w:rPr>
+              <w:t>Episode of the frame this entry points at (frame.episode_id).</w:t>
+            </w:r>
+          </w:p>
+        </w:tc>
+      </w:tr>
+      <w:tr>
+        <w:trPr>
+          <w:cantSplit w:val="true"/>
+        </w:trPr>
+        <w:tc>
+          <w:tcPr>
+            <w:tcW w:w="1900" w:type="dxa"/>
+            <w:tcBorders>
+              <w:top w:val="single" w:sz="4" w:space="0" w:color="B7B7B7"/>
+              <w:left w:val="single" w:sz="4" w:space="0" w:color="B7B7B7"/>
+              <w:bottom w:val="single" w:sz="4" w:space="0" w:color="B7B7B7"/>
+              <w:right w:val="single" w:sz="4" w:space="0" w:color="B7B7B7"/>
+            </w:tcBorders>
+          </w:tcPr>
+          <w:p>
+            <w:pPr>
+              <w:pStyle w:val="Normal"/>
+              <w:keepNext w:val="true"/>
+              <w:rPr/>
+            </w:pPr>
+            <w:r>
+              <w:rPr>
+                <w:rFonts w:eastAsia="Consolas" w:cs="Consolas" w:ascii="Consolas" w:hAnsi="Consolas"/>
+                <w:b w:val="false"/>
+                <w:bCs w:val="false"/>
+                <w:sz w:val="18"/>
+                <w:szCs w:val="18"/>
+              </w:rPr>
               <w:t>sequence_id</w:t>
             </w:r>
           </w:p>
@@ -21384,8 +24061,8 @@
         <w:pStyle w:val="Heading2"/>
         <w:rPr/>
       </w:pPr>
-      <w:bookmarkStart w:id="31" w:name="__RefHeading___Toc2860_1002645125"/>
-      <w:bookmarkEnd w:id="31"/>
+      <w:bookmarkStart w:id="32" w:name="__RefHeading___Toc6337_4212114258"/>
+      <w:bookmarkEnd w:id="32"/>
       <w:r>
         <w:rPr/>
         <w:t>3.4 Users and Projects</w:t>
@@ -21408,8 +24085,8 @@
         <w:keepNext w:val="true"/>
         <w:rPr/>
       </w:pPr>
-      <w:bookmarkStart w:id="32" w:name="__RefHeading___Toc2862_1002645125"/>
-      <w:bookmarkEnd w:id="32"/>
+      <w:bookmarkStart w:id="33" w:name="__RefHeading___Toc6339_4212114258"/>
+      <w:bookmarkEnd w:id="33"/>
       <w:r>
         <w:rPr/>
         <w:t>user</w:t>
@@ -22370,8 +25047,8 @@
         <w:keepNext w:val="true"/>
         <w:rPr/>
       </w:pPr>
-      <w:bookmarkStart w:id="33" w:name="__RefHeading___Toc2864_1002645125"/>
-      <w:bookmarkEnd w:id="33"/>
+      <w:bookmarkStart w:id="34" w:name="__RefHeading___Toc6341_4212114258"/>
+      <w:bookmarkEnd w:id="34"/>
       <w:r>
         <w:rPr/>
         <w:t>user_by_email</w:t>
@@ -22787,8 +25464,8 @@
         <w:keepNext w:val="true"/>
         <w:rPr/>
       </w:pPr>
-      <w:bookmarkStart w:id="34" w:name="__RefHeading___Toc2866_1002645125"/>
-      <w:bookmarkEnd w:id="34"/>
+      <w:bookmarkStart w:id="35" w:name="__RefHeading___Toc6343_4212114258"/>
+      <w:bookmarkEnd w:id="35"/>
       <w:r>
         <w:rPr/>
         <w:t>project</w:t>
@@ -23640,8 +26317,8 @@
         <w:keepNext w:val="true"/>
         <w:rPr/>
       </w:pPr>
-      <w:bookmarkStart w:id="35" w:name="__RefHeading___Toc2868_1002645125"/>
-      <w:bookmarkEnd w:id="35"/>
+      <w:bookmarkStart w:id="36" w:name="__RefHeading___Toc6345_4212114258"/>
+      <w:bookmarkEnd w:id="36"/>
       <w:r>
         <w:rPr/>
         <w:t>project_member</w:t>
@@ -24282,8 +26959,8 @@
         <w:keepNext w:val="true"/>
         <w:rPr/>
       </w:pPr>
-      <w:bookmarkStart w:id="36" w:name="__RefHeading___Toc2870_1002645125"/>
-      <w:bookmarkEnd w:id="36"/>
+      <w:bookmarkStart w:id="37" w:name="__RefHeading___Toc6347_4212114258"/>
+      <w:bookmarkEnd w:id="37"/>
       <w:r>
         <w:rPr/>
         <w:t>project_by_user</w:t>
@@ -24923,8 +27600,8 @@
         <w:pStyle w:val="Heading2"/>
         <w:rPr/>
       </w:pPr>
-      <w:bookmarkStart w:id="37" w:name="__RefHeading___Toc2872_1002645125"/>
-      <w:bookmarkEnd w:id="37"/>
+      <w:bookmarkStart w:id="38" w:name="__RefHeading___Toc6349_4212114258"/>
+      <w:bookmarkEnd w:id="38"/>
       <w:r>
         <w:rPr/>
         <w:t>3.5 Review</w:t>
@@ -24947,8 +27624,8 @@
         <w:keepNext w:val="true"/>
         <w:rPr/>
       </w:pPr>
-      <w:bookmarkStart w:id="38" w:name="__RefHeading___Toc2874_1002645125"/>
-      <w:bookmarkEnd w:id="38"/>
+      <w:bookmarkStart w:id="39" w:name="__RefHeading___Toc6351_4212114258"/>
+      <w:bookmarkEnd w:id="39"/>
       <w:r>
         <w:rPr/>
         <w:t>review</w:t>
@@ -25382,6 +28059,115 @@
                 <w:sz w:val="18"/>
                 <w:szCs w:val="18"/>
               </w:rPr>
+              <w:t>episode_id</w:t>
+            </w:r>
+          </w:p>
+        </w:tc>
+        <w:tc>
+          <w:tcPr>
+            <w:tcW w:w="1249" w:type="dxa"/>
+            <w:tcBorders>
+              <w:top w:val="single" w:sz="4" w:space="0" w:color="B7B7B7"/>
+              <w:left w:val="single" w:sz="4" w:space="0" w:color="B7B7B7"/>
+              <w:bottom w:val="single" w:sz="4" w:space="0" w:color="B7B7B7"/>
+              <w:right w:val="single" w:sz="4" w:space="0" w:color="B7B7B7"/>
+            </w:tcBorders>
+          </w:tcPr>
+          <w:p>
+            <w:pPr>
+              <w:pStyle w:val="Normal"/>
+              <w:keepNext w:val="true"/>
+              <w:rPr/>
+            </w:pPr>
+            <w:r>
+              <w:rPr>
+                <w:rFonts w:eastAsia="Consolas" w:cs="Consolas" w:ascii="Consolas" w:hAnsi="Consolas"/>
+                <w:b w:val="false"/>
+                <w:bCs w:val="false"/>
+                <w:sz w:val="18"/>
+                <w:szCs w:val="18"/>
+              </w:rPr>
+              <w:t>text</w:t>
+            </w:r>
+          </w:p>
+        </w:tc>
+        <w:tc>
+          <w:tcPr>
+            <w:tcW w:w="1251" w:type="dxa"/>
+            <w:tcBorders>
+              <w:top w:val="single" w:sz="4" w:space="0" w:color="B7B7B7"/>
+              <w:left w:val="single" w:sz="4" w:space="0" w:color="B7B7B7"/>
+              <w:bottom w:val="single" w:sz="4" w:space="0" w:color="B7B7B7"/>
+              <w:right w:val="single" w:sz="4" w:space="0" w:color="B7B7B7"/>
+            </w:tcBorders>
+          </w:tcPr>
+          <w:p>
+            <w:pPr>
+              <w:pStyle w:val="Normal"/>
+              <w:keepNext w:val="true"/>
+              <w:rPr/>
+            </w:pPr>
+            <w:r>
+              <w:rPr/>
+            </w:r>
+          </w:p>
+        </w:tc>
+        <w:tc>
+          <w:tcPr>
+            <w:tcW w:w="4959" w:type="dxa"/>
+            <w:tcBorders>
+              <w:top w:val="single" w:sz="4" w:space="0" w:color="B7B7B7"/>
+              <w:left w:val="single" w:sz="4" w:space="0" w:color="B7B7B7"/>
+              <w:bottom w:val="single" w:sz="4" w:space="0" w:color="B7B7B7"/>
+              <w:right w:val="single" w:sz="4" w:space="0" w:color="B7B7B7"/>
+            </w:tcBorders>
+          </w:tcPr>
+          <w:p>
+            <w:pPr>
+              <w:pStyle w:val="Normal"/>
+              <w:keepNext w:val="true"/>
+              <w:rPr/>
+            </w:pPr>
+            <w:r>
+              <w:rPr>
+                <w:b w:val="false"/>
+                <w:bCs w:val="false"/>
+                <w:sz w:val="20"/>
+                <w:szCs w:val="20"/>
+              </w:rPr>
+              <w:t>Episode of the reviewed frame (frame.episode_id).</w:t>
+            </w:r>
+          </w:p>
+        </w:tc>
+      </w:tr>
+      <w:tr>
+        <w:trPr>
+          <w:cantSplit w:val="true"/>
+        </w:trPr>
+        <w:tc>
+          <w:tcPr>
+            <w:tcW w:w="1900" w:type="dxa"/>
+            <w:tcBorders>
+              <w:top w:val="single" w:sz="4" w:space="0" w:color="B7B7B7"/>
+              <w:left w:val="single" w:sz="4" w:space="0" w:color="B7B7B7"/>
+              <w:bottom w:val="single" w:sz="4" w:space="0" w:color="B7B7B7"/>
+              <w:right w:val="single" w:sz="4" w:space="0" w:color="B7B7B7"/>
+            </w:tcBorders>
+          </w:tcPr>
+          <w:p>
+            <w:pPr>
+              <w:pStyle w:val="Normal"/>
+              <w:keepNext w:val="true"/>
+              <w:rPr/>
+            </w:pPr>
+            <w:r>
+              <w:rPr>
+                <w:rFonts w:eastAsia="Consolas" w:cs="Consolas" w:ascii="Consolas" w:hAnsi="Consolas"/>
+                <w:b w:val="false"/>
+                <w:bCs w:val="false"/>
+                <w:sz w:val="18"/>
+                <w:szCs w:val="18"/>
+              </w:rPr>
               <w:t>sequence_id</w:t>
             </w:r>
           </w:p>
@@ -26243,8 +29029,8 @@
         <w:keepNext w:val="true"/>
         <w:rPr/>
       </w:pPr>
-      <w:bookmarkStart w:id="39" w:name="__RefHeading___Toc2876_1002645125"/>
-      <w:bookmarkEnd w:id="39"/>
+      <w:bookmarkStart w:id="40" w:name="__RefHeading___Toc6353_4212114258"/>
+      <w:bookmarkEnd w:id="40"/>
       <w:r>
         <w:rPr/>
         <w:t>comment</w:t>
@@ -26776,8 +29562,8 @@
         <w:keepNext w:val="true"/>
         <w:rPr/>
       </w:pPr>
-      <w:bookmarkStart w:id="40" w:name="__RefHeading___Toc2878_1002645125"/>
-      <w:bookmarkEnd w:id="40"/>
+      <w:bookmarkStart w:id="41" w:name="__RefHeading___Toc6355_4212114258"/>
+      <w:bookmarkEnd w:id="41"/>
       <w:r>
         <w:rPr/>
         <w:t>review_by_frame</w:t>
@@ -26808,7 +29594,7 @@
           <w:iCs/>
           <w:color w:val="444444"/>
         </w:rPr>
-        <w:t>Primary key: partition (project_id, sequence_id, scene_id, shot_id, frame_number), clustering (review_id).</w:t>
+        <w:t>Primary key: partition (project_id, episode_id, sequence_id, scene_id, shot_id, frame_number), clustering (review_id).</w:t>
       </w:r>
     </w:p>
     <w:tbl>
@@ -27096,6 +29882,122 @@
                 <w:sz w:val="18"/>
                 <w:szCs w:val="18"/>
               </w:rPr>
+              <w:t>episode_id</w:t>
+            </w:r>
+          </w:p>
+        </w:tc>
+        <w:tc>
+          <w:tcPr>
+            <w:tcW w:w="1249" w:type="dxa"/>
+            <w:tcBorders>
+              <w:top w:val="single" w:sz="4" w:space="0" w:color="B7B7B7"/>
+              <w:left w:val="single" w:sz="4" w:space="0" w:color="B7B7B7"/>
+              <w:bottom w:val="single" w:sz="4" w:space="0" w:color="B7B7B7"/>
+              <w:right w:val="single" w:sz="4" w:space="0" w:color="B7B7B7"/>
+            </w:tcBorders>
+          </w:tcPr>
+          <w:p>
+            <w:pPr>
+              <w:pStyle w:val="Normal"/>
+              <w:keepNext w:val="true"/>
+              <w:rPr/>
+            </w:pPr>
+            <w:r>
+              <w:rPr>
+                <w:rFonts w:eastAsia="Consolas" w:cs="Consolas" w:ascii="Consolas" w:hAnsi="Consolas"/>
+                <w:b w:val="false"/>
+                <w:bCs w:val="false"/>
+                <w:sz w:val="18"/>
+                <w:szCs w:val="18"/>
+              </w:rPr>
+              <w:t>text</w:t>
+            </w:r>
+          </w:p>
+        </w:tc>
+        <w:tc>
+          <w:tcPr>
+            <w:tcW w:w="1251" w:type="dxa"/>
+            <w:tcBorders>
+              <w:top w:val="single" w:sz="4" w:space="0" w:color="B7B7B7"/>
+              <w:left w:val="single" w:sz="4" w:space="0" w:color="B7B7B7"/>
+              <w:bottom w:val="single" w:sz="4" w:space="0" w:color="B7B7B7"/>
+              <w:right w:val="single" w:sz="4" w:space="0" w:color="B7B7B7"/>
+            </w:tcBorders>
+          </w:tcPr>
+          <w:p>
+            <w:pPr>
+              <w:pStyle w:val="Normal"/>
+              <w:keepNext w:val="true"/>
+              <w:rPr/>
+            </w:pPr>
+            <w:r>
+              <w:rPr>
+                <w:b w:val="false"/>
+                <w:bCs w:val="false"/>
+                <w:sz w:val="20"/>
+                <w:szCs w:val="20"/>
+              </w:rPr>
+              <w:t>Partition</w:t>
+            </w:r>
+          </w:p>
+        </w:tc>
+        <w:tc>
+          <w:tcPr>
+            <w:tcW w:w="4959" w:type="dxa"/>
+            <w:tcBorders>
+              <w:top w:val="single" w:sz="4" w:space="0" w:color="B7B7B7"/>
+              <w:left w:val="single" w:sz="4" w:space="0" w:color="B7B7B7"/>
+              <w:bottom w:val="single" w:sz="4" w:space="0" w:color="B7B7B7"/>
+              <w:right w:val="single" w:sz="4" w:space="0" w:color="B7B7B7"/>
+            </w:tcBorders>
+          </w:tcPr>
+          <w:p>
+            <w:pPr>
+              <w:pStyle w:val="Normal"/>
+              <w:keepNext w:val="true"/>
+              <w:rPr/>
+            </w:pPr>
+            <w:r>
+              <w:rPr>
+                <w:b w:val="false"/>
+                <w:bCs w:val="false"/>
+                <w:sz w:val="20"/>
+                <w:szCs w:val="20"/>
+              </w:rPr>
+              <w:t>Identifier of the episode the row belongs to.</w:t>
+            </w:r>
+          </w:p>
+        </w:tc>
+      </w:tr>
+      <w:tr>
+        <w:trPr>
+          <w:cantSplit w:val="true"/>
+        </w:trPr>
+        <w:tc>
+          <w:tcPr>
+            <w:tcW w:w="1900" w:type="dxa"/>
+            <w:tcBorders>
+              <w:top w:val="single" w:sz="4" w:space="0" w:color="B7B7B7"/>
+              <w:left w:val="single" w:sz="4" w:space="0" w:color="B7B7B7"/>
+              <w:bottom w:val="single" w:sz="4" w:space="0" w:color="B7B7B7"/>
+              <w:right w:val="single" w:sz="4" w:space="0" w:color="B7B7B7"/>
+            </w:tcBorders>
+            <w:shd w:color="auto" w:fill="EEF3FA" w:val="clear"/>
+          </w:tcPr>
+          <w:p>
+            <w:pPr>
+              <w:pStyle w:val="Normal"/>
+              <w:keepNext w:val="true"/>
+              <w:rPr/>
+            </w:pPr>
+            <w:r>
+              <w:rPr>
+                <w:rFonts w:eastAsia="Consolas" w:cs="Consolas" w:ascii="Consolas" w:hAnsi="Consolas"/>
+                <w:b w:val="false"/>
+                <w:bCs w:val="false"/>
+                <w:sz w:val="18"/>
+                <w:szCs w:val="18"/>
+              </w:rPr>
               <w:t>sequence_id</w:t>
             </w:r>
           </w:p>
@@ -27881,8 +30783,8 @@
         <w:pStyle w:val="Heading2"/>
         <w:rPr/>
       </w:pPr>
-      <w:bookmarkStart w:id="41" w:name="__RefHeading___Toc2880_1002645125"/>
-      <w:bookmarkEnd w:id="41"/>
+      <w:bookmarkStart w:id="42" w:name="__RefHeading___Toc6357_4212114258"/>
+      <w:bookmarkEnd w:id="42"/>
       <w:r>
         <w:rPr/>
         <w:t>3.6 Version Control</w:t>
@@ -27905,8 +30807,8 @@
         <w:keepNext w:val="true"/>
         <w:rPr/>
       </w:pPr>
-      <w:bookmarkStart w:id="42" w:name="__RefHeading___Toc2882_1002645125"/>
-      <w:bookmarkEnd w:id="42"/>
+      <w:bookmarkStart w:id="43" w:name="__RefHeading___Toc6359_4212114258"/>
+      <w:bookmarkEnd w:id="43"/>
       <w:r>
         <w:rPr/>
         <w:t>version_control</w:t>
@@ -28438,8 +31340,8 @@
         <w:keepNext w:val="true"/>
         <w:rPr/>
       </w:pPr>
-      <w:bookmarkStart w:id="43" w:name="__RefHeading___Toc2884_1002645125"/>
-      <w:bookmarkEnd w:id="43"/>
+      <w:bookmarkStart w:id="44" w:name="__RefHeading___Toc6361_4212114258"/>
+      <w:bookmarkEnd w:id="44"/>
       <w:r>
         <w:rPr/>
         <w:t>revision</w:t>
@@ -29359,7 +32261,7 @@
     </w:r>
     <w:r>
       <w:rPr/>
-      <w:t>25</w:t>
+      <w:t>27</w:t>
     </w:r>
     <w:r>
       <w:rPr/>
@@ -29399,7 +32301,7 @@
     </w:r>
     <w:r>
       <w:rPr/>
-      <w:t>25</w:t>
+      <w:t>27</w:t>
     </w:r>
     <w:r>
       <w:rPr/>

</xml_diff>

<commit_message>
Add login with Keycloak to the app
- The API accepts access tokens from a Keycloak realm (OIDC_ISSUER, checked
  for signature, issuer, expiry, client and optional realm role) next to the
  static API token; GET /api/v1/auth/config tells the web UI how to log in.
- The web UI has a login page (authorization code flow with PKCE), shows the
  signed-in user and signs out of Keycloak too.
- Compose: the mlw realm and mlw-app client are imported when Keycloak starts
  (dev realm with a test user; production realm without users); the app is
  configured for Keycloak in the override and prod files.
- Document the settings in the README, .env.example and the API documents.

Co-Authored-By: Claude Sonnet 5.5 <noreply@anthropic.com>
</commit_message>
<xml_diff>
--- a/doc/MLW_Cassandra_Schema.docx
+++ b/doc/MLW_Cassandra_Schema.docx
@@ -102,7 +102,7 @@
             </w:rPr>
             <w:fldChar w:fldCharType="separate"/>
           </w:r>
-          <w:hyperlink w:anchor="__RefHeading___Toc6273_4212114258">
+          <w:hyperlink w:anchor="__RefHeading___Toc3092_3557748789">
             <w:r>
               <w:rPr>
                 <w:rStyle w:val="IndexLink"/>
@@ -122,7 +122,7 @@
             </w:tabs>
             <w:rPr/>
           </w:pPr>
-          <w:hyperlink w:anchor="__RefHeading___Toc6275_4212114258">
+          <w:hyperlink w:anchor="__RefHeading___Toc3094_3557748789">
             <w:r>
               <w:rPr>
                 <w:rStyle w:val="IndexLink"/>
@@ -142,7 +142,7 @@
             </w:tabs>
             <w:rPr/>
           </w:pPr>
-          <w:hyperlink w:anchor="__RefHeading___Toc6277_4212114258">
+          <w:hyperlink w:anchor="__RefHeading___Toc3096_3557748789">
             <w:r>
               <w:rPr>
                 <w:rStyle w:val="IndexLink"/>
@@ -162,7 +162,7 @@
             </w:tabs>
             <w:rPr/>
           </w:pPr>
-          <w:hyperlink w:anchor="__RefHeading___Toc6279_4212114258">
+          <w:hyperlink w:anchor="__RefHeading___Toc3098_3557748789">
             <w:r>
               <w:rPr>
                 <w:rStyle w:val="IndexLink"/>
@@ -182,7 +182,7 @@
             </w:tabs>
             <w:rPr/>
           </w:pPr>
-          <w:hyperlink w:anchor="__RefHeading___Toc6281_4212114258">
+          <w:hyperlink w:anchor="__RefHeading___Toc3100_3557748789">
             <w:r>
               <w:rPr>
                 <w:rStyle w:val="IndexLink"/>
@@ -202,7 +202,7 @@
             </w:tabs>
             <w:rPr/>
           </w:pPr>
-          <w:hyperlink w:anchor="__RefHeading___Toc6283_4212114258">
+          <w:hyperlink w:anchor="__RefHeading___Toc3102_3557748789">
             <w:r>
               <w:rPr>
                 <w:rStyle w:val="IndexLink"/>
@@ -222,7 +222,7 @@
             </w:tabs>
             <w:rPr/>
           </w:pPr>
-          <w:hyperlink w:anchor="__RefHeading___Toc6285_4212114258">
+          <w:hyperlink w:anchor="__RefHeading___Toc3104_3557748789">
             <w:r>
               <w:rPr>
                 <w:rStyle w:val="IndexLink"/>
@@ -242,7 +242,7 @@
             </w:tabs>
             <w:rPr/>
           </w:pPr>
-          <w:hyperlink w:anchor="__RefHeading___Toc6287_4212114258">
+          <w:hyperlink w:anchor="__RefHeading___Toc3106_3557748789">
             <w:r>
               <w:rPr>
                 <w:rStyle w:val="IndexLink"/>
@@ -262,7 +262,7 @@
             </w:tabs>
             <w:rPr/>
           </w:pPr>
-          <w:hyperlink w:anchor="__RefHeading___Toc6289_4212114258">
+          <w:hyperlink w:anchor="__RefHeading___Toc3108_3557748789">
             <w:r>
               <w:rPr>
                 <w:rStyle w:val="IndexLink"/>
@@ -282,7 +282,7 @@
             </w:tabs>
             <w:rPr/>
           </w:pPr>
-          <w:hyperlink w:anchor="__RefHeading___Toc6291_4212114258">
+          <w:hyperlink w:anchor="__RefHeading___Toc3110_3557748789">
             <w:r>
               <w:rPr>
                 <w:rStyle w:val="IndexLink"/>
@@ -302,7 +302,7 @@
             </w:tabs>
             <w:rPr/>
           </w:pPr>
-          <w:hyperlink w:anchor="__RefHeading___Toc6293_4212114258">
+          <w:hyperlink w:anchor="__RefHeading___Toc3112_3557748789">
             <w:r>
               <w:rPr>
                 <w:rStyle w:val="IndexLink"/>
@@ -322,7 +322,7 @@
             </w:tabs>
             <w:rPr/>
           </w:pPr>
-          <w:hyperlink w:anchor="__RefHeading___Toc6295_4212114258">
+          <w:hyperlink w:anchor="__RefHeading___Toc3114_3557748789">
             <w:r>
               <w:rPr>
                 <w:rStyle w:val="IndexLink"/>
@@ -342,7 +342,7 @@
             </w:tabs>
             <w:rPr/>
           </w:pPr>
-          <w:hyperlink w:anchor="__RefHeading___Toc6297_4212114258">
+          <w:hyperlink w:anchor="__RefHeading___Toc3116_3557748789">
             <w:r>
               <w:rPr>
                 <w:rStyle w:val="IndexLink"/>
@@ -362,7 +362,7 @@
             </w:tabs>
             <w:rPr/>
           </w:pPr>
-          <w:hyperlink w:anchor="__RefHeading___Toc6299_4212114258">
+          <w:hyperlink w:anchor="__RefHeading___Toc3118_3557748789">
             <w:r>
               <w:rPr>
                 <w:rStyle w:val="IndexLink"/>
@@ -382,7 +382,7 @@
             </w:tabs>
             <w:rPr/>
           </w:pPr>
-          <w:hyperlink w:anchor="__RefHeading___Toc6301_4212114258">
+          <w:hyperlink w:anchor="__RefHeading___Toc3120_3557748789">
             <w:r>
               <w:rPr>
                 <w:rStyle w:val="IndexLink"/>
@@ -402,7 +402,7 @@
             </w:tabs>
             <w:rPr/>
           </w:pPr>
-          <w:hyperlink w:anchor="__RefHeading___Toc6303_4212114258">
+          <w:hyperlink w:anchor="__RefHeading___Toc3122_3557748789">
             <w:r>
               <w:rPr>
                 <w:rStyle w:val="IndexLink"/>
@@ -422,7 +422,7 @@
             </w:tabs>
             <w:rPr/>
           </w:pPr>
-          <w:hyperlink w:anchor="__RefHeading___Toc6305_4212114258">
+          <w:hyperlink w:anchor="__RefHeading___Toc3124_3557748789">
             <w:r>
               <w:rPr>
                 <w:rStyle w:val="IndexLink"/>
@@ -442,7 +442,7 @@
             </w:tabs>
             <w:rPr/>
           </w:pPr>
-          <w:hyperlink w:anchor="__RefHeading___Toc6307_4212114258">
+          <w:hyperlink w:anchor="__RefHeading___Toc3126_3557748789">
             <w:r>
               <w:rPr>
                 <w:rStyle w:val="IndexLink"/>
@@ -462,7 +462,7 @@
             </w:tabs>
             <w:rPr/>
           </w:pPr>
-          <w:hyperlink w:anchor="__RefHeading___Toc6309_4212114258">
+          <w:hyperlink w:anchor="__RefHeading___Toc3128_3557748789">
             <w:r>
               <w:rPr>
                 <w:rStyle w:val="IndexLink"/>
@@ -482,7 +482,7 @@
             </w:tabs>
             <w:rPr/>
           </w:pPr>
-          <w:hyperlink w:anchor="__RefHeading___Toc6311_4212114258">
+          <w:hyperlink w:anchor="__RefHeading___Toc3130_3557748789">
             <w:r>
               <w:rPr>
                 <w:rStyle w:val="IndexLink"/>
@@ -502,7 +502,7 @@
             </w:tabs>
             <w:rPr/>
           </w:pPr>
-          <w:hyperlink w:anchor="__RefHeading___Toc6313_4212114258">
+          <w:hyperlink w:anchor="__RefHeading___Toc3132_3557748789">
             <w:r>
               <w:rPr>
                 <w:rStyle w:val="IndexLink"/>
@@ -522,7 +522,7 @@
             </w:tabs>
             <w:rPr/>
           </w:pPr>
-          <w:hyperlink w:anchor="__RefHeading___Toc6315_4212114258">
+          <w:hyperlink w:anchor="__RefHeading___Toc3134_3557748789">
             <w:r>
               <w:rPr>
                 <w:rStyle w:val="IndexLink"/>
@@ -542,7 +542,7 @@
             </w:tabs>
             <w:rPr/>
           </w:pPr>
-          <w:hyperlink w:anchor="__RefHeading___Toc6317_4212114258">
+          <w:hyperlink w:anchor="__RefHeading___Toc3136_3557748789">
             <w:r>
               <w:rPr>
                 <w:rStyle w:val="IndexLink"/>
@@ -562,7 +562,7 @@
             </w:tabs>
             <w:rPr/>
           </w:pPr>
-          <w:hyperlink w:anchor="__RefHeading___Toc6319_4212114258">
+          <w:hyperlink w:anchor="__RefHeading___Toc3138_3557748789">
             <w:r>
               <w:rPr>
                 <w:rStyle w:val="IndexLink"/>
@@ -582,7 +582,7 @@
             </w:tabs>
             <w:rPr/>
           </w:pPr>
-          <w:hyperlink w:anchor="__RefHeading___Toc6321_4212114258">
+          <w:hyperlink w:anchor="__RefHeading___Toc3140_3557748789">
             <w:r>
               <w:rPr>
                 <w:rStyle w:val="IndexLink"/>
@@ -602,7 +602,7 @@
             </w:tabs>
             <w:rPr/>
           </w:pPr>
-          <w:hyperlink w:anchor="__RefHeading___Toc6323_4212114258">
+          <w:hyperlink w:anchor="__RefHeading___Toc3142_3557748789">
             <w:r>
               <w:rPr>
                 <w:rStyle w:val="IndexLink"/>
@@ -622,7 +622,7 @@
             </w:tabs>
             <w:rPr/>
           </w:pPr>
-          <w:hyperlink w:anchor="__RefHeading___Toc6325_4212114258">
+          <w:hyperlink w:anchor="__RefHeading___Toc3144_3557748789">
             <w:r>
               <w:rPr>
                 <w:rStyle w:val="IndexLink"/>
@@ -642,7 +642,7 @@
             </w:tabs>
             <w:rPr/>
           </w:pPr>
-          <w:hyperlink w:anchor="__RefHeading___Toc6327_4212114258">
+          <w:hyperlink w:anchor="__RefHeading___Toc3146_3557748789">
             <w:r>
               <w:rPr>
                 <w:rStyle w:val="IndexLink"/>
@@ -662,7 +662,7 @@
             </w:tabs>
             <w:rPr/>
           </w:pPr>
-          <w:hyperlink w:anchor="__RefHeading___Toc6329_4212114258">
+          <w:hyperlink w:anchor="__RefHeading___Toc3148_3557748789">
             <w:r>
               <w:rPr>
                 <w:rStyle w:val="IndexLink"/>
@@ -682,7 +682,7 @@
             </w:tabs>
             <w:rPr/>
           </w:pPr>
-          <w:hyperlink w:anchor="__RefHeading___Toc6331_4212114258">
+          <w:hyperlink w:anchor="__RefHeading___Toc3150_3557748789">
             <w:r>
               <w:rPr>
                 <w:rStyle w:val="IndexLink"/>
@@ -702,7 +702,7 @@
             </w:tabs>
             <w:rPr/>
           </w:pPr>
-          <w:hyperlink w:anchor="__RefHeading___Toc6333_4212114258">
+          <w:hyperlink w:anchor="__RefHeading___Toc3152_3557748789">
             <w:r>
               <w:rPr>
                 <w:rStyle w:val="IndexLink"/>
@@ -722,7 +722,7 @@
             </w:tabs>
             <w:rPr/>
           </w:pPr>
-          <w:hyperlink w:anchor="__RefHeading___Toc6335_4212114258">
+          <w:hyperlink w:anchor="__RefHeading___Toc3154_3557748789">
             <w:r>
               <w:rPr>
                 <w:rStyle w:val="IndexLink"/>
@@ -742,7 +742,7 @@
             </w:tabs>
             <w:rPr/>
           </w:pPr>
-          <w:hyperlink w:anchor="__RefHeading___Toc6337_4212114258">
+          <w:hyperlink w:anchor="__RefHeading___Toc3156_3557748789">
             <w:r>
               <w:rPr>
                 <w:rStyle w:val="IndexLink"/>
@@ -762,7 +762,7 @@
             </w:tabs>
             <w:rPr/>
           </w:pPr>
-          <w:hyperlink w:anchor="__RefHeading___Toc6339_4212114258">
+          <w:hyperlink w:anchor="__RefHeading___Toc3158_3557748789">
             <w:r>
               <w:rPr>
                 <w:rStyle w:val="IndexLink"/>
@@ -782,7 +782,7 @@
             </w:tabs>
             <w:rPr/>
           </w:pPr>
-          <w:hyperlink w:anchor="__RefHeading___Toc6341_4212114258">
+          <w:hyperlink w:anchor="__RefHeading___Toc3160_3557748789">
             <w:r>
               <w:rPr>
                 <w:rStyle w:val="IndexLink"/>
@@ -802,7 +802,7 @@
             </w:tabs>
             <w:rPr/>
           </w:pPr>
-          <w:hyperlink w:anchor="__RefHeading___Toc6343_4212114258">
+          <w:hyperlink w:anchor="__RefHeading___Toc3162_3557748789">
             <w:r>
               <w:rPr>
                 <w:rStyle w:val="IndexLink"/>
@@ -822,7 +822,7 @@
             </w:tabs>
             <w:rPr/>
           </w:pPr>
-          <w:hyperlink w:anchor="__RefHeading___Toc6345_4212114258">
+          <w:hyperlink w:anchor="__RefHeading___Toc3164_3557748789">
             <w:r>
               <w:rPr>
                 <w:rStyle w:val="IndexLink"/>
@@ -842,7 +842,7 @@
             </w:tabs>
             <w:rPr/>
           </w:pPr>
-          <w:hyperlink w:anchor="__RefHeading___Toc6347_4212114258">
+          <w:hyperlink w:anchor="__RefHeading___Toc3166_3557748789">
             <w:r>
               <w:rPr>
                 <w:rStyle w:val="IndexLink"/>
@@ -862,7 +862,7 @@
             </w:tabs>
             <w:rPr/>
           </w:pPr>
-          <w:hyperlink w:anchor="__RefHeading___Toc6349_4212114258">
+          <w:hyperlink w:anchor="__RefHeading___Toc3168_3557748789">
             <w:r>
               <w:rPr>
                 <w:rStyle w:val="IndexLink"/>
@@ -882,7 +882,7 @@
             </w:tabs>
             <w:rPr/>
           </w:pPr>
-          <w:hyperlink w:anchor="__RefHeading___Toc6351_4212114258">
+          <w:hyperlink w:anchor="__RefHeading___Toc3170_3557748789">
             <w:r>
               <w:rPr>
                 <w:rStyle w:val="IndexLink"/>
@@ -902,7 +902,7 @@
             </w:tabs>
             <w:rPr/>
           </w:pPr>
-          <w:hyperlink w:anchor="__RefHeading___Toc6353_4212114258">
+          <w:hyperlink w:anchor="__RefHeading___Toc3172_3557748789">
             <w:r>
               <w:rPr>
                 <w:rStyle w:val="IndexLink"/>
@@ -922,7 +922,7 @@
             </w:tabs>
             <w:rPr/>
           </w:pPr>
-          <w:hyperlink w:anchor="__RefHeading___Toc6355_4212114258">
+          <w:hyperlink w:anchor="__RefHeading___Toc3174_3557748789">
             <w:r>
               <w:rPr>
                 <w:rStyle w:val="IndexLink"/>
@@ -942,7 +942,7 @@
             </w:tabs>
             <w:rPr/>
           </w:pPr>
-          <w:hyperlink w:anchor="__RefHeading___Toc6357_4212114258">
+          <w:hyperlink w:anchor="__RefHeading___Toc3176_3557748789">
             <w:r>
               <w:rPr>
                 <w:rStyle w:val="IndexLink"/>
@@ -962,7 +962,7 @@
             </w:tabs>
             <w:rPr/>
           </w:pPr>
-          <w:hyperlink w:anchor="__RefHeading___Toc6359_4212114258">
+          <w:hyperlink w:anchor="__RefHeading___Toc3178_3557748789">
             <w:r>
               <w:rPr>
                 <w:rStyle w:val="IndexLink"/>
@@ -982,7 +982,7 @@
             </w:tabs>
             <w:rPr/>
           </w:pPr>
-          <w:hyperlink w:anchor="__RefHeading___Toc6361_4212114258">
+          <w:hyperlink w:anchor="__RefHeading___Toc3180_3557748789">
             <w:r>
               <w:rPr>
                 <w:rStyle w:val="IndexLink"/>
@@ -1032,7 +1032,7 @@
         <w:spacing w:before="0" w:after="160"/>
         <w:rPr/>
       </w:pPr>
-      <w:bookmarkStart w:id="0" w:name="__RefHeading___Toc6273_4212114258"/>
+      <w:bookmarkStart w:id="0" w:name="__RefHeading___Toc3092_3557748789"/>
       <w:bookmarkEnd w:id="0"/>
       <w:r>
         <w:rPr/>
@@ -1044,7 +1044,7 @@
         <w:pStyle w:val="Heading2"/>
         <w:rPr/>
       </w:pPr>
-      <w:bookmarkStart w:id="1" w:name="__RefHeading___Toc6275_4212114258"/>
+      <w:bookmarkStart w:id="1" w:name="__RefHeading___Toc3094_3557748789"/>
       <w:bookmarkEnd w:id="1"/>
       <w:r>
         <w:rPr/>
@@ -1254,7 +1254,7 @@
         <w:pStyle w:val="Heading2"/>
         <w:rPr/>
       </w:pPr>
-      <w:bookmarkStart w:id="2" w:name="__RefHeading___Toc6277_4212114258"/>
+      <w:bookmarkStart w:id="2" w:name="__RefHeading___Toc3096_3557748789"/>
       <w:bookmarkEnd w:id="2"/>
       <w:r>
         <w:rPr/>
@@ -3040,7 +3040,7 @@
         <w:spacing w:before="0" w:after="160"/>
         <w:rPr/>
       </w:pPr>
-      <w:bookmarkStart w:id="3" w:name="__RefHeading___Toc6279_4212114258"/>
+      <w:bookmarkStart w:id="3" w:name="__RefHeading___Toc3098_3557748789"/>
       <w:bookmarkEnd w:id="3"/>
       <w:r>
         <w:rPr/>
@@ -3123,7 +3123,7 @@
         <w:pStyle w:val="Heading2"/>
         <w:rPr/>
       </w:pPr>
-      <w:bookmarkStart w:id="4" w:name="__RefHeading___Toc6281_4212114258"/>
+      <w:bookmarkStart w:id="4" w:name="__RefHeading___Toc3100_3557748789"/>
       <w:bookmarkEnd w:id="4"/>
       <w:r>
         <w:rPr/>
@@ -3196,7 +3196,7 @@
         <w:pStyle w:val="Heading2"/>
         <w:rPr/>
       </w:pPr>
-      <w:bookmarkStart w:id="5" w:name="__RefHeading___Toc6283_4212114258"/>
+      <w:bookmarkStart w:id="5" w:name="__RefHeading___Toc3102_3557748789"/>
       <w:bookmarkEnd w:id="5"/>
       <w:r>
         <w:rPr/>
@@ -3269,7 +3269,7 @@
         <w:pStyle w:val="Heading2"/>
         <w:rPr/>
       </w:pPr>
-      <w:bookmarkStart w:id="6" w:name="__RefHeading___Toc6285_4212114258"/>
+      <w:bookmarkStart w:id="6" w:name="__RefHeading___Toc3104_3557748789"/>
       <w:bookmarkEnd w:id="6"/>
       <w:r>
         <w:rPr/>
@@ -3342,7 +3342,7 @@
         <w:pStyle w:val="Heading2"/>
         <w:rPr/>
       </w:pPr>
-      <w:bookmarkStart w:id="7" w:name="__RefHeading___Toc6287_4212114258"/>
+      <w:bookmarkStart w:id="7" w:name="__RefHeading___Toc3106_3557748789"/>
       <w:bookmarkEnd w:id="7"/>
       <w:r>
         <w:rPr/>
@@ -3415,7 +3415,7 @@
         <w:pStyle w:val="Heading2"/>
         <w:rPr/>
       </w:pPr>
-      <w:bookmarkStart w:id="8" w:name="__RefHeading___Toc6289_4212114258"/>
+      <w:bookmarkStart w:id="8" w:name="__RefHeading___Toc3108_3557748789"/>
       <w:bookmarkEnd w:id="8"/>
       <w:r>
         <w:rPr/>
@@ -3488,7 +3488,7 @@
         <w:pStyle w:val="Heading2"/>
         <w:rPr/>
       </w:pPr>
-      <w:bookmarkStart w:id="9" w:name="__RefHeading___Toc6291_4212114258"/>
+      <w:bookmarkStart w:id="9" w:name="__RefHeading___Toc3110_3557748789"/>
       <w:bookmarkEnd w:id="9"/>
       <w:r>
         <w:rPr/>
@@ -3574,7 +3574,7 @@
         <w:spacing w:before="0" w:after="160"/>
         <w:rPr/>
       </w:pPr>
-      <w:bookmarkStart w:id="10" w:name="__RefHeading___Toc6293_4212114258"/>
+      <w:bookmarkStart w:id="10" w:name="__RefHeading___Toc3112_3557748789"/>
       <w:bookmarkEnd w:id="10"/>
       <w:r>
         <w:rPr/>
@@ -3597,7 +3597,7 @@
         <w:pStyle w:val="Heading2"/>
         <w:rPr/>
       </w:pPr>
-      <w:bookmarkStart w:id="11" w:name="__RefHeading___Toc6295_4212114258"/>
+      <w:bookmarkStart w:id="11" w:name="__RefHeading___Toc3114_3557748789"/>
       <w:bookmarkEnd w:id="11"/>
       <w:r>
         <w:rPr/>
@@ -3621,7 +3621,7 @@
         <w:keepNext w:val="true"/>
         <w:rPr/>
       </w:pPr>
-      <w:bookmarkStart w:id="12" w:name="__RefHeading___Toc6297_4212114258"/>
+      <w:bookmarkStart w:id="12" w:name="__RefHeading___Toc3116_3557748789"/>
       <w:bookmarkEnd w:id="12"/>
       <w:r>
         <w:rPr/>
@@ -4263,7 +4263,7 @@
         <w:keepNext w:val="true"/>
         <w:rPr/>
       </w:pPr>
-      <w:bookmarkStart w:id="13" w:name="__RefHeading___Toc6299_4212114258"/>
+      <w:bookmarkStart w:id="13" w:name="__RefHeading___Toc3118_3557748789"/>
       <w:bookmarkEnd w:id="13"/>
       <w:r>
         <w:rPr/>
@@ -5027,7 +5027,7 @@
         <w:keepNext w:val="true"/>
         <w:rPr/>
       </w:pPr>
-      <w:bookmarkStart w:id="14" w:name="__RefHeading___Toc6301_4212114258"/>
+      <w:bookmarkStart w:id="14" w:name="__RefHeading___Toc3120_3557748789"/>
       <w:bookmarkEnd w:id="14"/>
       <w:r>
         <w:rPr/>
@@ -5791,7 +5791,7 @@
         <w:keepNext w:val="true"/>
         <w:rPr/>
       </w:pPr>
-      <w:bookmarkStart w:id="15" w:name="__RefHeading___Toc6303_4212114258"/>
+      <w:bookmarkStart w:id="15" w:name="__RefHeading___Toc3122_3557748789"/>
       <w:bookmarkEnd w:id="15"/>
       <w:r>
         <w:rPr/>
@@ -6787,7 +6787,7 @@
         <w:keepNext w:val="true"/>
         <w:rPr/>
       </w:pPr>
-      <w:bookmarkStart w:id="16" w:name="__RefHeading___Toc6305_4212114258"/>
+      <w:bookmarkStart w:id="16" w:name="__RefHeading___Toc3124_3557748789"/>
       <w:bookmarkEnd w:id="16"/>
       <w:r>
         <w:rPr/>
@@ -8104,7 +8104,7 @@
         <w:keepNext w:val="true"/>
         <w:rPr/>
       </w:pPr>
-      <w:bookmarkStart w:id="17" w:name="__RefHeading___Toc6307_4212114258"/>
+      <w:bookmarkStart w:id="17" w:name="__RefHeading___Toc3126_3557748789"/>
       <w:bookmarkEnd w:id="17"/>
       <w:r>
         <w:rPr/>
@@ -9653,7 +9653,7 @@
         <w:keepNext w:val="true"/>
         <w:rPr/>
       </w:pPr>
-      <w:bookmarkStart w:id="18" w:name="__RefHeading___Toc6309_4212114258"/>
+      <w:bookmarkStart w:id="18" w:name="__RefHeading___Toc3128_3557748789"/>
       <w:bookmarkEnd w:id="18"/>
       <w:r>
         <w:rPr/>
@@ -11195,7 +11195,7 @@
         <w:keepNext w:val="true"/>
         <w:rPr/>
       </w:pPr>
-      <w:bookmarkStart w:id="19" w:name="__RefHeading___Toc6311_4212114258"/>
+      <w:bookmarkStart w:id="19" w:name="__RefHeading___Toc3130_3557748789"/>
       <w:bookmarkEnd w:id="19"/>
       <w:r>
         <w:rPr/>
@@ -12293,7 +12293,7 @@
         <w:pStyle w:val="Heading2"/>
         <w:rPr/>
       </w:pPr>
-      <w:bookmarkStart w:id="20" w:name="__RefHeading___Toc6313_4212114258"/>
+      <w:bookmarkStart w:id="20" w:name="__RefHeading___Toc3132_3557748789"/>
       <w:bookmarkEnd w:id="20"/>
       <w:r>
         <w:rPr/>
@@ -12317,7 +12317,7 @@
         <w:keepNext w:val="true"/>
         <w:rPr/>
       </w:pPr>
-      <w:bookmarkStart w:id="21" w:name="__RefHeading___Toc6315_4212114258"/>
+      <w:bookmarkStart w:id="21" w:name="__RefHeading___Toc3134_3557748789"/>
       <w:bookmarkEnd w:id="21"/>
       <w:r>
         <w:rPr/>
@@ -13170,7 +13170,7 @@
         <w:keepNext w:val="true"/>
         <w:rPr/>
       </w:pPr>
-      <w:bookmarkStart w:id="22" w:name="__RefHeading___Toc6317_4212114258"/>
+      <w:bookmarkStart w:id="22" w:name="__RefHeading___Toc3136_3557748789"/>
       <w:bookmarkEnd w:id="22"/>
       <w:r>
         <w:rPr/>
@@ -14023,7 +14023,7 @@
         <w:keepNext w:val="true"/>
         <w:rPr/>
       </w:pPr>
-      <w:bookmarkStart w:id="23" w:name="__RefHeading___Toc6319_4212114258"/>
+      <w:bookmarkStart w:id="23" w:name="__RefHeading___Toc3138_3557748789"/>
       <w:bookmarkEnd w:id="23"/>
       <w:r>
         <w:rPr/>
@@ -14671,7 +14671,7 @@
         <w:keepNext w:val="true"/>
         <w:rPr/>
       </w:pPr>
-      <w:bookmarkStart w:id="24" w:name="__RefHeading___Toc6321_4212114258"/>
+      <w:bookmarkStart w:id="24" w:name="__RefHeading___Toc3140_3557748789"/>
       <w:bookmarkEnd w:id="24"/>
       <w:r>
         <w:rPr/>
@@ -15995,7 +15995,7 @@
         <w:keepNext w:val="true"/>
         <w:rPr/>
       </w:pPr>
-      <w:bookmarkStart w:id="25" w:name="__RefHeading___Toc6323_4212114258"/>
+      <w:bookmarkStart w:id="25" w:name="__RefHeading___Toc3142_3557748789"/>
       <w:bookmarkEnd w:id="25"/>
       <w:r>
         <w:rPr/>
@@ -17101,7 +17101,7 @@
         <w:keepNext w:val="true"/>
         <w:rPr/>
       </w:pPr>
-      <w:bookmarkStart w:id="26" w:name="__RefHeading___Toc6325_4212114258"/>
+      <w:bookmarkStart w:id="26" w:name="__RefHeading___Toc3144_3557748789"/>
       <w:bookmarkEnd w:id="26"/>
       <w:r>
         <w:rPr/>
@@ -18097,7 +18097,7 @@
         <w:pStyle w:val="Heading2"/>
         <w:rPr/>
       </w:pPr>
-      <w:bookmarkStart w:id="27" w:name="__RefHeading___Toc6327_4212114258"/>
+      <w:bookmarkStart w:id="27" w:name="__RefHeading___Toc3146_3557748789"/>
       <w:bookmarkEnd w:id="27"/>
       <w:r>
         <w:rPr/>
@@ -18121,7 +18121,7 @@
         <w:keepNext w:val="true"/>
         <w:rPr/>
       </w:pPr>
-      <w:bookmarkStart w:id="28" w:name="__RefHeading___Toc6329_4212114258"/>
+      <w:bookmarkStart w:id="28" w:name="__RefHeading___Toc3148_3557748789"/>
       <w:bookmarkEnd w:id="28"/>
       <w:r>
         <w:rPr/>
@@ -19554,7 +19554,7 @@
         <w:keepNext w:val="true"/>
         <w:rPr/>
       </w:pPr>
-      <w:bookmarkStart w:id="29" w:name="__RefHeading___Toc6331_4212114258"/>
+      <w:bookmarkStart w:id="29" w:name="__RefHeading___Toc3150_3557748789"/>
       <w:bookmarkEnd w:id="29"/>
       <w:r>
         <w:rPr/>
@@ -20878,7 +20878,7 @@
         <w:keepNext w:val="true"/>
         <w:rPr/>
       </w:pPr>
-      <w:bookmarkStart w:id="30" w:name="__RefHeading___Toc6333_4212114258"/>
+      <w:bookmarkStart w:id="30" w:name="__RefHeading___Toc3152_3557748789"/>
       <w:bookmarkEnd w:id="30"/>
       <w:r>
         <w:rPr/>
@@ -22747,7 +22747,7 @@
         <w:keepNext w:val="true"/>
         <w:rPr/>
       </w:pPr>
-      <w:bookmarkStart w:id="31" w:name="__RefHeading___Toc6335_4212114258"/>
+      <w:bookmarkStart w:id="31" w:name="__RefHeading___Toc3154_3557748789"/>
       <w:bookmarkEnd w:id="31"/>
       <w:r>
         <w:rPr/>
@@ -24061,7 +24061,7 @@
         <w:pStyle w:val="Heading2"/>
         <w:rPr/>
       </w:pPr>
-      <w:bookmarkStart w:id="32" w:name="__RefHeading___Toc6337_4212114258"/>
+      <w:bookmarkStart w:id="32" w:name="__RefHeading___Toc3156_3557748789"/>
       <w:bookmarkEnd w:id="32"/>
       <w:r>
         <w:rPr/>
@@ -24085,7 +24085,7 @@
         <w:keepNext w:val="true"/>
         <w:rPr/>
       </w:pPr>
-      <w:bookmarkStart w:id="33" w:name="__RefHeading___Toc6339_4212114258"/>
+      <w:bookmarkStart w:id="33" w:name="__RefHeading___Toc3158_3557748789"/>
       <w:bookmarkEnd w:id="33"/>
       <w:r>
         <w:rPr/>
@@ -25047,7 +25047,7 @@
         <w:keepNext w:val="true"/>
         <w:rPr/>
       </w:pPr>
-      <w:bookmarkStart w:id="34" w:name="__RefHeading___Toc6341_4212114258"/>
+      <w:bookmarkStart w:id="34" w:name="__RefHeading___Toc3160_3557748789"/>
       <w:bookmarkEnd w:id="34"/>
       <w:r>
         <w:rPr/>
@@ -25464,7 +25464,7 @@
         <w:keepNext w:val="true"/>
         <w:rPr/>
       </w:pPr>
-      <w:bookmarkStart w:id="35" w:name="__RefHeading___Toc6343_4212114258"/>
+      <w:bookmarkStart w:id="35" w:name="__RefHeading___Toc3162_3557748789"/>
       <w:bookmarkEnd w:id="35"/>
       <w:r>
         <w:rPr/>
@@ -26317,7 +26317,7 @@
         <w:keepNext w:val="true"/>
         <w:rPr/>
       </w:pPr>
-      <w:bookmarkStart w:id="36" w:name="__RefHeading___Toc6345_4212114258"/>
+      <w:bookmarkStart w:id="36" w:name="__RefHeading___Toc3164_3557748789"/>
       <w:bookmarkEnd w:id="36"/>
       <w:r>
         <w:rPr/>
@@ -26959,7 +26959,7 @@
         <w:keepNext w:val="true"/>
         <w:rPr/>
       </w:pPr>
-      <w:bookmarkStart w:id="37" w:name="__RefHeading___Toc6347_4212114258"/>
+      <w:bookmarkStart w:id="37" w:name="__RefHeading___Toc3166_3557748789"/>
       <w:bookmarkEnd w:id="37"/>
       <w:r>
         <w:rPr/>
@@ -27600,7 +27600,7 @@
         <w:pStyle w:val="Heading2"/>
         <w:rPr/>
       </w:pPr>
-      <w:bookmarkStart w:id="38" w:name="__RefHeading___Toc6349_4212114258"/>
+      <w:bookmarkStart w:id="38" w:name="__RefHeading___Toc3168_3557748789"/>
       <w:bookmarkEnd w:id="38"/>
       <w:r>
         <w:rPr/>
@@ -27624,7 +27624,7 @@
         <w:keepNext w:val="true"/>
         <w:rPr/>
       </w:pPr>
-      <w:bookmarkStart w:id="39" w:name="__RefHeading___Toc6351_4212114258"/>
+      <w:bookmarkStart w:id="39" w:name="__RefHeading___Toc3170_3557748789"/>
       <w:bookmarkEnd w:id="39"/>
       <w:r>
         <w:rPr/>
@@ -29029,7 +29029,7 @@
         <w:keepNext w:val="true"/>
         <w:rPr/>
       </w:pPr>
-      <w:bookmarkStart w:id="40" w:name="__RefHeading___Toc6353_4212114258"/>
+      <w:bookmarkStart w:id="40" w:name="__RefHeading___Toc3172_3557748789"/>
       <w:bookmarkEnd w:id="40"/>
       <w:r>
         <w:rPr/>
@@ -29562,7 +29562,7 @@
         <w:keepNext w:val="true"/>
         <w:rPr/>
       </w:pPr>
-      <w:bookmarkStart w:id="41" w:name="__RefHeading___Toc6355_4212114258"/>
+      <w:bookmarkStart w:id="41" w:name="__RefHeading___Toc3174_3557748789"/>
       <w:bookmarkEnd w:id="41"/>
       <w:r>
         <w:rPr/>
@@ -30783,7 +30783,7 @@
         <w:pStyle w:val="Heading2"/>
         <w:rPr/>
       </w:pPr>
-      <w:bookmarkStart w:id="42" w:name="__RefHeading___Toc6357_4212114258"/>
+      <w:bookmarkStart w:id="42" w:name="__RefHeading___Toc3176_3557748789"/>
       <w:bookmarkEnd w:id="42"/>
       <w:r>
         <w:rPr/>
@@ -30807,7 +30807,7 @@
         <w:keepNext w:val="true"/>
         <w:rPr/>
       </w:pPr>
-      <w:bookmarkStart w:id="43" w:name="__RefHeading___Toc6359_4212114258"/>
+      <w:bookmarkStart w:id="43" w:name="__RefHeading___Toc3178_3557748789"/>
       <w:bookmarkEnd w:id="43"/>
       <w:r>
         <w:rPr/>
@@ -31340,7 +31340,7 @@
         <w:keepNext w:val="true"/>
         <w:rPr/>
       </w:pPr>
-      <w:bookmarkStart w:id="44" w:name="__RefHeading___Toc6361_4212114258"/>
+      <w:bookmarkStart w:id="44" w:name="__RefHeading___Toc3180_3557748789"/>
       <w:bookmarkEnd w:id="44"/>
       <w:r>
         <w:rPr/>

</xml_diff>